<commit_message>
Improved layout of manual
</commit_message>
<xml_diff>
--- a/docs/manual.docx
+++ b/docs/manual.docx
@@ -113,16 +113,17 @@
         </w:p>
         <w:p>
           <w:pPr>
-            <w:pStyle w:val="TOC2"/>
+            <w:pStyle w:val="TOC1"/>
             <w:rPr>
               <w:rFonts w:asciiTheme="minorHAnsi" w:eastAsiaTheme="minorEastAsia" w:hAnsiTheme="minorHAnsi" w:cstheme="minorBidi"/>
+              <w:b w:val="0"/>
               <w:noProof/>
               <w:kern w:val="2"/>
-              <w:lang w:val="de-CH" w:eastAsia="de-DE" w:bidi="ar-SA"/>
+              <w:lang w:eastAsia="en-US" w:bidi="ar-SA"/>
               <w14:ligatures w14:val="standardContextual"/>
             </w:rPr>
           </w:pPr>
-          <w:hyperlink w:anchor="_Toc226815587" w:history="1">
+          <w:hyperlink w:anchor="_Toc227814923" w:history="1">
             <w:r>
               <w:rPr>
                 <w:rStyle w:val="Hyperlink"/>
@@ -146,7 +147,7 @@
               <w:rPr>
                 <w:noProof/>
               </w:rPr>
-              <w:instrText xml:space="preserve"> PAGEREF _Toc226815587 \h </w:instrText>
+              <w:instrText xml:space="preserve"> PAGEREF _Toc227814923 \h </w:instrText>
             </w:r>
             <w:r>
               <w:rPr>
@@ -163,7 +164,7 @@
               <w:rPr>
                 <w:noProof/>
               </w:rPr>
-              <w:t>1</w:t>
+              <w:t>2</w:t>
             </w:r>
             <w:r>
               <w:rPr>
@@ -181,11 +182,11 @@
               <w:b w:val="0"/>
               <w:noProof/>
               <w:kern w:val="2"/>
-              <w:lang w:val="de-CH" w:eastAsia="de-DE" w:bidi="ar-SA"/>
+              <w:lang w:eastAsia="en-US" w:bidi="ar-SA"/>
               <w14:ligatures w14:val="standardContextual"/>
             </w:rPr>
           </w:pPr>
-          <w:hyperlink w:anchor="_Toc226815588" w:history="1">
+          <w:hyperlink w:anchor="_Toc227814924" w:history="1">
             <w:r>
               <w:rPr>
                 <w:rStyle w:val="Hyperlink"/>
@@ -209,7 +210,7 @@
               <w:rPr>
                 <w:noProof/>
               </w:rPr>
-              <w:instrText xml:space="preserve"> PAGEREF _Toc226815588 \h </w:instrText>
+              <w:instrText xml:space="preserve"> PAGEREF _Toc227814924 \h </w:instrText>
             </w:r>
             <w:r>
               <w:rPr>
@@ -226,7 +227,7 @@
               <w:rPr>
                 <w:noProof/>
               </w:rPr>
-              <w:t>3</w:t>
+              <w:t>4</w:t>
             </w:r>
             <w:r>
               <w:rPr>
@@ -243,16 +244,78 @@
               <w:rFonts w:asciiTheme="minorHAnsi" w:eastAsiaTheme="minorEastAsia" w:hAnsiTheme="minorHAnsi" w:cstheme="minorBidi"/>
               <w:noProof/>
               <w:kern w:val="2"/>
-              <w:lang w:val="de-CH" w:eastAsia="de-DE" w:bidi="ar-SA"/>
+              <w:lang w:eastAsia="en-US" w:bidi="ar-SA"/>
               <w14:ligatures w14:val="standardContextual"/>
             </w:rPr>
           </w:pPr>
-          <w:hyperlink w:anchor="_Toc226815589" w:history="1">
+          <w:hyperlink w:anchor="_Toc227814925" w:history="1">
             <w:r>
               <w:rPr>
                 <w:rStyle w:val="Hyperlink"/>
                 <w:noProof/>
               </w:rPr>
+              <w:t>Important features of tek4010</w:t>
+            </w:r>
+            <w:r>
+              <w:rPr>
+                <w:noProof/>
+              </w:rPr>
+              <w:tab/>
+            </w:r>
+            <w:r>
+              <w:rPr>
+                <w:noProof/>
+              </w:rPr>
+              <w:fldChar w:fldCharType="begin"/>
+            </w:r>
+            <w:r>
+              <w:rPr>
+                <w:noProof/>
+              </w:rPr>
+              <w:instrText xml:space="preserve"> PAGEREF _Toc227814925 \h </w:instrText>
+            </w:r>
+            <w:r>
+              <w:rPr>
+                <w:noProof/>
+              </w:rPr>
+            </w:r>
+            <w:r>
+              <w:rPr>
+                <w:noProof/>
+              </w:rPr>
+              <w:fldChar w:fldCharType="separate"/>
+            </w:r>
+            <w:r>
+              <w:rPr>
+                <w:noProof/>
+              </w:rPr>
+              <w:t>4</w:t>
+            </w:r>
+            <w:r>
+              <w:rPr>
+                <w:noProof/>
+              </w:rPr>
+              <w:fldChar w:fldCharType="end"/>
+            </w:r>
+          </w:hyperlink>
+        </w:p>
+        <w:p>
+          <w:pPr>
+            <w:pStyle w:val="TOC2"/>
+            <w:rPr>
+              <w:rFonts w:asciiTheme="minorHAnsi" w:eastAsiaTheme="minorEastAsia" w:hAnsiTheme="minorHAnsi" w:cstheme="minorBidi"/>
+              <w:noProof/>
+              <w:kern w:val="2"/>
+              <w:lang w:eastAsia="en-US" w:bidi="ar-SA"/>
+              <w14:ligatures w14:val="standardContextual"/>
+            </w:rPr>
+          </w:pPr>
+          <w:hyperlink w:anchor="_Toc227814926" w:history="1">
+            <w:r>
+              <w:rPr>
+                <w:rStyle w:val="Hyperlink"/>
+                <w:noProof/>
+              </w:rPr>
               <w:t>Installation and first tests</w:t>
             </w:r>
             <w:r>
@@ -271,7 +334,7 @@
               <w:rPr>
                 <w:noProof/>
               </w:rPr>
-              <w:instrText xml:space="preserve"> PAGEREF _Toc226815589 \h </w:instrText>
+              <w:instrText xml:space="preserve"> PAGEREF _Toc227814926 \h </w:instrText>
             </w:r>
             <w:r>
               <w:rPr>
@@ -306,11 +369,11 @@
               <w:b w:val="0"/>
               <w:noProof/>
               <w:kern w:val="2"/>
-              <w:lang w:val="de-CH" w:eastAsia="de-DE" w:bidi="ar-SA"/>
+              <w:lang w:eastAsia="en-US" w:bidi="ar-SA"/>
               <w14:ligatures w14:val="standardContextual"/>
             </w:rPr>
           </w:pPr>
-          <w:hyperlink w:anchor="_Toc226815590" w:history="1">
+          <w:hyperlink w:anchor="_Toc227814927" w:history="1">
             <w:r>
               <w:rPr>
                 <w:rStyle w:val="Hyperlink"/>
@@ -334,7 +397,7 @@
               <w:rPr>
                 <w:noProof/>
               </w:rPr>
-              <w:instrText xml:space="preserve"> PAGEREF _Toc226815590 \h </w:instrText>
+              <w:instrText xml:space="preserve"> PAGEREF _Toc227814927 \h </w:instrText>
             </w:r>
             <w:r>
               <w:rPr>
@@ -351,7 +414,7 @@
               <w:rPr>
                 <w:noProof/>
               </w:rPr>
-              <w:t>5</w:t>
+              <w:t>7</w:t>
             </w:r>
             <w:r>
               <w:rPr>
@@ -368,11 +431,11 @@
               <w:rFonts w:asciiTheme="minorHAnsi" w:eastAsiaTheme="minorEastAsia" w:hAnsiTheme="minorHAnsi" w:cstheme="minorBidi"/>
               <w:noProof/>
               <w:kern w:val="2"/>
-              <w:lang w:val="de-CH" w:eastAsia="de-DE" w:bidi="ar-SA"/>
+              <w:lang w:eastAsia="en-US" w:bidi="ar-SA"/>
               <w14:ligatures w14:val="standardContextual"/>
             </w:rPr>
           </w:pPr>
-          <w:hyperlink w:anchor="_Toc226815591" w:history="1">
+          <w:hyperlink w:anchor="_Toc227814928" w:history="1">
             <w:r>
               <w:rPr>
                 <w:rStyle w:val="Hyperlink"/>
@@ -396,7 +459,7 @@
               <w:rPr>
                 <w:noProof/>
               </w:rPr>
-              <w:instrText xml:space="preserve"> PAGEREF _Toc226815591 \h </w:instrText>
+              <w:instrText xml:space="preserve"> PAGEREF _Toc227814928 \h </w:instrText>
             </w:r>
             <w:r>
               <w:rPr>
@@ -413,7 +476,7 @@
               <w:rPr>
                 <w:noProof/>
               </w:rPr>
-              <w:t>5</w:t>
+              <w:t>7</w:t>
             </w:r>
             <w:r>
               <w:rPr>
@@ -430,17 +493,17 @@
               <w:rFonts w:asciiTheme="minorHAnsi" w:eastAsiaTheme="minorEastAsia" w:hAnsiTheme="minorHAnsi" w:cstheme="minorBidi"/>
               <w:noProof/>
               <w:kern w:val="2"/>
-              <w:lang w:val="de-CH" w:eastAsia="de-DE" w:bidi="ar-SA"/>
+              <w:lang w:eastAsia="en-US" w:bidi="ar-SA"/>
               <w14:ligatures w14:val="standardContextual"/>
             </w:rPr>
           </w:pPr>
-          <w:hyperlink w:anchor="_Toc226815592" w:history="1">
+          <w:hyperlink w:anchor="_Toc227814929" w:history="1">
             <w:r>
               <w:rPr>
                 <w:rStyle w:val="Hyperlink"/>
                 <w:noProof/>
               </w:rPr>
-              <w:t>Log into the system running simh (same or different Raspberry Pi)</w:t>
+              <w:t>Log into PiDP-11 running on the same Raspberry Pi, using the console</w:t>
             </w:r>
             <w:r>
               <w:rPr>
@@ -458,145 +521,7 @@
               <w:rPr>
                 <w:noProof/>
               </w:rPr>
-              <w:instrText xml:space="preserve"> PAGEREF _Toc226815592 \h </w:instrText>
-            </w:r>
-            <w:r>
-              <w:rPr>
-                <w:noProof/>
-              </w:rPr>
-            </w:r>
-            <w:r>
-              <w:rPr>
-                <w:noProof/>
-              </w:rPr>
-              <w:fldChar w:fldCharType="separate"/>
-            </w:r>
-            <w:r>
-              <w:rPr>
-                <w:noProof/>
-              </w:rPr>
-              <w:t>6</w:t>
-            </w:r>
-            <w:r>
-              <w:rPr>
-                <w:noProof/>
-              </w:rPr>
-              <w:fldChar w:fldCharType="end"/>
-            </w:r>
-          </w:hyperlink>
-        </w:p>
-        <w:p>
-          <w:pPr>
-            <w:pStyle w:val="TOC2"/>
-            <w:rPr>
-              <w:rFonts w:asciiTheme="minorHAnsi" w:eastAsiaTheme="minorEastAsia" w:hAnsiTheme="minorHAnsi" w:cstheme="minorBidi"/>
-              <w:noProof/>
-              <w:kern w:val="2"/>
-              <w:lang w:val="de-CH" w:eastAsia="de-DE" w:bidi="ar-SA"/>
-              <w14:ligatures w14:val="standardContextual"/>
-            </w:rPr>
-          </w:pPr>
-          <w:hyperlink w:anchor="_Toc226815593" w:history="1">
-            <w:r>
-              <w:rPr>
-                <w:rStyle w:val="Hyperlink"/>
-                <w:noProof/>
-              </w:rPr>
-              <w:t>Log into PiDP-11 running on the same Raspberry Pi, using the console</w:t>
-            </w:r>
-            <w:r>
-              <w:rPr>
-                <w:noProof/>
-              </w:rPr>
-              <w:tab/>
-            </w:r>
-            <w:r>
-              <w:rPr>
-                <w:noProof/>
-              </w:rPr>
-              <w:fldChar w:fldCharType="begin"/>
-            </w:r>
-            <w:r>
-              <w:rPr>
-                <w:noProof/>
-              </w:rPr>
-              <w:instrText xml:space="preserve"> PAGEREF _Toc226815593 \h </w:instrText>
-            </w:r>
-            <w:r>
-              <w:rPr>
-                <w:noProof/>
-              </w:rPr>
-            </w:r>
-            <w:r>
-              <w:rPr>
-                <w:noProof/>
-              </w:rPr>
-              <w:fldChar w:fldCharType="separate"/>
-            </w:r>
-            <w:r>
-              <w:rPr>
-                <w:noProof/>
-              </w:rPr>
-              <w:t>7</w:t>
-            </w:r>
-            <w:r>
-              <w:rPr>
-                <w:noProof/>
-              </w:rPr>
-              <w:fldChar w:fldCharType="end"/>
-            </w:r>
-          </w:hyperlink>
-        </w:p>
-        <w:p>
-          <w:pPr>
-            <w:pStyle w:val="TOC2"/>
-            <w:rPr>
-              <w:rFonts w:asciiTheme="minorHAnsi" w:eastAsiaTheme="minorEastAsia" w:hAnsiTheme="minorHAnsi" w:cstheme="minorBidi"/>
-              <w:noProof/>
-              <w:kern w:val="2"/>
-              <w:lang w:val="de-CH" w:eastAsia="de-DE" w:bidi="ar-SA"/>
-              <w14:ligatures w14:val="standardContextual"/>
-            </w:rPr>
-          </w:pPr>
-          <w:hyperlink w:anchor="_Toc226815594" w:history="1">
-            <w:r>
-              <w:rPr>
-                <w:rStyle w:val="Hyperlink"/>
-                <w:noProof/>
-              </w:rPr>
-              <w:t>Using tek4010 with a s</w:t>
-            </w:r>
-            <w:r>
-              <w:rPr>
-                <w:rStyle w:val="Hyperlink"/>
-                <w:noProof/>
-              </w:rPr>
-              <w:t>e</w:t>
-            </w:r>
-            <w:r>
-              <w:rPr>
-                <w:rStyle w:val="Hyperlink"/>
-                <w:noProof/>
-              </w:rPr>
-              <w:t>rial link</w:t>
-            </w:r>
-            <w:r>
-              <w:rPr>
-                <w:noProof/>
-              </w:rPr>
-              <w:tab/>
-            </w:r>
-            <w:r>
-              <w:rPr>
-                <w:noProof/>
-              </w:rPr>
-              <w:fldChar w:fldCharType="begin"/>
-            </w:r>
-            <w:r>
-              <w:rPr>
-                <w:noProof/>
-              </w:rPr>
-              <w:instrText xml:space="preserve"> PAGEREF _Toc226815594 \h </w:instrText>
+              <w:instrText xml:space="preserve"> PAGEREF _Toc227814929 \h </w:instrText>
             </w:r>
             <w:r>
               <w:rPr>
@@ -631,11 +556,11 @@
               <w:b w:val="0"/>
               <w:noProof/>
               <w:kern w:val="2"/>
-              <w:lang w:val="de-CH" w:eastAsia="de-DE" w:bidi="ar-SA"/>
+              <w:lang w:eastAsia="en-US" w:bidi="ar-SA"/>
               <w14:ligatures w14:val="standardContextual"/>
             </w:rPr>
           </w:pPr>
-          <w:hyperlink w:anchor="_Toc226815595" w:history="1">
+          <w:hyperlink w:anchor="_Toc227814930" w:history="1">
             <w:r>
               <w:rPr>
                 <w:rStyle w:val="Hyperlink"/>
@@ -659,7 +584,7 @@
               <w:rPr>
                 <w:noProof/>
               </w:rPr>
-              <w:instrText xml:space="preserve"> PAGEREF _Toc226815595 \h </w:instrText>
+              <w:instrText xml:space="preserve"> PAGEREF _Toc227814930 \h </w:instrText>
             </w:r>
             <w:r>
               <w:rPr>
@@ -676,7 +601,7 @@
               <w:rPr>
                 <w:noProof/>
               </w:rPr>
-              <w:t>9</w:t>
+              <w:t>10</w:t>
             </w:r>
             <w:r>
               <w:rPr>
@@ -693,17 +618,17 @@
               <w:rFonts w:asciiTheme="minorHAnsi" w:eastAsiaTheme="minorEastAsia" w:hAnsiTheme="minorHAnsi" w:cstheme="minorBidi"/>
               <w:noProof/>
               <w:kern w:val="2"/>
-              <w:lang w:val="de-CH" w:eastAsia="de-DE" w:bidi="ar-SA"/>
+              <w:lang w:eastAsia="en-US" w:bidi="ar-SA"/>
               <w14:ligatures w14:val="standardContextual"/>
             </w:rPr>
           </w:pPr>
-          <w:hyperlink w:anchor="_Toc226815596" w:history="1">
+          <w:hyperlink w:anchor="_Toc227814931" w:history="1">
             <w:r>
               <w:rPr>
                 <w:rStyle w:val="Hyperlink"/>
                 <w:noProof/>
               </w:rPr>
-              <w:t>tek4010 on the PiDP-8</w:t>
+              <w:t>Using tek4010 with a serial link</w:t>
             </w:r>
             <w:r>
               <w:rPr>
@@ -721,7 +646,7 @@
               <w:rPr>
                 <w:noProof/>
               </w:rPr>
-              <w:instrText xml:space="preserve"> PAGEREF _Toc226815596 \h </w:instrText>
+              <w:instrText xml:space="preserve"> PAGEREF _Toc227814931 \h </w:instrText>
             </w:r>
             <w:r>
               <w:rPr>
@@ -738,7 +663,7 @@
               <w:rPr>
                 <w:noProof/>
               </w:rPr>
-              <w:t>9</w:t>
+              <w:t>10</w:t>
             </w:r>
             <w:r>
               <w:rPr>
@@ -755,16 +680,154 @@
               <w:rFonts w:asciiTheme="minorHAnsi" w:eastAsiaTheme="minorEastAsia" w:hAnsiTheme="minorHAnsi" w:cstheme="minorBidi"/>
               <w:noProof/>
               <w:kern w:val="2"/>
-              <w:lang w:val="de-CH" w:eastAsia="de-DE" w:bidi="ar-SA"/>
+              <w:lang w:eastAsia="en-US" w:bidi="ar-SA"/>
               <w14:ligatures w14:val="standardContextual"/>
             </w:rPr>
           </w:pPr>
-          <w:hyperlink w:anchor="_Toc226815597" w:history="1">
+          <w:hyperlink w:anchor="_Toc227814932" w:history="1">
             <w:r>
               <w:rPr>
                 <w:rStyle w:val="Hyperlink"/>
                 <w:noProof/>
               </w:rPr>
+              <w:t>Using Tek4010</w:t>
+            </w:r>
+            <w:r>
+              <w:rPr>
+                <w:rStyle w:val="Hyperlink"/>
+                <w:noProof/>
+              </w:rPr>
+              <w:t xml:space="preserve"> </w:t>
+            </w:r>
+            <w:r>
+              <w:rPr>
+                <w:rStyle w:val="Hyperlink"/>
+                <w:noProof/>
+              </w:rPr>
+              <w:t>as a plotter</w:t>
+            </w:r>
+            <w:r>
+              <w:rPr>
+                <w:noProof/>
+              </w:rPr>
+              <w:tab/>
+            </w:r>
+            <w:r>
+              <w:rPr>
+                <w:noProof/>
+              </w:rPr>
+              <w:fldChar w:fldCharType="begin"/>
+            </w:r>
+            <w:r>
+              <w:rPr>
+                <w:noProof/>
+              </w:rPr>
+              <w:instrText xml:space="preserve"> PAGEREF _Toc227814932 \h </w:instrText>
+            </w:r>
+            <w:r>
+              <w:rPr>
+                <w:noProof/>
+              </w:rPr>
+            </w:r>
+            <w:r>
+              <w:rPr>
+                <w:noProof/>
+              </w:rPr>
+              <w:fldChar w:fldCharType="separate"/>
+            </w:r>
+            <w:r>
+              <w:rPr>
+                <w:noProof/>
+              </w:rPr>
+              <w:t>10</w:t>
+            </w:r>
+            <w:r>
+              <w:rPr>
+                <w:noProof/>
+              </w:rPr>
+              <w:fldChar w:fldCharType="end"/>
+            </w:r>
+          </w:hyperlink>
+        </w:p>
+        <w:p>
+          <w:pPr>
+            <w:pStyle w:val="TOC2"/>
+            <w:rPr>
+              <w:rFonts w:asciiTheme="minorHAnsi" w:eastAsiaTheme="minorEastAsia" w:hAnsiTheme="minorHAnsi" w:cstheme="minorBidi"/>
+              <w:noProof/>
+              <w:kern w:val="2"/>
+              <w:lang w:eastAsia="en-US" w:bidi="ar-SA"/>
+              <w14:ligatures w14:val="standardContextual"/>
+            </w:rPr>
+          </w:pPr>
+          <w:hyperlink w:anchor="_Toc227814933" w:history="1">
+            <w:r>
+              <w:rPr>
+                <w:rStyle w:val="Hyperlink"/>
+                <w:noProof/>
+              </w:rPr>
+              <w:t>tek4010 on the PiDP-8</w:t>
+            </w:r>
+            <w:r>
+              <w:rPr>
+                <w:noProof/>
+              </w:rPr>
+              <w:tab/>
+            </w:r>
+            <w:r>
+              <w:rPr>
+                <w:noProof/>
+              </w:rPr>
+              <w:fldChar w:fldCharType="begin"/>
+            </w:r>
+            <w:r>
+              <w:rPr>
+                <w:noProof/>
+              </w:rPr>
+              <w:instrText xml:space="preserve"> PAGEREF _Toc227814933 \h </w:instrText>
+            </w:r>
+            <w:r>
+              <w:rPr>
+                <w:noProof/>
+              </w:rPr>
+            </w:r>
+            <w:r>
+              <w:rPr>
+                <w:noProof/>
+              </w:rPr>
+              <w:fldChar w:fldCharType="separate"/>
+            </w:r>
+            <w:r>
+              <w:rPr>
+                <w:noProof/>
+              </w:rPr>
+              <w:t>11</w:t>
+            </w:r>
+            <w:r>
+              <w:rPr>
+                <w:noProof/>
+              </w:rPr>
+              <w:fldChar w:fldCharType="end"/>
+            </w:r>
+          </w:hyperlink>
+        </w:p>
+        <w:p>
+          <w:pPr>
+            <w:pStyle w:val="TOC2"/>
+            <w:rPr>
+              <w:rFonts w:asciiTheme="minorHAnsi" w:eastAsiaTheme="minorEastAsia" w:hAnsiTheme="minorHAnsi" w:cstheme="minorBidi"/>
+              <w:noProof/>
+              <w:kern w:val="2"/>
+              <w:lang w:eastAsia="en-US" w:bidi="ar-SA"/>
+              <w14:ligatures w14:val="standardContextual"/>
+            </w:rPr>
+          </w:pPr>
+          <w:hyperlink w:anchor="_Toc227814934" w:history="1">
+            <w:r>
+              <w:rPr>
+                <w:rStyle w:val="Hyperlink"/>
+                <w:noProof/>
+              </w:rPr>
               <w:t>Options of the command tek4010</w:t>
             </w:r>
             <w:r>
@@ -783,7 +846,7 @@
               <w:rPr>
                 <w:noProof/>
               </w:rPr>
-              <w:instrText xml:space="preserve"> PAGEREF _Toc226815597 \h </w:instrText>
+              <w:instrText xml:space="preserve"> PAGEREF _Toc227814934 \h </w:instrText>
             </w:r>
             <w:r>
               <w:rPr>
@@ -800,7 +863,7 @@
               <w:rPr>
                 <w:noProof/>
               </w:rPr>
-              <w:t>9</w:t>
+              <w:t>11</w:t>
             </w:r>
             <w:r>
               <w:rPr>
@@ -818,11 +881,11 @@
               <w:b w:val="0"/>
               <w:noProof/>
               <w:kern w:val="2"/>
-              <w:lang w:val="de-CH" w:eastAsia="de-DE" w:bidi="ar-SA"/>
+              <w:lang w:eastAsia="en-US" w:bidi="ar-SA"/>
               <w14:ligatures w14:val="standardContextual"/>
             </w:rPr>
           </w:pPr>
-          <w:hyperlink w:anchor="_Toc226815598" w:history="1">
+          <w:hyperlink w:anchor="_Toc227814935" w:history="1">
             <w:r>
               <w:rPr>
                 <w:rStyle w:val="Hyperlink"/>
@@ -846,7 +909,7 @@
               <w:rPr>
                 <w:noProof/>
               </w:rPr>
-              <w:instrText xml:space="preserve"> PAGEREF _Toc226815598 \h </w:instrText>
+              <w:instrText xml:space="preserve"> PAGEREF _Toc227814935 \h </w:instrText>
             </w:r>
             <w:r>
               <w:rPr>
@@ -863,7 +926,7 @@
               <w:rPr>
                 <w:noProof/>
               </w:rPr>
-              <w:t>10</w:t>
+              <w:t>13</w:t>
             </w:r>
             <w:r>
               <w:rPr>
@@ -880,11 +943,11 @@
               <w:rFonts w:asciiTheme="minorHAnsi" w:eastAsiaTheme="minorEastAsia" w:hAnsiTheme="minorHAnsi" w:cstheme="minorBidi"/>
               <w:noProof/>
               <w:kern w:val="2"/>
-              <w:lang w:val="de-CH" w:eastAsia="de-DE" w:bidi="ar-SA"/>
+              <w:lang w:eastAsia="en-US" w:bidi="ar-SA"/>
               <w14:ligatures w14:val="standardContextual"/>
             </w:rPr>
           </w:pPr>
-          <w:hyperlink w:anchor="_Toc226815599" w:history="1">
+          <w:hyperlink w:anchor="_Toc227814936" w:history="1">
             <w:r>
               <w:rPr>
                 <w:rStyle w:val="Hyperlink"/>
@@ -908,7 +971,7 @@
               <w:rPr>
                 <w:noProof/>
               </w:rPr>
-              <w:instrText xml:space="preserve"> PAGEREF _Toc226815599 \h </w:instrText>
+              <w:instrText xml:space="preserve"> PAGEREF _Toc227814936 \h </w:instrText>
             </w:r>
             <w:r>
               <w:rPr>
@@ -925,7 +988,7 @@
               <w:rPr>
                 <w:noProof/>
               </w:rPr>
-              <w:t>10</w:t>
+              <w:t>13</w:t>
             </w:r>
             <w:r>
               <w:rPr>
@@ -942,11 +1005,11 @@
               <w:rFonts w:asciiTheme="minorHAnsi" w:eastAsiaTheme="minorEastAsia" w:hAnsiTheme="minorHAnsi" w:cstheme="minorBidi"/>
               <w:noProof/>
               <w:kern w:val="2"/>
-              <w:lang w:val="de-CH" w:eastAsia="de-DE" w:bidi="ar-SA"/>
+              <w:lang w:eastAsia="en-US" w:bidi="ar-SA"/>
               <w14:ligatures w14:val="standardContextual"/>
             </w:rPr>
           </w:pPr>
-          <w:hyperlink w:anchor="_Toc226815600" w:history="1">
+          <w:hyperlink w:anchor="_Toc227814937" w:history="1">
             <w:r>
               <w:rPr>
                 <w:rStyle w:val="Hyperlink"/>
@@ -970,7 +1033,7 @@
               <w:rPr>
                 <w:noProof/>
               </w:rPr>
-              <w:instrText xml:space="preserve"> PAGEREF _Toc226815600 \h </w:instrText>
+              <w:instrText xml:space="preserve"> PAGEREF _Toc227814937 \h </w:instrText>
             </w:r>
             <w:r>
               <w:rPr>
@@ -987,7 +1050,7 @@
               <w:rPr>
                 <w:noProof/>
               </w:rPr>
-              <w:t>10</w:t>
+              <w:t>14</w:t>
             </w:r>
             <w:r>
               <w:rPr>
@@ -1005,11 +1068,11 @@
               <w:b w:val="0"/>
               <w:noProof/>
               <w:kern w:val="2"/>
-              <w:lang w:val="de-CH" w:eastAsia="de-DE" w:bidi="ar-SA"/>
+              <w:lang w:eastAsia="en-US" w:bidi="ar-SA"/>
               <w14:ligatures w14:val="standardContextual"/>
             </w:rPr>
           </w:pPr>
-          <w:hyperlink w:anchor="_Toc226815601" w:history="1">
+          <w:hyperlink w:anchor="_Toc227814938" w:history="1">
             <w:r>
               <w:rPr>
                 <w:rStyle w:val="Hyperlink"/>
@@ -1033,7 +1096,7 @@
               <w:rPr>
                 <w:noProof/>
               </w:rPr>
-              <w:instrText xml:space="preserve"> PAGEREF _Toc226815601 \h </w:instrText>
+              <w:instrText xml:space="preserve"> PAGEREF _Toc227814938 \h </w:instrText>
             </w:r>
             <w:r>
               <w:rPr>
@@ -1050,7 +1113,7 @@
               <w:rPr>
                 <w:noProof/>
               </w:rPr>
-              <w:t>12</w:t>
+              <w:t>15</w:t>
             </w:r>
             <w:r>
               <w:rPr>
@@ -1067,11 +1130,11 @@
               <w:rFonts w:asciiTheme="minorHAnsi" w:eastAsiaTheme="minorEastAsia" w:hAnsiTheme="minorHAnsi" w:cstheme="minorBidi"/>
               <w:noProof/>
               <w:kern w:val="2"/>
-              <w:lang w:val="de-CH" w:eastAsia="de-DE" w:bidi="ar-SA"/>
+              <w:lang w:eastAsia="en-US" w:bidi="ar-SA"/>
               <w14:ligatures w14:val="standardContextual"/>
             </w:rPr>
           </w:pPr>
-          <w:hyperlink w:anchor="_Toc226815602" w:history="1">
+          <w:hyperlink w:anchor="_Toc227814939" w:history="1">
             <w:r>
               <w:rPr>
                 <w:rStyle w:val="Hyperlink"/>
@@ -1095,7 +1158,7 @@
               <w:rPr>
                 <w:noProof/>
               </w:rPr>
-              <w:instrText xml:space="preserve"> PAGEREF _Toc226815602 \h </w:instrText>
+              <w:instrText xml:space="preserve"> PAGEREF _Toc227814939 \h </w:instrText>
             </w:r>
             <w:r>
               <w:rPr>
@@ -1112,7 +1175,7 @@
               <w:rPr>
                 <w:noProof/>
               </w:rPr>
-              <w:t>12</w:t>
+              <w:t>15</w:t>
             </w:r>
             <w:r>
               <w:rPr>
@@ -1129,11 +1192,11 @@
               <w:rFonts w:asciiTheme="minorHAnsi" w:eastAsiaTheme="minorEastAsia" w:hAnsiTheme="minorHAnsi" w:cstheme="minorBidi"/>
               <w:noProof/>
               <w:kern w:val="2"/>
-              <w:lang w:val="de-CH" w:eastAsia="de-DE" w:bidi="ar-SA"/>
+              <w:lang w:eastAsia="en-US" w:bidi="ar-SA"/>
               <w14:ligatures w14:val="standardContextual"/>
             </w:rPr>
           </w:pPr>
-          <w:hyperlink w:anchor="_Toc226815603" w:history="1">
+          <w:hyperlink w:anchor="_Toc227814940" w:history="1">
             <w:r>
               <w:rPr>
                 <w:rStyle w:val="Hyperlink"/>
@@ -1157,7 +1220,7 @@
               <w:rPr>
                 <w:noProof/>
               </w:rPr>
-              <w:instrText xml:space="preserve"> PAGEREF _Toc226815603 \h </w:instrText>
+              <w:instrText xml:space="preserve"> PAGEREF _Toc227814940 \h </w:instrText>
             </w:r>
             <w:r>
               <w:rPr>
@@ -1174,7 +1237,7 @@
               <w:rPr>
                 <w:noProof/>
               </w:rPr>
-              <w:t>12</w:t>
+              <w:t>15</w:t>
             </w:r>
             <w:r>
               <w:rPr>
@@ -1191,11 +1254,11 @@
               <w:rFonts w:asciiTheme="minorHAnsi" w:eastAsiaTheme="minorEastAsia" w:hAnsiTheme="minorHAnsi" w:cstheme="minorBidi"/>
               <w:noProof/>
               <w:kern w:val="2"/>
-              <w:lang w:val="de-CH" w:eastAsia="de-DE" w:bidi="ar-SA"/>
+              <w:lang w:eastAsia="en-US" w:bidi="ar-SA"/>
               <w14:ligatures w14:val="standardContextual"/>
             </w:rPr>
           </w:pPr>
-          <w:hyperlink w:anchor="_Toc226815604" w:history="1">
+          <w:hyperlink w:anchor="_Toc227814941" w:history="1">
             <w:r>
               <w:rPr>
                 <w:rStyle w:val="Hyperlink"/>
@@ -1219,7 +1282,7 @@
               <w:rPr>
                 <w:noProof/>
               </w:rPr>
-              <w:instrText xml:space="preserve"> PAGEREF _Toc226815604 \h </w:instrText>
+              <w:instrText xml:space="preserve"> PAGEREF _Toc227814941 \h </w:instrText>
             </w:r>
             <w:r>
               <w:rPr>
@@ -1236,7 +1299,7 @@
               <w:rPr>
                 <w:noProof/>
               </w:rPr>
-              <w:t>12</w:t>
+              <w:t>15</w:t>
             </w:r>
             <w:r>
               <w:rPr>
@@ -1253,11 +1316,11 @@
               <w:rFonts w:asciiTheme="minorHAnsi" w:eastAsiaTheme="minorEastAsia" w:hAnsiTheme="minorHAnsi" w:cstheme="minorBidi"/>
               <w:noProof/>
               <w:kern w:val="2"/>
-              <w:lang w:val="de-CH" w:eastAsia="de-DE" w:bidi="ar-SA"/>
+              <w:lang w:eastAsia="en-US" w:bidi="ar-SA"/>
               <w14:ligatures w14:val="standardContextual"/>
             </w:rPr>
           </w:pPr>
-          <w:hyperlink w:anchor="_Toc226815605" w:history="1">
+          <w:hyperlink w:anchor="_Toc227814942" w:history="1">
             <w:r>
               <w:rPr>
                 <w:rStyle w:val="Hyperlink"/>
@@ -1281,7 +1344,7 @@
               <w:rPr>
                 <w:noProof/>
               </w:rPr>
-              <w:instrText xml:space="preserve"> PAGEREF _Toc226815605 \h </w:instrText>
+              <w:instrText xml:space="preserve"> PAGEREF _Toc227814942 \h </w:instrText>
             </w:r>
             <w:r>
               <w:rPr>
@@ -1298,7 +1361,7 @@
               <w:rPr>
                 <w:noProof/>
               </w:rPr>
-              <w:t>12</w:t>
+              <w:t>15</w:t>
             </w:r>
             <w:r>
               <w:rPr>
@@ -1315,11 +1378,11 @@
               <w:rFonts w:asciiTheme="minorHAnsi" w:eastAsiaTheme="minorEastAsia" w:hAnsiTheme="minorHAnsi" w:cstheme="minorBidi"/>
               <w:noProof/>
               <w:kern w:val="2"/>
-              <w:lang w:val="de-CH" w:eastAsia="de-DE" w:bidi="ar-SA"/>
+              <w:lang w:eastAsia="en-US" w:bidi="ar-SA"/>
               <w14:ligatures w14:val="standardContextual"/>
             </w:rPr>
           </w:pPr>
-          <w:hyperlink w:anchor="_Toc226815606" w:history="1">
+          <w:hyperlink w:anchor="_Toc227814943" w:history="1">
             <w:r>
               <w:rPr>
                 <w:rStyle w:val="Hyperlink"/>
@@ -1343,7 +1406,7 @@
               <w:rPr>
                 <w:noProof/>
               </w:rPr>
-              <w:instrText xml:space="preserve"> PAGEREF _Toc226815606 \h </w:instrText>
+              <w:instrText xml:space="preserve"> PAGEREF _Toc227814943 \h </w:instrText>
             </w:r>
             <w:r>
               <w:rPr>
@@ -1360,7 +1423,7 @@
               <w:rPr>
                 <w:noProof/>
               </w:rPr>
-              <w:t>13</w:t>
+              <w:t>16</w:t>
             </w:r>
             <w:r>
               <w:rPr>
@@ -1378,11 +1441,11 @@
               <w:b w:val="0"/>
               <w:noProof/>
               <w:kern w:val="2"/>
-              <w:lang w:val="de-CH" w:eastAsia="de-DE" w:bidi="ar-SA"/>
+              <w:lang w:eastAsia="en-US" w:bidi="ar-SA"/>
               <w14:ligatures w14:val="standardContextual"/>
             </w:rPr>
           </w:pPr>
-          <w:hyperlink w:anchor="_Toc226815607" w:history="1">
+          <w:hyperlink w:anchor="_Toc227814944" w:history="1">
             <w:r>
               <w:rPr>
                 <w:rStyle w:val="Hyperlink"/>
@@ -1406,7 +1469,7 @@
               <w:rPr>
                 <w:noProof/>
               </w:rPr>
-              <w:instrText xml:space="preserve"> PAGEREF _Toc226815607 \h </w:instrText>
+              <w:instrText xml:space="preserve"> PAGEREF _Toc227814944 \h </w:instrText>
             </w:r>
             <w:r>
               <w:rPr>
@@ -1423,7 +1486,7 @@
               <w:rPr>
                 <w:noProof/>
               </w:rPr>
-              <w:t>13</w:t>
+              <w:t>17</w:t>
             </w:r>
             <w:r>
               <w:rPr>
@@ -1440,11 +1503,11 @@
               <w:rFonts w:asciiTheme="minorHAnsi" w:eastAsiaTheme="minorEastAsia" w:hAnsiTheme="minorHAnsi" w:cstheme="minorBidi"/>
               <w:noProof/>
               <w:kern w:val="2"/>
-              <w:lang w:val="de-CH" w:eastAsia="de-DE" w:bidi="ar-SA"/>
+              <w:lang w:eastAsia="en-US" w:bidi="ar-SA"/>
               <w14:ligatures w14:val="standardContextual"/>
             </w:rPr>
           </w:pPr>
-          <w:hyperlink w:anchor="_Toc226815608" w:history="1">
+          <w:hyperlink w:anchor="_Toc227814945" w:history="1">
             <w:r>
               <w:rPr>
                 <w:rStyle w:val="Hyperlink"/>
@@ -1468,7 +1531,7 @@
               <w:rPr>
                 <w:noProof/>
               </w:rPr>
-              <w:instrText xml:space="preserve"> PAGEREF _Toc226815608 \h </w:instrText>
+              <w:instrText xml:space="preserve"> PAGEREF _Toc227814945 \h </w:instrText>
             </w:r>
             <w:r>
               <w:rPr>
@@ -1485,7 +1548,7 @@
               <w:rPr>
                 <w:noProof/>
               </w:rPr>
-              <w:t>13</w:t>
+              <w:t>17</w:t>
             </w:r>
             <w:r>
               <w:rPr>
@@ -1502,11 +1565,11 @@
               <w:rFonts w:asciiTheme="minorHAnsi" w:eastAsiaTheme="minorEastAsia" w:hAnsiTheme="minorHAnsi" w:cstheme="minorBidi"/>
               <w:noProof/>
               <w:kern w:val="2"/>
-              <w:lang w:val="de-CH" w:eastAsia="de-DE" w:bidi="ar-SA"/>
+              <w:lang w:eastAsia="en-US" w:bidi="ar-SA"/>
               <w14:ligatures w14:val="standardContextual"/>
             </w:rPr>
           </w:pPr>
-          <w:hyperlink w:anchor="_Toc226815609" w:history="1">
+          <w:hyperlink w:anchor="_Toc227814946" w:history="1">
             <w:r>
               <w:rPr>
                 <w:rStyle w:val="Hyperlink"/>
@@ -1530,7 +1593,7 @@
               <w:rPr>
                 <w:noProof/>
               </w:rPr>
-              <w:instrText xml:space="preserve"> PAGEREF _Toc226815609 \h </w:instrText>
+              <w:instrText xml:space="preserve"> PAGEREF _Toc227814946 \h </w:instrText>
             </w:r>
             <w:r>
               <w:rPr>
@@ -1547,7 +1610,7 @@
               <w:rPr>
                 <w:noProof/>
               </w:rPr>
-              <w:t>14</w:t>
+              <w:t>17</w:t>
             </w:r>
             <w:r>
               <w:rPr>
@@ -1574,10 +1637,11 @@
     </w:sdt>
     <w:p>
       <w:pPr>
-        <w:pStyle w:val="Heading2"/>
-      </w:pPr>
-      <w:bookmarkStart w:id="0" w:name="_Toc226815587"/>
-      <w:r>
+        <w:pStyle w:val="Heading1"/>
+      </w:pPr>
+      <w:bookmarkStart w:id="0" w:name="_Toc227814923"/>
+      <w:r>
+        <w:lastRenderedPageBreak/>
         <w:t>Introduction</w:t>
       </w:r>
       <w:bookmarkEnd w:id="0"/>
@@ -1621,7 +1685,6 @@
         <w:rPr>
           <w:noProof/>
         </w:rPr>
-        <w:lastRenderedPageBreak/>
         <w:drawing>
           <wp:inline distT="0" distB="0" distL="0" distR="0" wp14:anchorId="0D8EB100" wp14:editId="5FAE34BD">
             <wp:extent cx="4428490" cy="3350527"/>
@@ -1674,6 +1737,13 @@
         <w:spacing w:after="120" w:line="276" w:lineRule="auto"/>
         <w:ind w:right="569"/>
       </w:pPr>
+    </w:p>
+    <w:p>
+      <w:pPr>
+        <w:pStyle w:val="body"/>
+        <w:spacing w:after="120" w:line="276" w:lineRule="auto"/>
+        <w:ind w:right="569"/>
+      </w:pPr>
       <w:r>
         <w:t>Below is a screen shot of the spacelab from the ICEMDDN CAD package running on a CDC Cyber 175 mainframe emulator:</w:t>
       </w:r>
@@ -1697,7 +1767,7 @@
           <w:noProof/>
         </w:rPr>
         <w:drawing>
-          <wp:inline distT="0" distB="0" distL="0" distR="0" wp14:anchorId="3A05AA49" wp14:editId="5948CD07">
+          <wp:inline distT="0" distB="0" distL="0" distR="0" wp14:anchorId="3A05AA49" wp14:editId="6C644B74">
             <wp:extent cx="5626100" cy="3153914"/>
             <wp:effectExtent l="0" t="0" r="0" b="0"/>
             <wp:docPr id="2" name="Image2"/>
@@ -1744,11 +1814,23 @@
     </w:p>
     <w:p>
       <w:pPr>
+        <w:widowControl/>
+        <w:rPr>
+          <w:rFonts w:ascii="Liberation Sans" w:hAnsi="Liberation Sans"/>
+        </w:rPr>
+      </w:pPr>
+      <w:r>
+        <w:br w:type="page"/>
+      </w:r>
+    </w:p>
+    <w:p>
+      <w:pPr>
         <w:pStyle w:val="body"/>
         <w:spacing w:after="120" w:line="276" w:lineRule="auto"/>
         <w:ind w:right="569"/>
       </w:pPr>
       <w:r>
+        <w:lastRenderedPageBreak/>
         <w:t xml:space="preserve">tek4010 can also display historical data for the </w:t>
       </w:r>
       <w:hyperlink r:id="rId8" w:history="1">
@@ -1774,7 +1856,6 @@
         <w:rPr>
           <w:noProof/>
         </w:rPr>
-        <w:lastRenderedPageBreak/>
         <w:drawing>
           <wp:inline distT="0" distB="0" distL="0" distR="0" wp14:anchorId="049F2588" wp14:editId="33C94024">
             <wp:extent cx="4599305" cy="2551430"/>
@@ -1993,8 +2074,9 @@
       <w:pPr>
         <w:pStyle w:val="Heading1"/>
       </w:pPr>
-      <w:bookmarkStart w:id="1" w:name="_Toc226815588"/>
-      <w:r>
+      <w:bookmarkStart w:id="1" w:name="_Toc227814924"/>
+      <w:r>
+        <w:lastRenderedPageBreak/>
         <w:t>Getting</w:t>
       </w:r>
       <w:r>
@@ -2004,17 +2086,23 @@
     </w:p>
     <w:p>
       <w:pPr>
-        <w:pStyle w:val="TOC2"/>
-        <w:rPr>
-          <w:rStyle w:val="Strong"/>
-        </w:rPr>
-      </w:pPr>
-      <w:r>
-        <w:rPr>
-          <w:rStyle w:val="Strong"/>
+        <w:pStyle w:val="Heading2"/>
+        <w:rPr>
+          <w:rStyle w:val="Strong"/>
+          <w:b/>
+          <w:bCs/>
+        </w:rPr>
+      </w:pPr>
+      <w:bookmarkStart w:id="2" w:name="_Toc227814925"/>
+      <w:r>
+        <w:rPr>
+          <w:rStyle w:val="Strong"/>
+          <w:b/>
+          <w:bCs/>
         </w:rPr>
         <w:t>Important features of tek4010</w:t>
       </w:r>
+      <w:bookmarkEnd w:id="2"/>
     </w:p>
     <w:p>
       <w:pPr>
@@ -2040,7 +2128,6 @@
           <w:b w:val="0"/>
           <w:bCs w:val="0"/>
         </w:rPr>
-        <w:lastRenderedPageBreak/>
         <w:t>Emulation of Tektronix 4010, 4013, 4014, 4015 and ARDS</w:t>
       </w:r>
     </w:p>
@@ -2577,17 +2664,31 @@
     <w:p>
       <w:pPr>
         <w:pStyle w:val="Heading2"/>
-        <w:ind w:right="569"/>
-      </w:pPr>
-      <w:bookmarkStart w:id="2" w:name="_Toc226815589"/>
+      </w:pPr>
+      <w:bookmarkStart w:id="3" w:name="_Toc227814926"/>
       <w:r>
         <w:rPr>
           <w:rStyle w:val="Strong"/>
           <w:b/>
         </w:rPr>
-        <w:t>Installation and first tests</w:t>
-      </w:r>
-      <w:bookmarkEnd w:id="2"/>
+        <w:t xml:space="preserve">Installation and </w:t>
+      </w:r>
+      <w:r>
+        <w:rPr>
+          <w:rStyle w:val="Strong"/>
+          <w:b/>
+          <w:bCs/>
+        </w:rPr>
+        <w:t>first</w:t>
+      </w:r>
+      <w:r>
+        <w:rPr>
+          <w:rStyle w:val="Strong"/>
+          <w:b/>
+        </w:rPr>
+        <w:t xml:space="preserve"> tests</w:t>
+      </w:r>
+      <w:bookmarkEnd w:id="3"/>
     </w:p>
     <w:p>
       <w:pPr>
@@ -2723,9 +2824,21 @@
     </w:p>
     <w:p>
       <w:pPr>
-        <w:pStyle w:val="body"/>
-      </w:pPr>
-      <w:r>
+        <w:widowControl/>
+        <w:rPr>
+          <w:rFonts w:ascii="Liberation Sans" w:hAnsi="Liberation Sans"/>
+        </w:rPr>
+      </w:pPr>
+      <w:r>
+        <w:br w:type="page"/>
+      </w:r>
+    </w:p>
+    <w:p>
+      <w:pPr>
+        <w:pStyle w:val="body"/>
+      </w:pPr>
+      <w:r>
+        <w:lastRenderedPageBreak/>
         <w:t>Compile the program on the target system.:</w:t>
       </w:r>
     </w:p>
@@ -2835,7 +2948,6 @@
         <w:pStyle w:val="Code"/>
       </w:pPr>
       <w:r>
-        <w:lastRenderedPageBreak/>
         <w:t>cd ~/Tek4010</w:t>
       </w:r>
     </w:p>
@@ -3295,6 +3407,17 @@
     </w:p>
     <w:p>
       <w:pPr>
+        <w:widowControl/>
+        <w:rPr>
+          <w:rFonts w:ascii="Liberation Sans" w:hAnsi="Liberation Sans"/>
+        </w:rPr>
+      </w:pPr>
+      <w:r>
+        <w:br w:type="page"/>
+      </w:r>
+    </w:p>
+    <w:p>
+      <w:pPr>
         <w:pStyle w:val="body"/>
       </w:pPr>
     </w:p>
@@ -3398,23 +3521,24 @@
           <w:bCs/>
         </w:rPr>
       </w:pPr>
-      <w:bookmarkStart w:id="3" w:name="_Toc226815590"/>
+      <w:bookmarkStart w:id="4" w:name="_Toc227814927"/>
       <w:r>
         <w:rPr>
           <w:rStyle w:val="Strong"/>
           <w:b/>
           <w:bCs/>
         </w:rPr>
+        <w:lastRenderedPageBreak/>
         <w:t>Connecting to systems</w:t>
       </w:r>
-      <w:bookmarkEnd w:id="3"/>
+      <w:bookmarkEnd w:id="4"/>
     </w:p>
     <w:p>
       <w:pPr>
         <w:pStyle w:val="Heading2"/>
         <w:ind w:right="569"/>
       </w:pPr>
-      <w:bookmarkStart w:id="4" w:name="_Toc226815591"/>
+      <w:bookmarkStart w:id="5" w:name="_Toc227814928"/>
       <w:r>
         <w:rPr>
           <w:rStyle w:val="Strong"/>
@@ -3422,7 +3546,7 @@
         </w:rPr>
         <w:t>Log directly into a remote historical Unix operating system</w:t>
       </w:r>
-      <w:bookmarkEnd w:id="4"/>
+      <w:bookmarkEnd w:id="5"/>
     </w:p>
     <w:p>
       <w:pPr>
@@ -3445,7 +3569,6 @@
         <w:pStyle w:val="body"/>
       </w:pPr>
       <w:r>
-        <w:lastRenderedPageBreak/>
         <w:t>First, you need to test the remote login from your client machine into your historical system, using</w:t>
       </w:r>
     </w:p>
@@ -4045,11 +4168,11 @@
       <w:pPr>
         <w:pStyle w:val="Heading"/>
       </w:pPr>
-      <w:bookmarkStart w:id="5" w:name="_Toc226815592"/>
-      <w:r>
-        <w:rPr>
-          <w:rStyle w:val="Strong"/>
-        </w:rPr>
+      <w:r>
+        <w:rPr>
+          <w:rStyle w:val="Strong"/>
+        </w:rPr>
+        <w:lastRenderedPageBreak/>
         <w:t xml:space="preserve">Log into the system running </w:t>
       </w:r>
       <w:proofErr w:type="spellStart"/>
@@ -4066,7 +4189,6 @@
         </w:rPr>
         <w:t xml:space="preserve"> (same or different Raspberry Pi)</w:t>
       </w:r>
-      <w:bookmarkEnd w:id="5"/>
     </w:p>
     <w:p>
       <w:pPr>
@@ -4098,7 +4220,6 @@
         <w:pStyle w:val="body"/>
       </w:pPr>
       <w:r>
-        <w:lastRenderedPageBreak/>
         <w:t xml:space="preserve">This method is useful if a virtual DZ11 has been configured for multiple user logins, providing a </w:t>
       </w:r>
       <w:r>
@@ -4481,7 +4602,7 @@
       <w:pPr>
         <w:pStyle w:val="Heading2"/>
       </w:pPr>
-      <w:bookmarkStart w:id="6" w:name="_Toc226815593"/>
+      <w:bookmarkStart w:id="6" w:name="_Toc227814929"/>
       <w:r>
         <w:rPr>
           <w:rStyle w:val="Strong"/>
@@ -4544,7 +4665,11 @@
       </w:r>
       <w:proofErr w:type="spellEnd"/>
       <w:r>
-        <w:t xml:space="preserve"> and is therefore unsuitable for graphics terminals such as the tek4010 emulator. If you don’t want to change the standard setup, use ctrl-e to stop </w:t>
+        <w:t xml:space="preserve"> and is therefore unsuitable for graphics </w:t>
+      </w:r>
+      <w:r>
+        <w:lastRenderedPageBreak/>
+        <w:t xml:space="preserve">terminals such as the tek4010 emulator. If you don’t want to change the standard setup, use ctrl-e to stop </w:t>
       </w:r>
       <w:proofErr w:type="spellStart"/>
       <w:r>
@@ -4669,7 +4794,6 @@
           <w:rStyle w:val="SourceText"/>
           <w:rFonts w:ascii="Liberation Sans" w:eastAsia="Noto Sans" w:hAnsi="Liberation Sans" w:cs="FreeSans"/>
         </w:rPr>
-        <w:lastRenderedPageBreak/>
         <w:t>sudo</w:t>
       </w:r>
       <w:proofErr w:type="spellEnd"/>
@@ -4914,15 +5038,34 @@
     </w:p>
     <w:p>
       <w:pPr>
-        <w:pStyle w:val="body"/>
-      </w:pPr>
+        <w:pStyle w:val="Heading1"/>
+      </w:pPr>
+      <w:bookmarkStart w:id="7" w:name="_Toc227814930"/>
+      <w:r>
+        <w:rPr>
+          <w:rStyle w:val="Strong"/>
+          <w:b/>
+          <w:bCs/>
+        </w:rPr>
+        <w:lastRenderedPageBreak/>
+        <w:t>Using tek4010</w:t>
+      </w:r>
+      <w:r>
+        <w:rPr>
+          <w:rStyle w:val="Strong"/>
+          <w:b/>
+          <w:bCs/>
+        </w:rPr>
+        <w:t xml:space="preserve"> as a terminal and device</w:t>
+      </w:r>
+      <w:bookmarkEnd w:id="7"/>
     </w:p>
     <w:p>
       <w:pPr>
         <w:pStyle w:val="Heading2"/>
         <w:ind w:right="569"/>
       </w:pPr>
-      <w:bookmarkStart w:id="7" w:name="_Toc226815594"/>
+      <w:bookmarkStart w:id="8" w:name="_Toc227814931"/>
       <w:r>
         <w:rPr>
           <w:rStyle w:val="Strong"/>
@@ -4930,7 +5073,7 @@
         </w:rPr>
         <w:t>Using tek4010 with a serial link</w:t>
       </w:r>
-      <w:bookmarkEnd w:id="7"/>
+      <w:bookmarkEnd w:id="8"/>
     </w:p>
     <w:p>
       <w:pPr>
@@ -5171,11 +5314,7 @@
         <w:pStyle w:val="body"/>
       </w:pPr>
       <w:r>
-        <w:t xml:space="preserve">The serial connection has been tested by Dave Ault using a PiDP-11 and a PDP-11/73 running RT-11. </w:t>
-      </w:r>
-      <w:r>
-        <w:lastRenderedPageBreak/>
-        <w:t>The command</w:t>
+        <w:t>The serial connection has been tested by Dave Ault using a PiDP-11 and a PDP-11/73 running RT-11. The command</w:t>
       </w:r>
     </w:p>
     <w:p>
@@ -5247,6 +5386,16 @@
     </w:p>
     <w:p>
       <w:pPr>
+        <w:pStyle w:val="Heading2"/>
+      </w:pPr>
+      <w:bookmarkStart w:id="9" w:name="_Toc227814932"/>
+      <w:r>
+        <w:t>Using Tek4010 as a plotter</w:t>
+      </w:r>
+      <w:bookmarkEnd w:id="9"/>
+    </w:p>
+    <w:p>
+      <w:pPr>
         <w:pStyle w:val="body"/>
       </w:pPr>
       <w:r>
@@ -5280,8 +5429,16 @@
       </w:r>
       <w:proofErr w:type="gramEnd"/>
       <w:r>
-        <w:t xml:space="preserve"> could send formatted and raw data to an attached printer or plotter.</w:t>
-      </w:r>
+        <w:t xml:space="preserve"> could send formatted and raw data to an attached printer or </w:t>
+      </w:r>
+      <w:proofErr w:type="gramStart"/>
+      <w:r>
+        <w:t>plotter.</w:t>
+      </w:r>
+      <w:r>
+        <w:t>.</w:t>
+      </w:r>
+      <w:proofErr w:type="gramEnd"/>
     </w:p>
     <w:p>
       <w:pPr>
@@ -5314,6 +5471,7 @@
           <w:rStyle w:val="SourceText"/>
           <w:rFonts w:ascii="Liberation Sans" w:eastAsia="Noto Sans" w:hAnsi="Liberation Sans" w:cs="FreeSans"/>
         </w:rPr>
+        <w:lastRenderedPageBreak/>
         <w:t>tek4010 tail -f printout.txt</w:t>
       </w:r>
     </w:p>
@@ -5332,46 +5490,18 @@
     </w:p>
     <w:p>
       <w:pPr>
-        <w:pStyle w:val="Heading1"/>
+        <w:pStyle w:val="Heading2"/>
+      </w:pPr>
+      <w:bookmarkStart w:id="10" w:name="_Toc227814933"/>
+      <w:r>
         <w:rPr>
           <w:rStyle w:val="Strong"/>
           <w:b/>
           <w:bCs/>
         </w:rPr>
-      </w:pPr>
-      <w:bookmarkStart w:id="8" w:name="_Toc226815595"/>
-      <w:r>
-        <w:rPr>
-          <w:rStyle w:val="Strong"/>
-          <w:b/>
-          <w:bCs/>
-        </w:rPr>
-        <w:t>Using tek4010</w:t>
-      </w:r>
-      <w:r>
-        <w:rPr>
-          <w:rStyle w:val="Strong"/>
-          <w:b/>
-          <w:bCs/>
-        </w:rPr>
-        <w:t xml:space="preserve"> as a terminal and device</w:t>
-      </w:r>
-      <w:bookmarkEnd w:id="8"/>
-    </w:p>
-    <w:p>
-      <w:pPr>
-        <w:pStyle w:val="Heading2"/>
-        <w:ind w:right="569"/>
-      </w:pPr>
-      <w:bookmarkStart w:id="9" w:name="_Toc226815596"/>
-      <w:r>
-        <w:rPr>
-          <w:rStyle w:val="Strong"/>
-          <w:b/>
-        </w:rPr>
         <w:t>tek4010 on the PiDP-8</w:t>
       </w:r>
-      <w:bookmarkEnd w:id="9"/>
+      <w:bookmarkEnd w:id="10"/>
     </w:p>
     <w:p>
       <w:pPr>
@@ -5393,20 +5523,23 @@
     </w:p>
     <w:p>
       <w:pPr>
-        <w:pStyle w:val="body"/>
-        <w:rPr>
-          <w:rStyle w:val="Strong"/>
-          <w:b w:val="0"/>
-        </w:rPr>
-      </w:pPr>
-      <w:bookmarkStart w:id="10" w:name="_Toc226815597"/>
-      <w:r>
-        <w:rPr>
-          <w:rStyle w:val="Strong"/>
+        <w:pStyle w:val="Heading2"/>
+        <w:rPr>
+          <w:rStyle w:val="Strong"/>
+          <w:b/>
+          <w:bCs/>
+        </w:rPr>
+      </w:pPr>
+      <w:bookmarkStart w:id="11" w:name="_Toc227814934"/>
+      <w:r>
+        <w:rPr>
+          <w:rStyle w:val="Strong"/>
+          <w:b/>
+          <w:bCs/>
         </w:rPr>
         <w:t>Options of the command tek4010</w:t>
       </w:r>
-      <w:bookmarkEnd w:id="10"/>
+      <w:bookmarkEnd w:id="11"/>
     </w:p>
     <w:p>
       <w:pPr>
@@ -5647,7 +5780,6 @@
         <w:pStyle w:val="body"/>
       </w:pPr>
       <w:r>
-        <w:lastRenderedPageBreak/>
         <w:t>Open a full-screen window. The full resolution of the 4014 with the enhanced graphics module is used, scaled to the window size. Use Ctrl + Q to close the window.</w:t>
       </w:r>
     </w:p>
@@ -5841,7 +5973,11 @@
         <w:pStyle w:val="body"/>
       </w:pPr>
       <w:r>
-        <w:t>Keep the current font size when the screen is cleared. Some historical plot files may not reset the font size correctly when this option is used.</w:t>
+        <w:t xml:space="preserve">Keep the current font size when the screen is cleared. Some historical plot files may not reset the font size </w:t>
+      </w:r>
+      <w:r>
+        <w:lastRenderedPageBreak/>
+        <w:t>correctly when this option is used.</w:t>
       </w:r>
     </w:p>
     <w:p>
@@ -5993,16 +6129,17 @@
           <w:bCs/>
         </w:rPr>
       </w:pPr>
-      <w:bookmarkStart w:id="11" w:name="_Toc226815598"/>
+      <w:bookmarkStart w:id="12" w:name="_Toc227814935"/>
       <w:r>
         <w:rPr>
           <w:rStyle w:val="Strong"/>
           <w:b/>
           <w:bCs/>
         </w:rPr>
+        <w:lastRenderedPageBreak/>
         <w:t>Advanced features</w:t>
       </w:r>
-      <w:bookmarkEnd w:id="11"/>
+      <w:bookmarkEnd w:id="12"/>
     </w:p>
     <w:p>
       <w:pPr>
@@ -6012,7 +6149,7 @@
           <w:b/>
         </w:rPr>
       </w:pPr>
-      <w:bookmarkStart w:id="12" w:name="_Toc226815599"/>
+      <w:bookmarkStart w:id="13" w:name="_Toc227814936"/>
       <w:r>
         <w:rPr>
           <w:rStyle w:val="Strong"/>
@@ -6020,7 +6157,7 @@
         </w:rPr>
         <w:t>APL mode</w:t>
       </w:r>
-      <w:bookmarkEnd w:id="12"/>
+      <w:bookmarkEnd w:id="13"/>
     </w:p>
     <w:p>
       <w:pPr>
@@ -6029,7 +6166,6 @@
           <w:sz w:val="24"/>
         </w:rPr>
       </w:pPr>
-      <w:bookmarkStart w:id="13" w:name="_Toc226815600"/>
       <w:r>
         <w:t>If tek4010 is started with the -APL option, a Tektronix 4013 or 4015 terminal is emulated using the alternative APL character set.</w:t>
       </w:r>
@@ -6153,7 +6289,6 @@
         <w:pStyle w:val="body"/>
       </w:pPr>
       <w:r>
-        <w:lastRenderedPageBreak/>
         <w:t xml:space="preserve">On Linux, WSL, and Raspberry Pi OS, the installation script updates the font cache and displays a line </w:t>
       </w:r>
       <w:proofErr w:type="gramStart"/>
@@ -6527,14 +6662,16 @@
         <w:pStyle w:val="Heading2"/>
         <w:ind w:right="569"/>
       </w:pPr>
+      <w:bookmarkStart w:id="14" w:name="_Toc227814937"/>
       <w:r>
         <w:rPr>
           <w:rStyle w:val="Strong"/>
           <w:b/>
         </w:rPr>
+        <w:lastRenderedPageBreak/>
         <w:t>Screen resolution</w:t>
       </w:r>
-      <w:bookmarkEnd w:id="13"/>
+      <w:bookmarkEnd w:id="14"/>
     </w:p>
     <w:p>
       <w:pPr>
@@ -6734,22 +6871,24 @@
           <w:bCs/>
         </w:rPr>
       </w:pPr>
-      <w:bookmarkStart w:id="14" w:name="_Toc226815601"/>
-      <w:r>
-        <w:rPr>
-          <w:rStyle w:val="Strong"/>
+      <w:bookmarkStart w:id="15" w:name="_Toc227814938"/>
+      <w:r>
+        <w:rPr>
+          <w:rStyle w:val="Strong"/>
+          <w:b/>
+          <w:bCs/>
         </w:rPr>
         <w:lastRenderedPageBreak/>
         <w:t>Background and documentation</w:t>
       </w:r>
-      <w:bookmarkEnd w:id="14"/>
+      <w:bookmarkEnd w:id="15"/>
     </w:p>
     <w:p>
       <w:pPr>
         <w:pStyle w:val="Heading2"/>
         <w:ind w:right="569"/>
       </w:pPr>
-      <w:bookmarkStart w:id="15" w:name="_Toc226815602"/>
+      <w:bookmarkStart w:id="16" w:name="_Toc227814939"/>
       <w:r>
         <w:rPr>
           <w:rStyle w:val="Strong"/>
@@ -6757,7 +6896,7 @@
         </w:rPr>
         <w:t>Manuals</w:t>
       </w:r>
-      <w:bookmarkEnd w:id="15"/>
+      <w:bookmarkEnd w:id="16"/>
     </w:p>
     <w:p>
       <w:pPr>
@@ -6818,7 +6957,7 @@
       <w:pPr>
         <w:pStyle w:val="Heading2"/>
       </w:pPr>
-      <w:bookmarkStart w:id="16" w:name="_Toc226815603"/>
+      <w:bookmarkStart w:id="17" w:name="_Toc227814940"/>
       <w:r>
         <w:rPr>
           <w:rStyle w:val="Strong"/>
@@ -6826,7 +6965,7 @@
         </w:rPr>
         <w:t>Historically interesting facts about the ARDS terminal</w:t>
       </w:r>
-      <w:bookmarkEnd w:id="16"/>
+      <w:bookmarkEnd w:id="17"/>
     </w:p>
     <w:p>
       <w:pPr>
@@ -6903,7 +7042,7 @@
           <w:bCs w:val="0"/>
         </w:rPr>
       </w:pPr>
-      <w:bookmarkStart w:id="17" w:name="_Toc226815604"/>
+      <w:bookmarkStart w:id="18" w:name="_Toc227814941"/>
       <w:r>
         <w:rPr>
           <w:rStyle w:val="Strong"/>
@@ -6911,7 +7050,7 @@
         </w:rPr>
         <w:t>Using other fonts</w:t>
       </w:r>
-      <w:bookmarkEnd w:id="17"/>
+      <w:bookmarkEnd w:id="18"/>
     </w:p>
     <w:p>
       <w:pPr>
@@ -6958,7 +7097,7 @@
           <w:bCs w:val="0"/>
         </w:rPr>
       </w:pPr>
-      <w:bookmarkStart w:id="18" w:name="_Toc226815605"/>
+      <w:bookmarkStart w:id="19" w:name="_Toc227814942"/>
       <w:r>
         <w:rPr>
           <w:rStyle w:val="Strong"/>
@@ -6966,7 +7105,7 @@
         </w:rPr>
         <w:t>Making grayscale images for tek4010</w:t>
       </w:r>
-      <w:bookmarkEnd w:id="18"/>
+      <w:bookmarkEnd w:id="19"/>
     </w:p>
     <w:p>
       <w:pPr>
@@ -7039,7 +7178,6 @@
         <w:rPr>
           <w:noProof/>
         </w:rPr>
-        <w:lastRenderedPageBreak/>
         <w:drawing>
           <wp:anchor distT="0" distB="0" distL="0" distR="0" simplePos="0" relativeHeight="6" behindDoc="0" locked="0" layoutInCell="1" allowOverlap="1" wp14:anchorId="2117B0EF" wp14:editId="24EB79B3">
             <wp:simplePos x="0" y="0"/>
@@ -7093,15 +7231,16 @@
         <w:pStyle w:val="Heading2"/>
         <w:ind w:right="569"/>
       </w:pPr>
-      <w:bookmarkStart w:id="19" w:name="_Toc226815606"/>
+      <w:bookmarkStart w:id="20" w:name="_Toc227814943"/>
       <w:r>
         <w:rPr>
           <w:rStyle w:val="Strong"/>
           <w:b/>
         </w:rPr>
+        <w:lastRenderedPageBreak/>
         <w:t>Using tek4010 on a slow system</w:t>
       </w:r>
-      <w:bookmarkEnd w:id="19"/>
+      <w:bookmarkEnd w:id="20"/>
     </w:p>
     <w:p>
       <w:pPr>
@@ -7178,16 +7317,17 @@
           <w:bCs/>
         </w:rPr>
       </w:pPr>
-      <w:bookmarkStart w:id="20" w:name="_Toc226815607"/>
+      <w:bookmarkStart w:id="21" w:name="_Toc227814944"/>
       <w:r>
         <w:rPr>
           <w:rStyle w:val="Strong"/>
           <w:b/>
           <w:bCs/>
         </w:rPr>
+        <w:lastRenderedPageBreak/>
         <w:t>Miscellaneous</w:t>
       </w:r>
-      <w:bookmarkEnd w:id="20"/>
+      <w:bookmarkEnd w:id="21"/>
     </w:p>
     <w:p>
       <w:pPr>
@@ -7199,7 +7339,7 @@
           <w:bCs/>
         </w:rPr>
       </w:pPr>
-      <w:bookmarkStart w:id="21" w:name="_Toc226815608"/>
+      <w:bookmarkStart w:id="22" w:name="_Toc227814945"/>
       <w:r>
         <w:rPr>
           <w:rStyle w:val="Strong"/>
@@ -7207,7 +7347,7 @@
         </w:rPr>
         <w:t>Contributors</w:t>
       </w:r>
-      <w:bookmarkEnd w:id="21"/>
+      <w:bookmarkEnd w:id="22"/>
     </w:p>
     <w:p>
       <w:pPr>
@@ -7514,7 +7654,7 @@
         <w:pStyle w:val="Heading2"/>
         <w:ind w:right="569"/>
       </w:pPr>
-      <w:bookmarkStart w:id="22" w:name="_Toc226815609"/>
+      <w:bookmarkStart w:id="23" w:name="_Toc227814946"/>
       <w:r>
         <w:rPr>
           <w:rStyle w:val="Strong"/>
@@ -7522,7 +7662,7 @@
         </w:rPr>
         <w:t>The usual disclaimer</w:t>
       </w:r>
-      <w:bookmarkEnd w:id="22"/>
+      <w:bookmarkEnd w:id="23"/>
     </w:p>
     <w:p>
       <w:pPr>
@@ -8324,14 +8464,15 @@
     <w:next w:val="BodyText"/>
     <w:uiPriority w:val="9"/>
     <w:qFormat/>
-    <w:rsid w:val="00255A61"/>
+    <w:rsid w:val="000E58D3"/>
     <w:pPr>
+      <w:pageBreakBefore/>
       <w:outlineLvl w:val="0"/>
     </w:pPr>
     <w:rPr>
       <w:b/>
       <w:bCs/>
-      <w:sz w:val="40"/>
+      <w:sz w:val="48"/>
       <w:szCs w:val="48"/>
     </w:rPr>
   </w:style>
@@ -8342,18 +8483,19 @@
     <w:uiPriority w:val="9"/>
     <w:unhideWhenUsed/>
     <w:qFormat/>
-    <w:rsid w:val="00021456"/>
+    <w:rsid w:val="000E58D3"/>
     <w:pPr>
       <w:numPr>
         <w:ilvl w:val="1"/>
         <w:numId w:val="1"/>
       </w:numPr>
-      <w:spacing w:before="200"/>
+      <w:spacing w:before="480" w:after="240"/>
       <w:outlineLvl w:val="1"/>
     </w:pPr>
     <w:rPr>
       <w:b/>
       <w:bCs/>
+      <w:sz w:val="32"/>
       <w:szCs w:val="32"/>
     </w:rPr>
   </w:style>
@@ -8405,7 +8547,6 @@
   <w:style w:type="character" w:default="1" w:styleId="DefaultParagraphFont">
     <w:name w:val="Default Paragraph Font"/>
     <w:uiPriority w:val="1"/>
-    <w:semiHidden/>
     <w:unhideWhenUsed/>
   </w:style>
   <w:style w:type="table" w:default="1" w:styleId="TableNormal">

</xml_diff>

<commit_message>
Changed keyboard keys to new definition
</commit_message>
<xml_diff>
--- a/docs/manual.docx
+++ b/docs/manual.docx
@@ -4,7 +4,7 @@
   <w:body>
     <w:p>
       <w:pPr>
-        <w:pStyle w:val="ListParagraph"/>
+        <w:pStyle w:val="Listenabsatz"/>
         <w:jc w:val="both"/>
         <w:rPr>
           <w:sz w:val="48"/>
@@ -21,7 +21,7 @@
     </w:p>
     <w:p>
       <w:pPr>
-        <w:pStyle w:val="ListParagraph"/>
+        <w:pStyle w:val="Listenabsatz"/>
         <w:jc w:val="both"/>
         <w:rPr>
           <w:sz w:val="48"/>
@@ -88,7 +88,7 @@
           </w:r>
           <w:r>
             <w:rPr>
-              <w:rStyle w:val="Strong"/>
+              <w:rStyle w:val="Fett"/>
             </w:rPr>
             <w:t>Contents</w:t>
           </w:r>
@@ -113,7 +113,7 @@
         </w:p>
         <w:p>
           <w:pPr>
-            <w:pStyle w:val="TOC1"/>
+            <w:pStyle w:val="Verzeichnis1"/>
             <w:rPr>
               <w:rFonts w:asciiTheme="minorHAnsi" w:eastAsiaTheme="minorEastAsia" w:hAnsiTheme="minorHAnsi" w:cstheme="minorBidi"/>
               <w:b w:val="0"/>
@@ -176,7 +176,7 @@
         </w:p>
         <w:p>
           <w:pPr>
-            <w:pStyle w:val="TOC1"/>
+            <w:pStyle w:val="Verzeichnis1"/>
             <w:rPr>
               <w:rFonts w:asciiTheme="minorHAnsi" w:eastAsiaTheme="minorEastAsia" w:hAnsiTheme="minorHAnsi" w:cstheme="minorBidi"/>
               <w:b w:val="0"/>
@@ -239,7 +239,7 @@
         </w:p>
         <w:p>
           <w:pPr>
-            <w:pStyle w:val="TOC2"/>
+            <w:pStyle w:val="Verzeichnis2"/>
             <w:rPr>
               <w:rFonts w:asciiTheme="minorHAnsi" w:eastAsiaTheme="minorEastAsia" w:hAnsiTheme="minorHAnsi" w:cstheme="minorBidi"/>
               <w:noProof/>
@@ -301,7 +301,7 @@
         </w:p>
         <w:p>
           <w:pPr>
-            <w:pStyle w:val="TOC2"/>
+            <w:pStyle w:val="Verzeichnis2"/>
             <w:rPr>
               <w:rFonts w:asciiTheme="minorHAnsi" w:eastAsiaTheme="minorEastAsia" w:hAnsiTheme="minorHAnsi" w:cstheme="minorBidi"/>
               <w:noProof/>
@@ -363,7 +363,7 @@
         </w:p>
         <w:p>
           <w:pPr>
-            <w:pStyle w:val="TOC1"/>
+            <w:pStyle w:val="Verzeichnis1"/>
             <w:rPr>
               <w:rFonts w:asciiTheme="minorHAnsi" w:eastAsiaTheme="minorEastAsia" w:hAnsiTheme="minorHAnsi" w:cstheme="minorBidi"/>
               <w:b w:val="0"/>
@@ -426,7 +426,7 @@
         </w:p>
         <w:p>
           <w:pPr>
-            <w:pStyle w:val="TOC2"/>
+            <w:pStyle w:val="Verzeichnis2"/>
             <w:rPr>
               <w:rFonts w:asciiTheme="minorHAnsi" w:eastAsiaTheme="minorEastAsia" w:hAnsiTheme="minorHAnsi" w:cstheme="minorBidi"/>
               <w:noProof/>
@@ -488,7 +488,7 @@
         </w:p>
         <w:p>
           <w:pPr>
-            <w:pStyle w:val="TOC2"/>
+            <w:pStyle w:val="Verzeichnis2"/>
             <w:rPr>
               <w:rFonts w:asciiTheme="minorHAnsi" w:eastAsiaTheme="minorEastAsia" w:hAnsiTheme="minorHAnsi" w:cstheme="minorBidi"/>
               <w:noProof/>
@@ -550,7 +550,7 @@
         </w:p>
         <w:p>
           <w:pPr>
-            <w:pStyle w:val="TOC1"/>
+            <w:pStyle w:val="Verzeichnis1"/>
             <w:rPr>
               <w:rFonts w:asciiTheme="minorHAnsi" w:eastAsiaTheme="minorEastAsia" w:hAnsiTheme="minorHAnsi" w:cstheme="minorBidi"/>
               <w:b w:val="0"/>
@@ -613,7 +613,7 @@
         </w:p>
         <w:p>
           <w:pPr>
-            <w:pStyle w:val="TOC2"/>
+            <w:pStyle w:val="Verzeichnis2"/>
             <w:rPr>
               <w:rFonts w:asciiTheme="minorHAnsi" w:eastAsiaTheme="minorEastAsia" w:hAnsiTheme="minorHAnsi" w:cstheme="minorBidi"/>
               <w:noProof/>
@@ -675,7 +675,7 @@
         </w:p>
         <w:p>
           <w:pPr>
-            <w:pStyle w:val="TOC2"/>
+            <w:pStyle w:val="Verzeichnis2"/>
             <w:rPr>
               <w:rFonts w:asciiTheme="minorHAnsi" w:eastAsiaTheme="minorEastAsia" w:hAnsiTheme="minorHAnsi" w:cstheme="minorBidi"/>
               <w:noProof/>
@@ -690,21 +690,7 @@
                 <w:rStyle w:val="Hyperlink"/>
                 <w:noProof/>
               </w:rPr>
-              <w:t>Using Tek4010</w:t>
-            </w:r>
-            <w:r>
-              <w:rPr>
-                <w:rStyle w:val="Hyperlink"/>
-                <w:noProof/>
-              </w:rPr>
-              <w:t xml:space="preserve"> </w:t>
-            </w:r>
-            <w:r>
-              <w:rPr>
-                <w:rStyle w:val="Hyperlink"/>
-                <w:noProof/>
-              </w:rPr>
-              <w:t>as a plotter</w:t>
+              <w:t>Using Tek4010 as a plotter</w:t>
             </w:r>
             <w:r>
               <w:rPr>
@@ -751,7 +737,7 @@
         </w:p>
         <w:p>
           <w:pPr>
-            <w:pStyle w:val="TOC2"/>
+            <w:pStyle w:val="Verzeichnis2"/>
             <w:rPr>
               <w:rFonts w:asciiTheme="minorHAnsi" w:eastAsiaTheme="minorEastAsia" w:hAnsiTheme="minorHAnsi" w:cstheme="minorBidi"/>
               <w:noProof/>
@@ -813,7 +799,7 @@
         </w:p>
         <w:p>
           <w:pPr>
-            <w:pStyle w:val="TOC2"/>
+            <w:pStyle w:val="Verzeichnis2"/>
             <w:rPr>
               <w:rFonts w:asciiTheme="minorHAnsi" w:eastAsiaTheme="minorEastAsia" w:hAnsiTheme="minorHAnsi" w:cstheme="minorBidi"/>
               <w:noProof/>
@@ -875,7 +861,7 @@
         </w:p>
         <w:p>
           <w:pPr>
-            <w:pStyle w:val="TOC1"/>
+            <w:pStyle w:val="Verzeichnis1"/>
             <w:rPr>
               <w:rFonts w:asciiTheme="minorHAnsi" w:eastAsiaTheme="minorEastAsia" w:hAnsiTheme="minorHAnsi" w:cstheme="minorBidi"/>
               <w:b w:val="0"/>
@@ -938,7 +924,7 @@
         </w:p>
         <w:p>
           <w:pPr>
-            <w:pStyle w:val="TOC2"/>
+            <w:pStyle w:val="Verzeichnis2"/>
             <w:rPr>
               <w:rFonts w:asciiTheme="minorHAnsi" w:eastAsiaTheme="minorEastAsia" w:hAnsiTheme="minorHAnsi" w:cstheme="minorBidi"/>
               <w:noProof/>
@@ -1000,7 +986,7 @@
         </w:p>
         <w:p>
           <w:pPr>
-            <w:pStyle w:val="TOC2"/>
+            <w:pStyle w:val="Verzeichnis2"/>
             <w:rPr>
               <w:rFonts w:asciiTheme="minorHAnsi" w:eastAsiaTheme="minorEastAsia" w:hAnsiTheme="minorHAnsi" w:cstheme="minorBidi"/>
               <w:noProof/>
@@ -1062,7 +1048,7 @@
         </w:p>
         <w:p>
           <w:pPr>
-            <w:pStyle w:val="TOC1"/>
+            <w:pStyle w:val="Verzeichnis1"/>
             <w:rPr>
               <w:rFonts w:asciiTheme="minorHAnsi" w:eastAsiaTheme="minorEastAsia" w:hAnsiTheme="minorHAnsi" w:cstheme="minorBidi"/>
               <w:b w:val="0"/>
@@ -1125,7 +1111,7 @@
         </w:p>
         <w:p>
           <w:pPr>
-            <w:pStyle w:val="TOC2"/>
+            <w:pStyle w:val="Verzeichnis2"/>
             <w:rPr>
               <w:rFonts w:asciiTheme="minorHAnsi" w:eastAsiaTheme="minorEastAsia" w:hAnsiTheme="minorHAnsi" w:cstheme="minorBidi"/>
               <w:noProof/>
@@ -1187,7 +1173,7 @@
         </w:p>
         <w:p>
           <w:pPr>
-            <w:pStyle w:val="TOC2"/>
+            <w:pStyle w:val="Verzeichnis2"/>
             <w:rPr>
               <w:rFonts w:asciiTheme="minorHAnsi" w:eastAsiaTheme="minorEastAsia" w:hAnsiTheme="minorHAnsi" w:cstheme="minorBidi"/>
               <w:noProof/>
@@ -1249,7 +1235,7 @@
         </w:p>
         <w:p>
           <w:pPr>
-            <w:pStyle w:val="TOC2"/>
+            <w:pStyle w:val="Verzeichnis2"/>
             <w:rPr>
               <w:rFonts w:asciiTheme="minorHAnsi" w:eastAsiaTheme="minorEastAsia" w:hAnsiTheme="minorHAnsi" w:cstheme="minorBidi"/>
               <w:noProof/>
@@ -1311,7 +1297,7 @@
         </w:p>
         <w:p>
           <w:pPr>
-            <w:pStyle w:val="TOC2"/>
+            <w:pStyle w:val="Verzeichnis2"/>
             <w:rPr>
               <w:rFonts w:asciiTheme="minorHAnsi" w:eastAsiaTheme="minorEastAsia" w:hAnsiTheme="minorHAnsi" w:cstheme="minorBidi"/>
               <w:noProof/>
@@ -1373,7 +1359,7 @@
         </w:p>
         <w:p>
           <w:pPr>
-            <w:pStyle w:val="TOC2"/>
+            <w:pStyle w:val="Verzeichnis2"/>
             <w:rPr>
               <w:rFonts w:asciiTheme="minorHAnsi" w:eastAsiaTheme="minorEastAsia" w:hAnsiTheme="minorHAnsi" w:cstheme="minorBidi"/>
               <w:noProof/>
@@ -1435,7 +1421,7 @@
         </w:p>
         <w:p>
           <w:pPr>
-            <w:pStyle w:val="TOC1"/>
+            <w:pStyle w:val="Verzeichnis1"/>
             <w:rPr>
               <w:rFonts w:asciiTheme="minorHAnsi" w:eastAsiaTheme="minorEastAsia" w:hAnsiTheme="minorHAnsi" w:cstheme="minorBidi"/>
               <w:b w:val="0"/>
@@ -1498,7 +1484,7 @@
         </w:p>
         <w:p>
           <w:pPr>
-            <w:pStyle w:val="TOC2"/>
+            <w:pStyle w:val="Verzeichnis2"/>
             <w:rPr>
               <w:rFonts w:asciiTheme="minorHAnsi" w:eastAsiaTheme="minorEastAsia" w:hAnsiTheme="minorHAnsi" w:cstheme="minorBidi"/>
               <w:noProof/>
@@ -1560,7 +1546,7 @@
         </w:p>
         <w:p>
           <w:pPr>
-            <w:pStyle w:val="TOC2"/>
+            <w:pStyle w:val="Verzeichnis2"/>
             <w:rPr>
               <w:rFonts w:asciiTheme="minorHAnsi" w:eastAsiaTheme="minorEastAsia" w:hAnsiTheme="minorHAnsi" w:cstheme="minorBidi"/>
               <w:noProof/>
@@ -1637,7 +1623,7 @@
     </w:sdt>
     <w:p>
       <w:pPr>
-        <w:pStyle w:val="Heading1"/>
+        <w:pStyle w:val="berschrift1"/>
       </w:pPr>
       <w:bookmarkStart w:id="0" w:name="_Toc227814923"/>
       <w:r>
@@ -1677,7 +1663,7 @@
     </w:p>
     <w:p>
       <w:pPr>
-        <w:pStyle w:val="TOC2"/>
+        <w:pStyle w:val="Verzeichnis2"/>
         <w:ind w:left="0"/>
         <w:jc w:val="center"/>
       </w:pPr>
@@ -1767,7 +1753,7 @@
           <w:noProof/>
         </w:rPr>
         <w:drawing>
-          <wp:inline distT="0" distB="0" distL="0" distR="0" wp14:anchorId="3A05AA49" wp14:editId="6C644B74">
+          <wp:inline distT="0" distB="0" distL="0" distR="0" wp14:anchorId="3A05AA49" wp14:editId="5A58E899">
             <wp:extent cx="5626100" cy="3153914"/>
             <wp:effectExtent l="0" t="0" r="0" b="0"/>
             <wp:docPr id="2" name="Image2"/>
@@ -2072,7 +2058,7 @@
     </w:p>
     <w:p>
       <w:pPr>
-        <w:pStyle w:val="Heading1"/>
+        <w:pStyle w:val="berschrift1"/>
       </w:pPr>
       <w:bookmarkStart w:id="1" w:name="_Toc227814924"/>
       <w:r>
@@ -2086,9 +2072,9 @@
     </w:p>
     <w:p>
       <w:pPr>
-        <w:pStyle w:val="Heading2"/>
-        <w:rPr>
-          <w:rStyle w:val="Strong"/>
+        <w:pStyle w:val="berschrift2"/>
+        <w:rPr>
+          <w:rStyle w:val="Fett"/>
           <w:b/>
           <w:bCs/>
         </w:rPr>
@@ -2096,7 +2082,7 @@
       <w:bookmarkStart w:id="2" w:name="_Toc227814925"/>
       <w:r>
         <w:rPr>
-          <w:rStyle w:val="Strong"/>
+          <w:rStyle w:val="Fett"/>
           <w:b/>
           <w:bCs/>
         </w:rPr>
@@ -2106,7 +2092,7 @@
     </w:p>
     <w:p>
       <w:pPr>
-        <w:pStyle w:val="TOC2"/>
+        <w:pStyle w:val="Verzeichnis2"/>
       </w:pPr>
     </w:p>
     <w:p>
@@ -2117,14 +2103,14 @@
           <w:numId w:val="2"/>
         </w:numPr>
         <w:rPr>
-          <w:rStyle w:val="Strong"/>
+          <w:rStyle w:val="Fett"/>
           <w:b w:val="0"/>
           <w:bCs w:val="0"/>
         </w:rPr>
       </w:pPr>
       <w:r>
         <w:rPr>
-          <w:rStyle w:val="Strong"/>
+          <w:rStyle w:val="Fett"/>
           <w:b w:val="0"/>
           <w:bCs w:val="0"/>
         </w:rPr>
@@ -2135,7 +2121,7 @@
       <w:pPr>
         <w:pStyle w:val="body"/>
         <w:rPr>
-          <w:rStyle w:val="Strong"/>
+          <w:rStyle w:val="Fett"/>
           <w:b w:val="0"/>
           <w:bCs w:val="0"/>
         </w:rPr>
@@ -2149,14 +2135,14 @@
           <w:numId w:val="2"/>
         </w:numPr>
         <w:rPr>
-          <w:rStyle w:val="Strong"/>
+          <w:rStyle w:val="Fett"/>
           <w:b w:val="0"/>
           <w:bCs w:val="0"/>
         </w:rPr>
       </w:pPr>
       <w:r>
         <w:rPr>
-          <w:rStyle w:val="Strong"/>
+          <w:rStyle w:val="Fett"/>
           <w:b w:val="0"/>
           <w:bCs w:val="0"/>
         </w:rPr>
@@ -2167,7 +2153,7 @@
       <w:pPr>
         <w:pStyle w:val="body"/>
         <w:rPr>
-          <w:rStyle w:val="Strong"/>
+          <w:rStyle w:val="Fett"/>
           <w:b w:val="0"/>
           <w:bCs w:val="0"/>
         </w:rPr>
@@ -2181,14 +2167,14 @@
           <w:numId w:val="2"/>
         </w:numPr>
         <w:rPr>
-          <w:rStyle w:val="Strong"/>
+          <w:rStyle w:val="Fett"/>
           <w:b w:val="0"/>
           <w:bCs w:val="0"/>
         </w:rPr>
       </w:pPr>
       <w:r>
         <w:rPr>
-          <w:rStyle w:val="Strong"/>
+          <w:rStyle w:val="Fett"/>
           <w:b w:val="0"/>
           <w:bCs w:val="0"/>
         </w:rPr>
@@ -2199,7 +2185,7 @@
       <w:pPr>
         <w:pStyle w:val="body"/>
         <w:rPr>
-          <w:rStyle w:val="Strong"/>
+          <w:rStyle w:val="Fett"/>
           <w:b w:val="0"/>
           <w:bCs w:val="0"/>
         </w:rPr>
@@ -2213,14 +2199,14 @@
           <w:numId w:val="2"/>
         </w:numPr>
         <w:rPr>
-          <w:rStyle w:val="Strong"/>
+          <w:rStyle w:val="Fett"/>
           <w:b w:val="0"/>
           <w:bCs w:val="0"/>
         </w:rPr>
       </w:pPr>
       <w:r>
         <w:rPr>
-          <w:rStyle w:val="Strong"/>
+          <w:rStyle w:val="Fett"/>
           <w:b w:val="0"/>
           <w:bCs w:val="0"/>
         </w:rPr>
@@ -2231,7 +2217,7 @@
       <w:pPr>
         <w:pStyle w:val="body"/>
         <w:rPr>
-          <w:rStyle w:val="Strong"/>
+          <w:rStyle w:val="Fett"/>
           <w:b w:val="0"/>
           <w:bCs w:val="0"/>
         </w:rPr>
@@ -2245,14 +2231,14 @@
           <w:numId w:val="2"/>
         </w:numPr>
         <w:rPr>
-          <w:rStyle w:val="Strong"/>
+          <w:rStyle w:val="Fett"/>
           <w:b w:val="0"/>
           <w:bCs w:val="0"/>
         </w:rPr>
       </w:pPr>
       <w:r>
         <w:rPr>
-          <w:rStyle w:val="Strong"/>
+          <w:rStyle w:val="Fett"/>
           <w:b w:val="0"/>
           <w:bCs w:val="0"/>
         </w:rPr>
@@ -2263,7 +2249,7 @@
       <w:pPr>
         <w:pStyle w:val="body"/>
         <w:rPr>
-          <w:rStyle w:val="Strong"/>
+          <w:rStyle w:val="Fett"/>
           <w:b w:val="0"/>
           <w:bCs w:val="0"/>
         </w:rPr>
@@ -2277,14 +2263,14 @@
           <w:numId w:val="2"/>
         </w:numPr>
         <w:rPr>
-          <w:rStyle w:val="Strong"/>
+          <w:rStyle w:val="Fett"/>
           <w:b w:val="0"/>
           <w:bCs w:val="0"/>
         </w:rPr>
       </w:pPr>
       <w:r>
         <w:rPr>
-          <w:rStyle w:val="Strong"/>
+          <w:rStyle w:val="Fett"/>
           <w:b w:val="0"/>
           <w:bCs w:val="0"/>
         </w:rPr>
@@ -2293,7 +2279,7 @@
       <w:proofErr w:type="spellStart"/>
       <w:r>
         <w:rPr>
-          <w:rStyle w:val="Strong"/>
+          <w:rStyle w:val="Fett"/>
           <w:b w:val="0"/>
           <w:bCs w:val="0"/>
         </w:rPr>
@@ -2302,7 +2288,7 @@
       <w:proofErr w:type="spellEnd"/>
       <w:r>
         <w:rPr>
-          <w:rStyle w:val="Strong"/>
+          <w:rStyle w:val="Fett"/>
           <w:b w:val="0"/>
           <w:bCs w:val="0"/>
         </w:rPr>
@@ -2313,7 +2299,7 @@
       <w:pPr>
         <w:pStyle w:val="body"/>
         <w:rPr>
-          <w:rStyle w:val="Strong"/>
+          <w:rStyle w:val="Fett"/>
           <w:b w:val="0"/>
           <w:bCs w:val="0"/>
         </w:rPr>
@@ -2327,14 +2313,14 @@
           <w:numId w:val="2"/>
         </w:numPr>
         <w:rPr>
-          <w:rStyle w:val="Strong"/>
+          <w:rStyle w:val="Fett"/>
           <w:b w:val="0"/>
           <w:bCs w:val="0"/>
         </w:rPr>
       </w:pPr>
       <w:r>
         <w:rPr>
-          <w:rStyle w:val="Strong"/>
+          <w:rStyle w:val="Fett"/>
           <w:b w:val="0"/>
           <w:bCs w:val="0"/>
         </w:rPr>
@@ -2345,7 +2331,7 @@
       <w:pPr>
         <w:pStyle w:val="body"/>
         <w:rPr>
-          <w:rStyle w:val="Strong"/>
+          <w:rStyle w:val="Fett"/>
           <w:b w:val="0"/>
           <w:bCs w:val="0"/>
         </w:rPr>
@@ -2359,14 +2345,14 @@
           <w:numId w:val="2"/>
         </w:numPr>
         <w:rPr>
-          <w:rStyle w:val="Strong"/>
+          <w:rStyle w:val="Fett"/>
           <w:b w:val="0"/>
           <w:bCs w:val="0"/>
         </w:rPr>
       </w:pPr>
       <w:r>
         <w:rPr>
-          <w:rStyle w:val="Strong"/>
+          <w:rStyle w:val="Fett"/>
           <w:b w:val="0"/>
           <w:bCs w:val="0"/>
         </w:rPr>
@@ -2377,7 +2363,7 @@
       <w:pPr>
         <w:pStyle w:val="body"/>
         <w:rPr>
-          <w:rStyle w:val="Strong"/>
+          <w:rStyle w:val="Fett"/>
           <w:b w:val="0"/>
           <w:bCs w:val="0"/>
         </w:rPr>
@@ -2391,14 +2377,14 @@
           <w:numId w:val="2"/>
         </w:numPr>
         <w:rPr>
-          <w:rStyle w:val="Strong"/>
+          <w:rStyle w:val="Fett"/>
           <w:b w:val="0"/>
           <w:bCs w:val="0"/>
         </w:rPr>
       </w:pPr>
       <w:r>
         <w:rPr>
-          <w:rStyle w:val="Strong"/>
+          <w:rStyle w:val="Fett"/>
           <w:b w:val="0"/>
           <w:bCs w:val="0"/>
         </w:rPr>
@@ -2409,7 +2395,7 @@
       <w:pPr>
         <w:pStyle w:val="body"/>
         <w:rPr>
-          <w:rStyle w:val="Strong"/>
+          <w:rStyle w:val="Fett"/>
           <w:b w:val="0"/>
           <w:bCs w:val="0"/>
         </w:rPr>
@@ -2423,43 +2409,33 @@
           <w:numId w:val="2"/>
         </w:numPr>
         <w:rPr>
-          <w:rStyle w:val="Strong"/>
+          <w:rStyle w:val="Fett"/>
           <w:b w:val="0"/>
           <w:bCs w:val="0"/>
         </w:rPr>
       </w:pPr>
       <w:r>
         <w:rPr>
-          <w:rStyle w:val="Strong"/>
+          <w:rStyle w:val="Fett"/>
           <w:b w:val="0"/>
           <w:bCs w:val="0"/>
         </w:rPr>
-        <w:t xml:space="preserve">telnet and </w:t>
-      </w:r>
-      <w:proofErr w:type="spellStart"/>
-      <w:r>
-        <w:rPr>
-          <w:rStyle w:val="Strong"/>
+        <w:t xml:space="preserve">Ssh and </w:t>
+      </w:r>
+      <w:r>
+        <w:rPr>
+          <w:rStyle w:val="Fett"/>
           <w:b w:val="0"/>
           <w:bCs w:val="0"/>
         </w:rPr>
-        <w:t>rsh</w:t>
-      </w:r>
-      <w:proofErr w:type="spellEnd"/>
-      <w:r>
-        <w:rPr>
-          <w:rStyle w:val="Strong"/>
-          <w:b w:val="0"/>
-          <w:bCs w:val="0"/>
-        </w:rPr>
-        <w:t xml:space="preserve"> connection to host systems and direct display of plot files</w:t>
-      </w:r>
-    </w:p>
-    <w:p>
-      <w:pPr>
-        <w:pStyle w:val="body"/>
-        <w:rPr>
-          <w:rStyle w:val="Strong"/>
+        <w:t>telnet connection to host systems and direct display of plot files</w:t>
+      </w:r>
+    </w:p>
+    <w:p>
+      <w:pPr>
+        <w:pStyle w:val="body"/>
+        <w:rPr>
+          <w:rStyle w:val="Fett"/>
           <w:b w:val="0"/>
           <w:bCs w:val="0"/>
         </w:rPr>
@@ -2473,14 +2449,14 @@
           <w:numId w:val="2"/>
         </w:numPr>
         <w:rPr>
-          <w:rStyle w:val="Strong"/>
+          <w:rStyle w:val="Fett"/>
           <w:b w:val="0"/>
           <w:bCs w:val="0"/>
         </w:rPr>
       </w:pPr>
       <w:r>
         <w:rPr>
-          <w:rStyle w:val="Strong"/>
+          <w:rStyle w:val="Fett"/>
           <w:b w:val="0"/>
           <w:bCs w:val="0"/>
         </w:rPr>
@@ -2491,14 +2467,14 @@
       <w:pPr>
         <w:pStyle w:val="body"/>
         <w:rPr>
-          <w:rStyle w:val="Strong"/>
+          <w:rStyle w:val="Fett"/>
           <w:b w:val="0"/>
           <w:bCs w:val="0"/>
         </w:rPr>
       </w:pPr>
       <w:r>
         <w:rPr>
-          <w:rStyle w:val="Strong"/>
+          <w:rStyle w:val="Fett"/>
           <w:b w:val="0"/>
           <w:bCs w:val="0"/>
         </w:rPr>
@@ -2513,26 +2489,34 @@
           <w:numId w:val="2"/>
         </w:numPr>
         <w:rPr>
-          <w:rStyle w:val="Strong"/>
+          <w:rStyle w:val="Fett"/>
           <w:b w:val="0"/>
           <w:bCs w:val="0"/>
         </w:rPr>
       </w:pPr>
       <w:r>
         <w:rPr>
-          <w:rStyle w:val="Strong"/>
+          <w:rStyle w:val="Fett"/>
           <w:b w:val="0"/>
           <w:bCs w:val="0"/>
         </w:rPr>
         <w:t>Can be compiled for Raspberry Pi and other Linux distributions such as Ubuntu</w:t>
       </w:r>
-    </w:p>
-    <w:p>
-      <w:pPr>
-        <w:pStyle w:val="body"/>
-        <w:rPr>
-          <w:rStyle w:val="Strong"/>
-          <w:b w:val="0"/>
+      <w:r>
+        <w:rPr>
+          <w:rStyle w:val="Fett"/>
+          <w:b w:val="0"/>
+          <w:bCs w:val="0"/>
+        </w:rPr>
+        <w:t xml:space="preserve"> or Debian</w:t>
+      </w:r>
+    </w:p>
+    <w:p>
+      <w:pPr>
+        <w:pStyle w:val="Listenabsatz"/>
+        <w:rPr>
+          <w:rStyle w:val="Fett"/>
+          <w:b/>
           <w:bCs w:val="0"/>
         </w:rPr>
       </w:pPr>
@@ -2545,61 +2529,25 @@
           <w:numId w:val="2"/>
         </w:numPr>
         <w:rPr>
-          <w:rStyle w:val="Strong"/>
+          <w:rStyle w:val="Fett"/>
           <w:b w:val="0"/>
           <w:bCs w:val="0"/>
         </w:rPr>
       </w:pPr>
       <w:r>
         <w:rPr>
-          <w:rStyle w:val="Strong"/>
+          <w:rStyle w:val="Fett"/>
           <w:b w:val="0"/>
           <w:bCs w:val="0"/>
         </w:rPr>
-        <w:t xml:space="preserve">Tested with </w:t>
-      </w:r>
-      <w:proofErr w:type="spellStart"/>
-      <w:r>
-        <w:rPr>
-          <w:rStyle w:val="Strong"/>
-          <w:b w:val="0"/>
-          <w:bCs w:val="0"/>
-        </w:rPr>
-        <w:t>SimH</w:t>
-      </w:r>
-      <w:proofErr w:type="spellEnd"/>
-      <w:r>
-        <w:rPr>
-          <w:rStyle w:val="Strong"/>
-          <w:b w:val="0"/>
-          <w:bCs w:val="0"/>
-        </w:rPr>
-        <w:t xml:space="preserve">, PiDP-11, PDP-11/93, </w:t>
-      </w:r>
-      <w:proofErr w:type="spellStart"/>
-      <w:r>
-        <w:rPr>
-          <w:rStyle w:val="Strong"/>
-          <w:b w:val="0"/>
-          <w:bCs w:val="0"/>
-        </w:rPr>
-        <w:t>VAXstation</w:t>
-      </w:r>
-      <w:proofErr w:type="spellEnd"/>
-      <w:r>
-        <w:rPr>
-          <w:rStyle w:val="Strong"/>
-          <w:b w:val="0"/>
-          <w:bCs w:val="0"/>
-        </w:rPr>
-        <w:t xml:space="preserve"> 4000/90a, 2.11 BSD, RSX-11M+, PLOT10</w:t>
-      </w:r>
-    </w:p>
-    <w:p>
-      <w:pPr>
-        <w:pStyle w:val="body"/>
-        <w:rPr>
-          <w:rStyle w:val="Strong"/>
+        <w:t>Can be installed on MacOS and Windows.</w:t>
+      </w:r>
+    </w:p>
+    <w:p>
+      <w:pPr>
+        <w:pStyle w:val="body"/>
+        <w:rPr>
+          <w:rStyle w:val="Fett"/>
           <w:b w:val="0"/>
           <w:bCs w:val="0"/>
         </w:rPr>
@@ -2613,25 +2561,61 @@
           <w:numId w:val="2"/>
         </w:numPr>
         <w:rPr>
-          <w:rStyle w:val="Strong"/>
+          <w:rStyle w:val="Fett"/>
           <w:b w:val="0"/>
           <w:bCs w:val="0"/>
         </w:rPr>
       </w:pPr>
       <w:r>
         <w:rPr>
-          <w:rStyle w:val="Strong"/>
+          <w:rStyle w:val="Fett"/>
           <w:b w:val="0"/>
           <w:bCs w:val="0"/>
         </w:rPr>
-        <w:t>GIN mode tested with the ICEMDDN CAD package on a CDC Cyber 175 emulator</w:t>
-      </w:r>
-    </w:p>
-    <w:p>
-      <w:pPr>
-        <w:pStyle w:val="body"/>
-        <w:rPr>
-          <w:rStyle w:val="Strong"/>
+        <w:t xml:space="preserve">Tested with </w:t>
+      </w:r>
+      <w:proofErr w:type="spellStart"/>
+      <w:r>
+        <w:rPr>
+          <w:rStyle w:val="Fett"/>
+          <w:b w:val="0"/>
+          <w:bCs w:val="0"/>
+        </w:rPr>
+        <w:t>SimH</w:t>
+      </w:r>
+      <w:proofErr w:type="spellEnd"/>
+      <w:r>
+        <w:rPr>
+          <w:rStyle w:val="Fett"/>
+          <w:b w:val="0"/>
+          <w:bCs w:val="0"/>
+        </w:rPr>
+        <w:t xml:space="preserve">, PiDP-11, PDP-11/93, </w:t>
+      </w:r>
+      <w:proofErr w:type="spellStart"/>
+      <w:r>
+        <w:rPr>
+          <w:rStyle w:val="Fett"/>
+          <w:b w:val="0"/>
+          <w:bCs w:val="0"/>
+        </w:rPr>
+        <w:t>VAXstation</w:t>
+      </w:r>
+      <w:proofErr w:type="spellEnd"/>
+      <w:r>
+        <w:rPr>
+          <w:rStyle w:val="Fett"/>
+          <w:b w:val="0"/>
+          <w:bCs w:val="0"/>
+        </w:rPr>
+        <w:t xml:space="preserve"> 4000/90a, 2.11 BSD, RSX-11M+, PLOT10</w:t>
+      </w:r>
+    </w:p>
+    <w:p>
+      <w:pPr>
+        <w:pStyle w:val="body"/>
+        <w:rPr>
+          <w:rStyle w:val="Fett"/>
           <w:b w:val="0"/>
           <w:bCs w:val="0"/>
         </w:rPr>
@@ -2644,10 +2628,42 @@
           <w:ilvl w:val="0"/>
           <w:numId w:val="2"/>
         </w:numPr>
-      </w:pPr>
-      <w:r>
-        <w:rPr>
-          <w:rStyle w:val="Strong"/>
+        <w:rPr>
+          <w:rStyle w:val="Fett"/>
+          <w:b w:val="0"/>
+          <w:bCs w:val="0"/>
+        </w:rPr>
+      </w:pPr>
+      <w:r>
+        <w:rPr>
+          <w:rStyle w:val="Fett"/>
+          <w:b w:val="0"/>
+          <w:bCs w:val="0"/>
+        </w:rPr>
+        <w:t>GIN mode tested with the ICEMDDN CAD package on a CDC Cyber 175 emulator</w:t>
+      </w:r>
+    </w:p>
+    <w:p>
+      <w:pPr>
+        <w:pStyle w:val="body"/>
+        <w:rPr>
+          <w:rStyle w:val="Fett"/>
+          <w:b w:val="0"/>
+          <w:bCs w:val="0"/>
+        </w:rPr>
+      </w:pPr>
+    </w:p>
+    <w:p>
+      <w:pPr>
+        <w:pStyle w:val="body"/>
+        <w:numPr>
+          <w:ilvl w:val="0"/>
+          <w:numId w:val="2"/>
+        </w:numPr>
+      </w:pPr>
+      <w:r>
+        <w:rPr>
+          <w:rStyle w:val="Fett"/>
           <w:b w:val="0"/>
           <w:bCs w:val="0"/>
         </w:rPr>
@@ -2663,19 +2679,19 @@
     </w:p>
     <w:p>
       <w:pPr>
-        <w:pStyle w:val="Heading2"/>
+        <w:pStyle w:val="berschrift2"/>
       </w:pPr>
       <w:bookmarkStart w:id="3" w:name="_Toc227814926"/>
       <w:r>
         <w:rPr>
-          <w:rStyle w:val="Strong"/>
+          <w:rStyle w:val="Fett"/>
           <w:b/>
         </w:rPr>
         <w:t xml:space="preserve">Installation and </w:t>
       </w:r>
       <w:r>
         <w:rPr>
-          <w:rStyle w:val="Strong"/>
+          <w:rStyle w:val="Fett"/>
           <w:b/>
           <w:bCs/>
         </w:rPr>
@@ -2683,7 +2699,7 @@
       </w:r>
       <w:r>
         <w:rPr>
-          <w:rStyle w:val="Strong"/>
+          <w:rStyle w:val="Fett"/>
           <w:b/>
         </w:rPr>
         <w:t xml:space="preserve"> tests</w:t>
@@ -2961,6 +2977,32 @@
         <w:pStyle w:val="body"/>
       </w:pPr>
       <w:r>
+        <w:t>Start the program with</w:t>
+      </w:r>
+    </w:p>
+    <w:p>
+      <w:pPr>
+        <w:pStyle w:val="body"/>
+      </w:pPr>
+    </w:p>
+    <w:p>
+      <w:pPr>
+        <w:pStyle w:val="Code"/>
+      </w:pPr>
+      <w:r>
+        <w:t>Tek4010</w:t>
+      </w:r>
+    </w:p>
+    <w:p>
+      <w:pPr>
+        <w:pStyle w:val="body"/>
+      </w:pPr>
+    </w:p>
+    <w:p>
+      <w:pPr>
+        <w:pStyle w:val="body"/>
+      </w:pPr>
+      <w:r>
         <w:t xml:space="preserve">There is a file </w:t>
       </w:r>
       <w:proofErr w:type="spellStart"/>
@@ -2968,12 +3010,18 @@
         <w:rPr>
           <w:shd w:val="clear" w:color="auto" w:fill="F2F2F2" w:themeFill="background1" w:themeFillShade="F2"/>
         </w:rPr>
-        <w:t>dodekagon.p</w:t>
+        <w:t>test</w:t>
       </w:r>
       <w:r>
         <w:rPr>
           <w:shd w:val="clear" w:color="auto" w:fill="F2F2F2" w:themeFill="background1" w:themeFillShade="F2"/>
         </w:rPr>
+        <w:t>.p</w:t>
+      </w:r>
+      <w:r>
+        <w:rPr>
+          <w:shd w:val="clear" w:color="auto" w:fill="F2F2F2" w:themeFill="background1" w:themeFillShade="F2"/>
+        </w:rPr>
         <w:t>l</w:t>
       </w:r>
       <w:r>
@@ -2990,29 +3038,107 @@
         <w:t xml:space="preserve"> </w:t>
       </w:r>
       <w:r>
-        <w:t xml:space="preserve">in the repo, which you can use to test the tek4010 emulator. </w:t>
+        <w:t>in the repo, which you can use to test the tek4010 emulator</w:t>
+      </w:r>
+      <w:r>
+        <w:t xml:space="preserve">. </w:t>
+      </w:r>
+    </w:p>
+    <w:p>
+      <w:pPr>
+        <w:pStyle w:val="body"/>
+      </w:pPr>
+    </w:p>
+    <w:p>
+      <w:pPr>
+        <w:pStyle w:val="Code"/>
+      </w:pPr>
+      <w:r>
+        <w:t xml:space="preserve">cat </w:t>
       </w:r>
       <w:proofErr w:type="spellStart"/>
       <w:r>
-        <w:rPr>
-          <w:shd w:val="clear" w:color="auto" w:fill="F2F2F2" w:themeFill="background1" w:themeFillShade="F2"/>
-        </w:rPr>
-        <w:t>dodekagon.plt</w:t>
+        <w:t>test</w:t>
+      </w:r>
+      <w:r>
+        <w:t>.plt</w:t>
       </w:r>
       <w:proofErr w:type="spellEnd"/>
-      <w:r>
-        <w:t xml:space="preserve"> was produced in 2.11 BSD using my program </w:t>
+    </w:p>
+    <w:p>
+      <w:pPr>
+        <w:pStyle w:val="body"/>
+      </w:pPr>
+    </w:p>
+    <w:p>
+      <w:pPr>
+        <w:pStyle w:val="body"/>
+      </w:pPr>
+      <w:r>
+        <w:t>If tek4010 screen refreshes are too slow or choppy in this test, use the -fast option in all calls to tek4010</w:t>
+      </w:r>
+    </w:p>
+    <w:p>
+      <w:pPr>
+        <w:pStyle w:val="body"/>
+      </w:pPr>
+    </w:p>
+    <w:p>
+      <w:pPr>
+        <w:pStyle w:val="Code"/>
+      </w:pPr>
+      <w:r>
+        <w:t>tek4010 -fast</w:t>
+      </w:r>
+    </w:p>
+    <w:p>
+      <w:pPr>
+        <w:pStyle w:val="body"/>
+      </w:pPr>
+    </w:p>
+    <w:p>
+      <w:pPr>
+        <w:pStyle w:val="body"/>
+      </w:pPr>
+      <w:r>
+        <w:t xml:space="preserve">Or, for </w:t>
+      </w:r>
+      <w:proofErr w:type="gramStart"/>
+      <w:r>
+        <w:t>a</w:t>
+      </w:r>
+      <w:proofErr w:type="gramEnd"/>
+      <w:r>
+        <w:t xml:space="preserve"> ARDS display example type</w:t>
+      </w:r>
+    </w:p>
+    <w:p>
+      <w:pPr>
+        <w:pStyle w:val="body"/>
+      </w:pPr>
+    </w:p>
+    <w:p>
+      <w:pPr>
+        <w:pStyle w:val="Code"/>
+      </w:pPr>
+      <w:r>
+        <w:t>tek4010 -ARDS</w:t>
+      </w:r>
+    </w:p>
+    <w:p>
+      <w:pPr>
+        <w:pStyle w:val="Code"/>
+      </w:pPr>
+      <w:r>
+        <w:t xml:space="preserve">cat </w:t>
       </w:r>
       <w:proofErr w:type="spellStart"/>
       <w:r>
-        <w:rPr>
-          <w:shd w:val="clear" w:color="auto" w:fill="F2F2F2" w:themeFill="background1" w:themeFillShade="F2"/>
-        </w:rPr>
-        <w:t>dodekagon</w:t>
+        <w:t>ardsfiles</w:t>
       </w:r>
       <w:proofErr w:type="spellEnd"/>
       <w:r>
-        <w:t>. Type</w:t>
+        <w:t>/trek.pic</w:t>
       </w:r>
     </w:p>
     <w:p>
@@ -3024,150 +3150,6 @@
       <w:pPr>
         <w:pStyle w:val="Code"/>
       </w:pPr>
-      <w:r>
-        <w:t>tek4010 -</w:t>
-      </w:r>
-      <w:proofErr w:type="spellStart"/>
-      <w:r>
-        <w:t>noexit</w:t>
-      </w:r>
-      <w:proofErr w:type="spellEnd"/>
-      <w:r>
-        <w:t xml:space="preserve"> cat </w:t>
-      </w:r>
-      <w:proofErr w:type="spellStart"/>
-      <w:r>
-        <w:t>dodekagon.plt</w:t>
-      </w:r>
-      <w:proofErr w:type="spellEnd"/>
-    </w:p>
-    <w:p>
-      <w:pPr>
-        <w:pStyle w:val="body"/>
-      </w:pPr>
-    </w:p>
-    <w:p>
-      <w:pPr>
-        <w:pStyle w:val="body"/>
-      </w:pPr>
-      <w:r>
-        <w:t>If tek4010 screen refreshes are too slow or choppy in this test, use the -fast option in all calls to tek4010</w:t>
-      </w:r>
-    </w:p>
-    <w:p>
-      <w:pPr>
-        <w:pStyle w:val="body"/>
-      </w:pPr>
-    </w:p>
-    <w:p>
-      <w:pPr>
-        <w:pStyle w:val="Code"/>
-      </w:pPr>
-      <w:r>
-        <w:t>tek4010 -</w:t>
-      </w:r>
-      <w:proofErr w:type="spellStart"/>
-      <w:r>
-        <w:t>noexit</w:t>
-      </w:r>
-      <w:proofErr w:type="spellEnd"/>
-      <w:r>
-        <w:t xml:space="preserve"> -fast cat </w:t>
-      </w:r>
-      <w:proofErr w:type="spellStart"/>
-      <w:r>
-        <w:t>dodekagon.plt</w:t>
-      </w:r>
-      <w:proofErr w:type="spellEnd"/>
-    </w:p>
-    <w:p>
-      <w:pPr>
-        <w:pStyle w:val="body"/>
-      </w:pPr>
-    </w:p>
-    <w:p>
-      <w:pPr>
-        <w:pStyle w:val="body"/>
-      </w:pPr>
-      <w:r>
-        <w:t xml:space="preserve">Or, for </w:t>
-      </w:r>
-      <w:proofErr w:type="gramStart"/>
-      <w:r>
-        <w:t>a</w:t>
-      </w:r>
-      <w:proofErr w:type="gramEnd"/>
-      <w:r>
-        <w:t xml:space="preserve"> ARDS display example type</w:t>
-      </w:r>
-    </w:p>
-    <w:p>
-      <w:pPr>
-        <w:pStyle w:val="body"/>
-      </w:pPr>
-    </w:p>
-    <w:p>
-      <w:pPr>
-        <w:pStyle w:val="Code"/>
-      </w:pPr>
-      <w:r>
-        <w:t>tek4010 -</w:t>
-      </w:r>
-      <w:proofErr w:type="spellStart"/>
-      <w:r>
-        <w:t>noexit</w:t>
-      </w:r>
-      <w:proofErr w:type="spellEnd"/>
-      <w:r>
-        <w:t xml:space="preserve"> -ARDS cat </w:t>
-      </w:r>
-      <w:proofErr w:type="spellStart"/>
-      <w:r>
-        <w:t>ardsfiles</w:t>
-      </w:r>
-      <w:proofErr w:type="spellEnd"/>
-      <w:r>
-        <w:t>/trek.pic</w:t>
-      </w:r>
-    </w:p>
-    <w:p>
-      <w:pPr>
-        <w:pStyle w:val="body"/>
-      </w:pPr>
-    </w:p>
-    <w:p>
-      <w:pPr>
-        <w:pStyle w:val="body"/>
-      </w:pPr>
-      <w:r>
-        <w:t>If you want to test text output, type for example</w:t>
-      </w:r>
-    </w:p>
-    <w:p>
-      <w:pPr>
-        <w:pStyle w:val="body"/>
-      </w:pPr>
-    </w:p>
-    <w:p>
-      <w:pPr>
-        <w:pStyle w:val="Code"/>
-      </w:pPr>
-      <w:r>
-        <w:t>tek401 -</w:t>
-      </w:r>
-      <w:proofErr w:type="spellStart"/>
-      <w:r>
-        <w:t>noexit</w:t>
-      </w:r>
-      <w:proofErr w:type="spellEnd"/>
-      <w:r>
-        <w:t xml:space="preserve"> head -n 32 </w:t>
-      </w:r>
-      <w:proofErr w:type="spellStart"/>
-      <w:r>
-        <w:t>src</w:t>
-      </w:r>
-      <w:proofErr w:type="spellEnd"/>
       <w:r>
         <w:t>/tek4010.c</w:t>
       </w:r>
@@ -3506,7 +3488,7 @@
       <w:pPr>
         <w:pStyle w:val="body"/>
         <w:rPr>
-          <w:rStyle w:val="Strong"/>
+          <w:rStyle w:val="Fett"/>
           <w:b w:val="0"/>
           <w:bCs w:val="0"/>
         </w:rPr>
@@ -3514,9 +3496,9 @@
     </w:p>
     <w:p>
       <w:pPr>
-        <w:pStyle w:val="Heading1"/>
-        <w:rPr>
-          <w:rStyle w:val="Strong"/>
+        <w:pStyle w:val="berschrift1"/>
+        <w:rPr>
+          <w:rStyle w:val="Fett"/>
           <w:b/>
           <w:bCs/>
         </w:rPr>
@@ -3524,7 +3506,7 @@
       <w:bookmarkStart w:id="4" w:name="_Toc227814927"/>
       <w:r>
         <w:rPr>
-          <w:rStyle w:val="Strong"/>
+          <w:rStyle w:val="Fett"/>
           <w:b/>
           <w:bCs/>
         </w:rPr>
@@ -3535,13 +3517,13 @@
     </w:p>
     <w:p>
       <w:pPr>
-        <w:pStyle w:val="Heading2"/>
+        <w:pStyle w:val="berschrift2"/>
         <w:ind w:right="569"/>
       </w:pPr>
       <w:bookmarkStart w:id="5" w:name="_Toc227814928"/>
       <w:r>
         <w:rPr>
-          <w:rStyle w:val="Strong"/>
+          <w:rStyle w:val="Fett"/>
           <w:b/>
         </w:rPr>
         <w:t>Log directly into a remote historical Unix operating system</w:t>
@@ -4150,7 +4132,7 @@
       <w:pPr>
         <w:pStyle w:val="body"/>
         <w:rPr>
-          <w:rStyle w:val="Strong"/>
+          <w:rStyle w:val="Fett"/>
           <w:b w:val="0"/>
           <w:bCs w:val="0"/>
         </w:rPr>
@@ -4170,7 +4152,7 @@
       </w:pPr>
       <w:r>
         <w:rPr>
-          <w:rStyle w:val="Strong"/>
+          <w:rStyle w:val="Fett"/>
         </w:rPr>
         <w:lastRenderedPageBreak/>
         <w:t xml:space="preserve">Log into the system running </w:t>
@@ -4178,14 +4160,14 @@
       <w:proofErr w:type="spellStart"/>
       <w:r>
         <w:rPr>
-          <w:rStyle w:val="Strong"/>
+          <w:rStyle w:val="Fett"/>
         </w:rPr>
         <w:t>simh</w:t>
       </w:r>
       <w:proofErr w:type="spellEnd"/>
       <w:r>
         <w:rPr>
-          <w:rStyle w:val="Strong"/>
+          <w:rStyle w:val="Fett"/>
         </w:rPr>
         <w:t xml:space="preserve"> (same or different Raspberry Pi)</w:t>
       </w:r>
@@ -4600,12 +4582,12 @@
     </w:p>
     <w:p>
       <w:pPr>
-        <w:pStyle w:val="Heading2"/>
+        <w:pStyle w:val="berschrift2"/>
       </w:pPr>
       <w:bookmarkStart w:id="6" w:name="_Toc227814929"/>
       <w:r>
         <w:rPr>
-          <w:rStyle w:val="Strong"/>
+          <w:rStyle w:val="Fett"/>
           <w:b/>
         </w:rPr>
         <w:t>Log into PiDP-11 running on the same Raspberry Pi, using the console</w:t>
@@ -5038,12 +5020,12 @@
     </w:p>
     <w:p>
       <w:pPr>
-        <w:pStyle w:val="Heading1"/>
+        <w:pStyle w:val="berschrift1"/>
       </w:pPr>
       <w:bookmarkStart w:id="7" w:name="_Toc227814930"/>
       <w:r>
         <w:rPr>
-          <w:rStyle w:val="Strong"/>
+          <w:rStyle w:val="Fett"/>
           <w:b/>
           <w:bCs/>
         </w:rPr>
@@ -5052,7 +5034,7 @@
       </w:r>
       <w:r>
         <w:rPr>
-          <w:rStyle w:val="Strong"/>
+          <w:rStyle w:val="Fett"/>
           <w:b/>
           <w:bCs/>
         </w:rPr>
@@ -5062,13 +5044,13 @@
     </w:p>
     <w:p>
       <w:pPr>
-        <w:pStyle w:val="Heading2"/>
+        <w:pStyle w:val="berschrift2"/>
         <w:ind w:right="569"/>
       </w:pPr>
       <w:bookmarkStart w:id="8" w:name="_Toc227814931"/>
       <w:r>
         <w:rPr>
-          <w:rStyle w:val="Strong"/>
+          <w:rStyle w:val="Fett"/>
           <w:b/>
         </w:rPr>
         <w:t>Using tek4010 with a serial link</w:t>
@@ -5339,7 +5321,7 @@
       <w:pPr>
         <w:pStyle w:val="body"/>
         <w:rPr>
-          <w:rStyle w:val="Strong"/>
+          <w:rStyle w:val="Fett"/>
           <w:b w:val="0"/>
           <w:bCs w:val="0"/>
         </w:rPr>
@@ -5354,7 +5336,7 @@
       </w:r>
       <w:r>
         <w:rPr>
-          <w:rStyle w:val="Strong"/>
+          <w:rStyle w:val="Fett"/>
           <w:b w:val="0"/>
           <w:bCs w:val="0"/>
         </w:rPr>
@@ -5364,7 +5346,7 @@
       <w:proofErr w:type="gramEnd"/>
       <w:r>
         <w:rPr>
-          <w:rStyle w:val="Strong"/>
+          <w:rStyle w:val="Fett"/>
           <w:b w:val="0"/>
           <w:bCs w:val="0"/>
         </w:rPr>
@@ -5372,7 +5354,7 @@
       </w:r>
       <w:r>
         <w:rPr>
-          <w:rStyle w:val="Strong"/>
+          <w:rStyle w:val="Fett"/>
           <w:b w:val="0"/>
           <w:bCs w:val="0"/>
         </w:rPr>
@@ -5386,7 +5368,7 @@
     </w:p>
     <w:p>
       <w:pPr>
-        <w:pStyle w:val="Heading2"/>
+        <w:pStyle w:val="berschrift2"/>
       </w:pPr>
       <w:bookmarkStart w:id="9" w:name="_Toc227814932"/>
       <w:r>
@@ -5490,12 +5472,12 @@
     </w:p>
     <w:p>
       <w:pPr>
-        <w:pStyle w:val="Heading2"/>
+        <w:pStyle w:val="berschrift2"/>
       </w:pPr>
       <w:bookmarkStart w:id="10" w:name="_Toc227814933"/>
       <w:r>
         <w:rPr>
-          <w:rStyle w:val="Strong"/>
+          <w:rStyle w:val="Fett"/>
           <w:b/>
           <w:bCs/>
         </w:rPr>
@@ -5523,9 +5505,9 @@
     </w:p>
     <w:p>
       <w:pPr>
-        <w:pStyle w:val="Heading2"/>
-        <w:rPr>
-          <w:rStyle w:val="Strong"/>
+        <w:pStyle w:val="berschrift2"/>
+        <w:rPr>
+          <w:rStyle w:val="Fett"/>
           <w:b/>
           <w:bCs/>
         </w:rPr>
@@ -5533,7 +5515,7 @@
       <w:bookmarkStart w:id="11" w:name="_Toc227814934"/>
       <w:r>
         <w:rPr>
-          <w:rStyle w:val="Strong"/>
+          <w:rStyle w:val="Fett"/>
           <w:b/>
           <w:bCs/>
         </w:rPr>
@@ -6122,9 +6104,9 @@
     </w:p>
     <w:p>
       <w:pPr>
-        <w:pStyle w:val="Heading1"/>
-        <w:rPr>
-          <w:rStyle w:val="Strong"/>
+        <w:pStyle w:val="berschrift1"/>
+        <w:rPr>
+          <w:rStyle w:val="Fett"/>
           <w:b/>
           <w:bCs/>
         </w:rPr>
@@ -6132,7 +6114,7 @@
       <w:bookmarkStart w:id="12" w:name="_Toc227814935"/>
       <w:r>
         <w:rPr>
-          <w:rStyle w:val="Strong"/>
+          <w:rStyle w:val="Fett"/>
           <w:b/>
           <w:bCs/>
         </w:rPr>
@@ -6143,16 +6125,16 @@
     </w:p>
     <w:p>
       <w:pPr>
-        <w:pStyle w:val="Heading2"/>
-        <w:rPr>
-          <w:rStyle w:val="Strong"/>
+        <w:pStyle w:val="berschrift2"/>
+        <w:rPr>
+          <w:rStyle w:val="Fett"/>
           <w:b/>
         </w:rPr>
       </w:pPr>
       <w:bookmarkStart w:id="13" w:name="_Toc227814936"/>
       <w:r>
         <w:rPr>
-          <w:rStyle w:val="Strong"/>
+          <w:rStyle w:val="Fett"/>
           <w:b/>
         </w:rPr>
         <w:t>APL mode</w:t>
@@ -6659,13 +6641,13 @@
     </w:p>
     <w:p>
       <w:pPr>
-        <w:pStyle w:val="Heading2"/>
+        <w:pStyle w:val="berschrift2"/>
         <w:ind w:right="569"/>
       </w:pPr>
       <w:bookmarkStart w:id="14" w:name="_Toc227814937"/>
       <w:r>
         <w:rPr>
-          <w:rStyle w:val="Strong"/>
+          <w:rStyle w:val="Fett"/>
           <w:b/>
         </w:rPr>
         <w:lastRenderedPageBreak/>
@@ -6677,13 +6659,13 @@
       <w:pPr>
         <w:pStyle w:val="body"/>
         <w:rPr>
-          <w:rStyle w:val="Strong"/>
-          <w:b w:val="0"/>
-        </w:rPr>
-      </w:pPr>
-      <w:r>
-        <w:rPr>
-          <w:rStyle w:val="Strong"/>
+          <w:rStyle w:val="Fett"/>
+          <w:b w:val="0"/>
+        </w:rPr>
+      </w:pPr>
+      <w:r>
+        <w:rPr>
+          <w:rStyle w:val="Fett"/>
           <w:b w:val="0"/>
         </w:rPr>
         <w:t>The tek4010 emulator creates a graphics window with a resolution of 1024 × 780 points. This corresponds to the display size of the Tektronix 4010 and the Tektronix 4014 without the enhanced graphics module.</w:t>
@@ -6693,22 +6675,22 @@
       <w:pPr>
         <w:pStyle w:val="body"/>
         <w:rPr>
-          <w:rStyle w:val="Strong"/>
-          <w:b w:val="0"/>
-        </w:rPr>
-      </w:pPr>
-    </w:p>
-    <w:p>
-      <w:pPr>
-        <w:pStyle w:val="body"/>
-        <w:rPr>
-          <w:rStyle w:val="Strong"/>
-          <w:b w:val="0"/>
-        </w:rPr>
-      </w:pPr>
-      <w:r>
-        <w:rPr>
-          <w:rStyle w:val="Strong"/>
+          <w:rStyle w:val="Fett"/>
+          <w:b w:val="0"/>
+        </w:rPr>
+      </w:pPr>
+    </w:p>
+    <w:p>
+      <w:pPr>
+        <w:pStyle w:val="body"/>
+        <w:rPr>
+          <w:rStyle w:val="Fett"/>
+          <w:b w:val="0"/>
+        </w:rPr>
+      </w:pPr>
+      <w:r>
+        <w:rPr>
+          <w:rStyle w:val="Fett"/>
           <w:b w:val="0"/>
         </w:rPr>
         <w:t>Modern systems such as the Raspberry Pi can handle sufficiently high refresh rates at this resolution.</w:t>
@@ -6718,22 +6700,22 @@
       <w:pPr>
         <w:pStyle w:val="body"/>
         <w:rPr>
-          <w:rStyle w:val="Strong"/>
-          <w:b w:val="0"/>
-        </w:rPr>
-      </w:pPr>
-    </w:p>
-    <w:p>
-      <w:pPr>
-        <w:pStyle w:val="body"/>
-        <w:rPr>
-          <w:rStyle w:val="Strong"/>
-          <w:b w:val="0"/>
-        </w:rPr>
-      </w:pPr>
-      <w:r>
-        <w:rPr>
-          <w:rStyle w:val="Strong"/>
+          <w:rStyle w:val="Fett"/>
+          <w:b w:val="0"/>
+        </w:rPr>
+      </w:pPr>
+    </w:p>
+    <w:p>
+      <w:pPr>
+        <w:pStyle w:val="body"/>
+        <w:rPr>
+          <w:rStyle w:val="Fett"/>
+          <w:b w:val="0"/>
+        </w:rPr>
+      </w:pPr>
+      <w:r>
+        <w:rPr>
+          <w:rStyle w:val="Fett"/>
           <w:b w:val="0"/>
         </w:rPr>
         <w:t>The emulator also supports Tektronix 4014 graphics code with the enhanced graphics module. In this case, the full coordinate range is accepted, but the lowest two bits of each axis are not used, as on a 4014 without the enhanced graphics module.</w:t>
@@ -6743,22 +6725,22 @@
       <w:pPr>
         <w:pStyle w:val="body"/>
         <w:rPr>
-          <w:rStyle w:val="Strong"/>
-          <w:b w:val="0"/>
-        </w:rPr>
-      </w:pPr>
-    </w:p>
-    <w:p>
-      <w:pPr>
-        <w:pStyle w:val="body"/>
-        <w:rPr>
-          <w:rStyle w:val="Strong"/>
-          <w:b w:val="0"/>
-        </w:rPr>
-      </w:pPr>
-      <w:r>
-        <w:rPr>
-          <w:rStyle w:val="Strong"/>
+          <w:rStyle w:val="Fett"/>
+          <w:b w:val="0"/>
+        </w:rPr>
+      </w:pPr>
+    </w:p>
+    <w:p>
+      <w:pPr>
+        <w:pStyle w:val="body"/>
+        <w:rPr>
+          <w:rStyle w:val="Fett"/>
+          <w:b w:val="0"/>
+        </w:rPr>
+      </w:pPr>
+      <w:r>
+        <w:rPr>
+          <w:rStyle w:val="Fett"/>
           <w:b w:val="0"/>
         </w:rPr>
         <w:t>When started with the -full or -</w:t>
@@ -6766,7 +6748,7 @@
       <w:proofErr w:type="spellStart"/>
       <w:r>
         <w:rPr>
-          <w:rStyle w:val="Strong"/>
+          <w:rStyle w:val="Fett"/>
           <w:b w:val="0"/>
         </w:rPr>
         <w:t>fullv</w:t>
@@ -6774,7 +6756,7 @@
       <w:proofErr w:type="spellEnd"/>
       <w:r>
         <w:rPr>
-          <w:rStyle w:val="Strong"/>
+          <w:rStyle w:val="Fett"/>
           <w:b w:val="0"/>
         </w:rPr>
         <w:t xml:space="preserve"> options, tek4010 uses the full 4K resolution of the 4014 with the enhanced graphics module, scaled to the actual window size.</w:t>
@@ -6784,22 +6766,22 @@
       <w:pPr>
         <w:pStyle w:val="body"/>
         <w:rPr>
-          <w:rStyle w:val="Strong"/>
-          <w:b w:val="0"/>
-        </w:rPr>
-      </w:pPr>
-    </w:p>
-    <w:p>
-      <w:pPr>
-        <w:pStyle w:val="body"/>
-        <w:rPr>
-          <w:rStyle w:val="Strong"/>
-          <w:b w:val="0"/>
-        </w:rPr>
-      </w:pPr>
-      <w:r>
-        <w:rPr>
-          <w:rStyle w:val="Strong"/>
+          <w:rStyle w:val="Fett"/>
+          <w:b w:val="0"/>
+        </w:rPr>
+      </w:pPr>
+    </w:p>
+    <w:p>
+      <w:pPr>
+        <w:pStyle w:val="body"/>
+        <w:rPr>
+          <w:rStyle w:val="Fett"/>
+          <w:b w:val="0"/>
+        </w:rPr>
+      </w:pPr>
+      <w:r>
+        <w:rPr>
+          <w:rStyle w:val="Fett"/>
           <w:b w:val="0"/>
         </w:rPr>
         <w:t>Use Ctrl + Q to close the tek4010 window.</w:t>
@@ -6809,22 +6791,22 @@
       <w:pPr>
         <w:pStyle w:val="body"/>
         <w:rPr>
-          <w:rStyle w:val="Strong"/>
-          <w:b w:val="0"/>
-        </w:rPr>
-      </w:pPr>
-    </w:p>
-    <w:p>
-      <w:pPr>
-        <w:pStyle w:val="body"/>
-        <w:rPr>
-          <w:rStyle w:val="Strong"/>
-          <w:b w:val="0"/>
-        </w:rPr>
-      </w:pPr>
-      <w:r>
-        <w:rPr>
-          <w:rStyle w:val="Strong"/>
+          <w:rStyle w:val="Fett"/>
+          <w:b w:val="0"/>
+        </w:rPr>
+      </w:pPr>
+    </w:p>
+    <w:p>
+      <w:pPr>
+        <w:pStyle w:val="body"/>
+        <w:rPr>
+          <w:rStyle w:val="Fett"/>
+          <w:b w:val="0"/>
+        </w:rPr>
+      </w:pPr>
+      <w:r>
+        <w:rPr>
+          <w:rStyle w:val="Fett"/>
           <w:b w:val="0"/>
         </w:rPr>
         <w:t xml:space="preserve">The BORDER constant in </w:t>
@@ -6832,7 +6814,7 @@
       <w:proofErr w:type="spellStart"/>
       <w:r>
         <w:rPr>
-          <w:rStyle w:val="Strong"/>
+          <w:rStyle w:val="Fett"/>
           <w:b w:val="0"/>
         </w:rPr>
         <w:t>main.h</w:t>
@@ -6840,7 +6822,7 @@
       <w:proofErr w:type="spellEnd"/>
       <w:r>
         <w:rPr>
-          <w:rStyle w:val="Strong"/>
+          <w:rStyle w:val="Fett"/>
           <w:b w:val="0"/>
         </w:rPr>
         <w:t xml:space="preserve"> can be adjusted to control the space reserved for window decorations and desktop panels when using the -</w:t>
@@ -6848,7 +6830,7 @@
       <w:proofErr w:type="spellStart"/>
       <w:r>
         <w:rPr>
-          <w:rStyle w:val="Strong"/>
+          <w:rStyle w:val="Fett"/>
           <w:b w:val="0"/>
         </w:rPr>
         <w:t>fullv</w:t>
@@ -6856,7 +6838,7 @@
       <w:proofErr w:type="spellEnd"/>
       <w:r>
         <w:rPr>
-          <w:rStyle w:val="Strong"/>
+          <w:rStyle w:val="Fett"/>
           <w:b w:val="0"/>
         </w:rPr>
         <w:t xml:space="preserve"> option.</w:t>
@@ -6864,9 +6846,9 @@
     </w:p>
     <w:p>
       <w:pPr>
-        <w:pStyle w:val="Heading1"/>
-        <w:rPr>
-          <w:rStyle w:val="Strong"/>
+        <w:pStyle w:val="berschrift1"/>
+        <w:rPr>
+          <w:rStyle w:val="Fett"/>
           <w:b/>
           <w:bCs/>
         </w:rPr>
@@ -6874,7 +6856,7 @@
       <w:bookmarkStart w:id="15" w:name="_Toc227814938"/>
       <w:r>
         <w:rPr>
-          <w:rStyle w:val="Strong"/>
+          <w:rStyle w:val="Fett"/>
           <w:b/>
           <w:bCs/>
         </w:rPr>
@@ -6885,13 +6867,13 @@
     </w:p>
     <w:p>
       <w:pPr>
-        <w:pStyle w:val="Heading2"/>
+        <w:pStyle w:val="berschrift2"/>
         <w:ind w:right="569"/>
       </w:pPr>
       <w:bookmarkStart w:id="16" w:name="_Toc227814939"/>
       <w:r>
         <w:rPr>
-          <w:rStyle w:val="Strong"/>
+          <w:rStyle w:val="Fett"/>
           <w:b/>
         </w:rPr>
         <w:t>Manuals</w:t>
@@ -6902,34 +6884,34 @@
       <w:pPr>
         <w:pStyle w:val="body"/>
         <w:rPr>
-          <w:rStyle w:val="Strong"/>
-          <w:b w:val="0"/>
-        </w:rPr>
-      </w:pPr>
-      <w:r>
-        <w:rPr>
-          <w:rStyle w:val="Strong"/>
+          <w:rStyle w:val="Fett"/>
+          <w:b w:val="0"/>
+        </w:rPr>
+      </w:pPr>
+      <w:r>
+        <w:rPr>
+          <w:rStyle w:val="Fett"/>
           <w:b w:val="0"/>
         </w:rPr>
         <w:t>Documentation for the original Tektronix terminals is available in the “manuals” folder.</w:t>
       </w:r>
       <w:r>
         <w:rPr>
-          <w:rStyle w:val="Strong"/>
+          <w:rStyle w:val="Fett"/>
           <w:b w:val="0"/>
         </w:rPr>
         <w:t xml:space="preserve"> </w:t>
       </w:r>
       <w:r>
         <w:rPr>
-          <w:rStyle w:val="Strong"/>
+          <w:rStyle w:val="Fett"/>
           <w:b w:val="0"/>
         </w:rPr>
         <w:t xml:space="preserve">This manual for the tek4010 emulator is provided in the </w:t>
       </w:r>
       <w:r>
         <w:rPr>
-          <w:rStyle w:val="Strong"/>
+          <w:rStyle w:val="Fett"/>
           <w:b w:val="0"/>
           <w:i/>
           <w:iCs/>
@@ -6938,7 +6920,7 @@
       </w:r>
       <w:r>
         <w:rPr>
-          <w:rStyle w:val="Strong"/>
+          <w:rStyle w:val="Fett"/>
           <w:b w:val="0"/>
         </w:rPr>
         <w:t xml:space="preserve"> directory as Manual.pdf.</w:t>
@@ -6948,19 +6930,19 @@
       <w:pPr>
         <w:pStyle w:val="body"/>
         <w:rPr>
-          <w:rStyle w:val="Strong"/>
-          <w:b w:val="0"/>
-        </w:rPr>
-      </w:pPr>
-    </w:p>
-    <w:p>
-      <w:pPr>
-        <w:pStyle w:val="Heading2"/>
+          <w:rStyle w:val="Fett"/>
+          <w:b w:val="0"/>
+        </w:rPr>
+      </w:pPr>
+    </w:p>
+    <w:p>
+      <w:pPr>
+        <w:pStyle w:val="berschrift2"/>
       </w:pPr>
       <w:bookmarkStart w:id="17" w:name="_Toc227814940"/>
       <w:r>
         <w:rPr>
-          <w:rStyle w:val="Strong"/>
+          <w:rStyle w:val="Fett"/>
           <w:b/>
         </w:rPr>
         <w:t>Historically interesting facts about the ARDS terminal</w:t>
@@ -7037,7 +7019,7 @@
     </w:p>
     <w:p>
       <w:pPr>
-        <w:pStyle w:val="Heading2"/>
+        <w:pStyle w:val="berschrift2"/>
         <w:rPr>
           <w:bCs w:val="0"/>
         </w:rPr>
@@ -7045,7 +7027,7 @@
       <w:bookmarkStart w:id="18" w:name="_Toc227814941"/>
       <w:r>
         <w:rPr>
-          <w:rStyle w:val="Strong"/>
+          <w:rStyle w:val="Fett"/>
           <w:b/>
         </w:rPr>
         <w:t>Using other fonts</w:t>
@@ -7091,7 +7073,7 @@
     </w:p>
     <w:p>
       <w:pPr>
-        <w:pStyle w:val="Heading2"/>
+        <w:pStyle w:val="berschrift2"/>
         <w:ind w:right="569"/>
         <w:rPr>
           <w:bCs w:val="0"/>
@@ -7100,7 +7082,7 @@
       <w:bookmarkStart w:id="19" w:name="_Toc227814942"/>
       <w:r>
         <w:rPr>
-          <w:rStyle w:val="Strong"/>
+          <w:rStyle w:val="Fett"/>
           <w:b/>
         </w:rPr>
         <w:t>Making grayscale images for tek4010</w:t>
@@ -7228,13 +7210,13 @@
     </w:p>
     <w:p>
       <w:pPr>
-        <w:pStyle w:val="Heading2"/>
+        <w:pStyle w:val="berschrift2"/>
         <w:ind w:right="569"/>
       </w:pPr>
       <w:bookmarkStart w:id="20" w:name="_Toc227814943"/>
       <w:r>
         <w:rPr>
-          <w:rStyle w:val="Strong"/>
+          <w:rStyle w:val="Fett"/>
           <w:b/>
         </w:rPr>
         <w:lastRenderedPageBreak/>
@@ -7246,13 +7228,13 @@
       <w:pPr>
         <w:pStyle w:val="body"/>
         <w:rPr>
-          <w:rStyle w:val="Strong"/>
-          <w:b w:val="0"/>
-        </w:rPr>
-      </w:pPr>
-      <w:r>
-        <w:rPr>
-          <w:rStyle w:val="Strong"/>
+          <w:rStyle w:val="Fett"/>
+          <w:b w:val="0"/>
+        </w:rPr>
+      </w:pPr>
+      <w:r>
+        <w:rPr>
+          <w:rStyle w:val="Fett"/>
           <w:b w:val="0"/>
         </w:rPr>
         <w:t>On slower systems such as the Raspberry Pi 3, screen refreshes may be too slow and the display may appear choppy.</w:t>
@@ -7262,22 +7244,22 @@
       <w:pPr>
         <w:pStyle w:val="body"/>
         <w:rPr>
-          <w:rStyle w:val="Strong"/>
-          <w:b w:val="0"/>
-        </w:rPr>
-      </w:pPr>
-    </w:p>
-    <w:p>
-      <w:pPr>
-        <w:pStyle w:val="body"/>
-        <w:rPr>
-          <w:rStyle w:val="Strong"/>
-          <w:b w:val="0"/>
-        </w:rPr>
-      </w:pPr>
-      <w:r>
-        <w:rPr>
-          <w:rStyle w:val="Strong"/>
+          <w:rStyle w:val="Fett"/>
+          <w:b w:val="0"/>
+        </w:rPr>
+      </w:pPr>
+    </w:p>
+    <w:p>
+      <w:pPr>
+        <w:pStyle w:val="body"/>
+        <w:rPr>
+          <w:rStyle w:val="Fett"/>
+          <w:b w:val="0"/>
+        </w:rPr>
+      </w:pPr>
+      <w:r>
+        <w:rPr>
+          <w:rStyle w:val="Fett"/>
           <w:b w:val="0"/>
         </w:rPr>
         <w:t>In this case, start tek4010 with the -fast option to enable faster rendering without fading.</w:t>
@@ -7287,22 +7269,22 @@
       <w:pPr>
         <w:pStyle w:val="body"/>
         <w:rPr>
-          <w:rStyle w:val="Strong"/>
-          <w:b w:val="0"/>
-        </w:rPr>
-      </w:pPr>
-    </w:p>
-    <w:p>
-      <w:pPr>
-        <w:pStyle w:val="body"/>
-        <w:rPr>
-          <w:rStyle w:val="Strong"/>
-          <w:b w:val="0"/>
-        </w:rPr>
-      </w:pPr>
-      <w:r>
-        <w:rPr>
-          <w:rStyle w:val="Strong"/>
+          <w:rStyle w:val="Fett"/>
+          <w:b w:val="0"/>
+        </w:rPr>
+      </w:pPr>
+    </w:p>
+    <w:p>
+      <w:pPr>
+        <w:pStyle w:val="body"/>
+        <w:rPr>
+          <w:rStyle w:val="Fett"/>
+          <w:b w:val="0"/>
+        </w:rPr>
+      </w:pPr>
+      <w:r>
+        <w:rPr>
+          <w:rStyle w:val="Fett"/>
           <w:b w:val="0"/>
         </w:rPr>
         <w:t>The -fast option is automatically enabled for baud rates above 19200.</w:t>
@@ -7310,9 +7292,9 @@
     </w:p>
     <w:p>
       <w:pPr>
-        <w:pStyle w:val="Heading1"/>
-        <w:rPr>
-          <w:rStyle w:val="Strong"/>
+        <w:pStyle w:val="berschrift1"/>
+        <w:rPr>
+          <w:rStyle w:val="Fett"/>
           <w:b/>
           <w:bCs/>
         </w:rPr>
@@ -7320,7 +7302,7 @@
       <w:bookmarkStart w:id="21" w:name="_Toc227814944"/>
       <w:r>
         <w:rPr>
-          <w:rStyle w:val="Strong"/>
+          <w:rStyle w:val="Fett"/>
           <w:b/>
           <w:bCs/>
         </w:rPr>
@@ -7331,10 +7313,10 @@
     </w:p>
     <w:p>
       <w:pPr>
-        <w:pStyle w:val="Heading2"/>
+        <w:pStyle w:val="berschrift2"/>
         <w:ind w:right="569"/>
         <w:rPr>
-          <w:rStyle w:val="Strong"/>
+          <w:rStyle w:val="Fett"/>
           <w:b/>
           <w:bCs/>
         </w:rPr>
@@ -7342,7 +7324,7 @@
       <w:bookmarkStart w:id="22" w:name="_Toc227814945"/>
       <w:r>
         <w:rPr>
-          <w:rStyle w:val="Strong"/>
+          <w:rStyle w:val="Fett"/>
           <w:b/>
         </w:rPr>
         <w:t>Contributors</w:t>
@@ -7353,13 +7335,13 @@
       <w:pPr>
         <w:pStyle w:val="body"/>
         <w:rPr>
-          <w:rStyle w:val="Strong"/>
-          <w:b w:val="0"/>
-        </w:rPr>
-      </w:pPr>
-      <w:r>
-        <w:rPr>
-          <w:rStyle w:val="Strong"/>
+          <w:rStyle w:val="Fett"/>
+          <w:b w:val="0"/>
+        </w:rPr>
+      </w:pPr>
+      <w:r>
+        <w:rPr>
+          <w:rStyle w:val="Fett"/>
           <w:b w:val="0"/>
         </w:rPr>
         <w:t>The storage tube emulator and the Tektronix 4010/4014 decoder were written by René Richarz.</w:t>
@@ -7369,22 +7351,22 @@
       <w:pPr>
         <w:pStyle w:val="body"/>
         <w:rPr>
-          <w:rStyle w:val="Strong"/>
-          <w:b w:val="0"/>
-        </w:rPr>
-      </w:pPr>
-    </w:p>
-    <w:p>
-      <w:pPr>
-        <w:pStyle w:val="body"/>
-        <w:rPr>
-          <w:rStyle w:val="Strong"/>
-          <w:b w:val="0"/>
-        </w:rPr>
-      </w:pPr>
-      <w:r>
-        <w:rPr>
-          <w:rStyle w:val="Strong"/>
+          <w:rStyle w:val="Fett"/>
+          <w:b w:val="0"/>
+        </w:rPr>
+      </w:pPr>
+    </w:p>
+    <w:p>
+      <w:pPr>
+        <w:pStyle w:val="body"/>
+        <w:rPr>
+          <w:rStyle w:val="Fett"/>
+          <w:b w:val="0"/>
+        </w:rPr>
+      </w:pPr>
+      <w:r>
+        <w:rPr>
+          <w:rStyle w:val="Fett"/>
           <w:b w:val="0"/>
         </w:rPr>
         <w:t>The ARDS decoder was written by Lars Brinkhoff, who also provided historical documents and ARDS plot files.</w:t>
@@ -7394,22 +7376,22 @@
       <w:pPr>
         <w:pStyle w:val="body"/>
         <w:rPr>
-          <w:rStyle w:val="Strong"/>
-          <w:b w:val="0"/>
-        </w:rPr>
-      </w:pPr>
-    </w:p>
-    <w:p>
-      <w:pPr>
-        <w:pStyle w:val="body"/>
-        <w:rPr>
-          <w:rStyle w:val="Strong"/>
-          <w:b w:val="0"/>
-        </w:rPr>
-      </w:pPr>
-      <w:r>
-        <w:rPr>
-          <w:rStyle w:val="Strong"/>
+          <w:rStyle w:val="Fett"/>
+          <w:b w:val="0"/>
+        </w:rPr>
+      </w:pPr>
+    </w:p>
+    <w:p>
+      <w:pPr>
+        <w:pStyle w:val="body"/>
+        <w:rPr>
+          <w:rStyle w:val="Fett"/>
+          <w:b w:val="0"/>
+        </w:rPr>
+      </w:pPr>
+      <w:r>
+        <w:rPr>
+          <w:rStyle w:val="Fett"/>
           <w:b w:val="0"/>
         </w:rPr>
         <w:t>Teunis van Beelen developed the helper program rs232-console for serial connections.</w:t>
@@ -7419,22 +7401,22 @@
       <w:pPr>
         <w:pStyle w:val="body"/>
         <w:rPr>
-          <w:rStyle w:val="Strong"/>
-          <w:b w:val="0"/>
-        </w:rPr>
-      </w:pPr>
-    </w:p>
-    <w:p>
-      <w:pPr>
-        <w:pStyle w:val="body"/>
-        <w:rPr>
-          <w:rStyle w:val="Strong"/>
-          <w:b w:val="0"/>
-        </w:rPr>
-      </w:pPr>
-      <w:r>
-        <w:rPr>
-          <w:rStyle w:val="Strong"/>
+          <w:rStyle w:val="Fett"/>
+          <w:b w:val="0"/>
+        </w:rPr>
+      </w:pPr>
+    </w:p>
+    <w:p>
+      <w:pPr>
+        <w:pStyle w:val="body"/>
+        <w:rPr>
+          <w:rStyle w:val="Fett"/>
+          <w:b w:val="0"/>
+        </w:rPr>
+      </w:pPr>
+      <w:r>
+        <w:rPr>
+          <w:rStyle w:val="Fett"/>
           <w:b w:val="0"/>
         </w:rPr>
         <w:t>Dave Ault tested the serial link with a PDP-11/73.</w:t>
@@ -7444,22 +7426,22 @@
       <w:pPr>
         <w:pStyle w:val="body"/>
         <w:rPr>
-          <w:rStyle w:val="Strong"/>
-          <w:b w:val="0"/>
-        </w:rPr>
-      </w:pPr>
-    </w:p>
-    <w:p>
-      <w:pPr>
-        <w:pStyle w:val="body"/>
-        <w:rPr>
-          <w:rStyle w:val="Strong"/>
-          <w:b w:val="0"/>
-        </w:rPr>
-      </w:pPr>
-      <w:r>
-        <w:rPr>
-          <w:rStyle w:val="Strong"/>
+          <w:rStyle w:val="Fett"/>
+          <w:b w:val="0"/>
+        </w:rPr>
+      </w:pPr>
+    </w:p>
+    <w:p>
+      <w:pPr>
+        <w:pStyle w:val="body"/>
+        <w:rPr>
+          <w:rStyle w:val="Fett"/>
+          <w:b w:val="0"/>
+        </w:rPr>
+      </w:pPr>
+      <w:r>
+        <w:rPr>
+          <w:rStyle w:val="Fett"/>
           <w:b w:val="0"/>
         </w:rPr>
         <w:t>Historical Tektronix 4014 plot data was provided by Jos Dreesen.</w:t>
@@ -7469,22 +7451,22 @@
       <w:pPr>
         <w:pStyle w:val="body"/>
         <w:rPr>
-          <w:rStyle w:val="Strong"/>
-          <w:b w:val="0"/>
-        </w:rPr>
-      </w:pPr>
-    </w:p>
-    <w:p>
-      <w:pPr>
-        <w:pStyle w:val="body"/>
-        <w:rPr>
-          <w:rStyle w:val="Strong"/>
-          <w:b w:val="0"/>
-        </w:rPr>
-      </w:pPr>
-      <w:r>
-        <w:rPr>
-          <w:rStyle w:val="Strong"/>
+          <w:rStyle w:val="Fett"/>
+          <w:b w:val="0"/>
+        </w:rPr>
+      </w:pPr>
+    </w:p>
+    <w:p>
+      <w:pPr>
+        <w:pStyle w:val="body"/>
+        <w:rPr>
+          <w:rStyle w:val="Fett"/>
+          <w:b w:val="0"/>
+        </w:rPr>
+      </w:pPr>
+      <w:r>
+        <w:rPr>
+          <w:rStyle w:val="Fett"/>
           <w:b w:val="0"/>
         </w:rPr>
         <w:t>Special plot mode images with variable brightness were provided by Monty McGraw, who also contributed to debugging this mode.</w:t>
@@ -7494,22 +7476,22 @@
       <w:pPr>
         <w:pStyle w:val="body"/>
         <w:rPr>
-          <w:rStyle w:val="Strong"/>
-          <w:b w:val="0"/>
-        </w:rPr>
-      </w:pPr>
-    </w:p>
-    <w:p>
-      <w:pPr>
-        <w:pStyle w:val="body"/>
-        <w:rPr>
-          <w:rStyle w:val="Strong"/>
-          <w:b w:val="0"/>
-        </w:rPr>
-      </w:pPr>
-      <w:r>
-        <w:rPr>
-          <w:rStyle w:val="Strong"/>
+          <w:rStyle w:val="Fett"/>
+          <w:b w:val="0"/>
+        </w:rPr>
+      </w:pPr>
+    </w:p>
+    <w:p>
+      <w:pPr>
+        <w:pStyle w:val="body"/>
+        <w:rPr>
+          <w:rStyle w:val="Fett"/>
+          <w:b w:val="0"/>
+        </w:rPr>
+      </w:pPr>
+      <w:r>
+        <w:rPr>
+          <w:rStyle w:val="Fett"/>
           <w:b w:val="0"/>
         </w:rPr>
         <w:t>The spacelab plot data from the ICEMDDN CAD package on a CDC Cyber 175 emulator was provided by Nick Glazzard, who also made substantial improvements to GIN mode.</w:t>
@@ -7519,22 +7501,22 @@
       <w:pPr>
         <w:pStyle w:val="body"/>
         <w:rPr>
-          <w:rStyle w:val="Strong"/>
-          <w:b w:val="0"/>
-        </w:rPr>
-      </w:pPr>
-    </w:p>
-    <w:p>
-      <w:pPr>
-        <w:pStyle w:val="body"/>
-        <w:rPr>
-          <w:rStyle w:val="Strong"/>
-          <w:b w:val="0"/>
-        </w:rPr>
-      </w:pPr>
-      <w:r>
-        <w:rPr>
-          <w:rStyle w:val="Strong"/>
+          <w:rStyle w:val="Fett"/>
+          <w:b w:val="0"/>
+        </w:rPr>
+      </w:pPr>
+    </w:p>
+    <w:p>
+      <w:pPr>
+        <w:pStyle w:val="body"/>
+        <w:rPr>
+          <w:rStyle w:val="Fett"/>
+          <w:b w:val="0"/>
+        </w:rPr>
+      </w:pPr>
+      <w:r>
+        <w:rPr>
+          <w:rStyle w:val="Fett"/>
           <w:b w:val="0"/>
         </w:rPr>
         <w:t>CP/M GSXBASIC plot files were provided by Udo Munk.</w:t>
@@ -7544,22 +7526,22 @@
       <w:pPr>
         <w:pStyle w:val="body"/>
         <w:rPr>
-          <w:rStyle w:val="Strong"/>
-          <w:b w:val="0"/>
-        </w:rPr>
-      </w:pPr>
-    </w:p>
-    <w:p>
-      <w:pPr>
-        <w:pStyle w:val="body"/>
-        <w:rPr>
-          <w:rStyle w:val="Strong"/>
-          <w:b w:val="0"/>
-        </w:rPr>
-      </w:pPr>
-      <w:r>
-        <w:rPr>
-          <w:rStyle w:val="Strong"/>
+          <w:rStyle w:val="Fett"/>
+          <w:b w:val="0"/>
+        </w:rPr>
+      </w:pPr>
+    </w:p>
+    <w:p>
+      <w:pPr>
+        <w:pStyle w:val="body"/>
+        <w:rPr>
+          <w:rStyle w:val="Fett"/>
+          <w:b w:val="0"/>
+        </w:rPr>
+      </w:pPr>
+      <w:r>
+        <w:rPr>
+          <w:rStyle w:val="Fett"/>
           <w:b w:val="0"/>
         </w:rPr>
         <w:t>Thanks to Ian Schofield for critical feedback and a code snippet for dashed and dotted lines, and to Oscar Vermeulen and Mark Matlock for their support.</w:t>
@@ -7569,22 +7551,22 @@
       <w:pPr>
         <w:pStyle w:val="body"/>
         <w:rPr>
-          <w:rStyle w:val="Strong"/>
-          <w:b w:val="0"/>
-        </w:rPr>
-      </w:pPr>
-    </w:p>
-    <w:p>
-      <w:pPr>
-        <w:pStyle w:val="body"/>
-        <w:rPr>
-          <w:rStyle w:val="Strong"/>
-          <w:b w:val="0"/>
-        </w:rPr>
-      </w:pPr>
-      <w:r>
-        <w:rPr>
-          <w:rStyle w:val="Strong"/>
+          <w:rStyle w:val="Fett"/>
+          <w:b w:val="0"/>
+        </w:rPr>
+      </w:pPr>
+    </w:p>
+    <w:p>
+      <w:pPr>
+        <w:pStyle w:val="body"/>
+        <w:rPr>
+          <w:rStyle w:val="Fett"/>
+          <w:b w:val="0"/>
+        </w:rPr>
+      </w:pPr>
+      <w:r>
+        <w:rPr>
+          <w:rStyle w:val="Fett"/>
           <w:b w:val="0"/>
         </w:rPr>
         <w:t>The manuals were obtained from bitsavers.org.</w:t>
@@ -7594,22 +7576,22 @@
       <w:pPr>
         <w:pStyle w:val="body"/>
         <w:rPr>
-          <w:rStyle w:val="Strong"/>
-          <w:b w:val="0"/>
-        </w:rPr>
-      </w:pPr>
-    </w:p>
-    <w:p>
-      <w:pPr>
-        <w:pStyle w:val="body"/>
-        <w:rPr>
-          <w:rStyle w:val="Strong"/>
-          <w:b w:val="0"/>
-        </w:rPr>
-      </w:pPr>
-      <w:r>
-        <w:rPr>
-          <w:rStyle w:val="Strong"/>
+          <w:rStyle w:val="Fett"/>
+          <w:b w:val="0"/>
+        </w:rPr>
+      </w:pPr>
+    </w:p>
+    <w:p>
+      <w:pPr>
+        <w:pStyle w:val="body"/>
+        <w:rPr>
+          <w:rStyle w:val="Fett"/>
+          <w:b w:val="0"/>
+        </w:rPr>
+      </w:pPr>
+      <w:r>
+        <w:rPr>
+          <w:rStyle w:val="Fett"/>
           <w:b w:val="0"/>
         </w:rPr>
         <w:t>Thanks also to all others who contributed ideas, assisted with debugging, and helped preserve historical data.</w:t>
@@ -7619,22 +7601,22 @@
       <w:pPr>
         <w:pStyle w:val="body"/>
         <w:rPr>
-          <w:rStyle w:val="Strong"/>
-          <w:b w:val="0"/>
-        </w:rPr>
-      </w:pPr>
-    </w:p>
-    <w:p>
-      <w:pPr>
-        <w:pStyle w:val="body"/>
-        <w:rPr>
-          <w:rStyle w:val="Strong"/>
-          <w:b w:val="0"/>
-        </w:rPr>
-      </w:pPr>
-      <w:r>
-        <w:rPr>
-          <w:rStyle w:val="Strong"/>
+          <w:rStyle w:val="Fett"/>
+          <w:b w:val="0"/>
+        </w:rPr>
+      </w:pPr>
+    </w:p>
+    <w:p>
+      <w:pPr>
+        <w:pStyle w:val="body"/>
+        <w:rPr>
+          <w:rStyle w:val="Fett"/>
+          <w:b w:val="0"/>
+        </w:rPr>
+      </w:pPr>
+      <w:r>
+        <w:rPr>
+          <w:rStyle w:val="Fett"/>
           <w:b w:val="0"/>
         </w:rPr>
         <w:t>This program is the result of a community effort.</w:t>
@@ -7644,20 +7626,20 @@
       <w:pPr>
         <w:pStyle w:val="body"/>
         <w:rPr>
-          <w:rStyle w:val="Strong"/>
-          <w:b w:val="0"/>
-        </w:rPr>
-      </w:pPr>
-    </w:p>
-    <w:p>
-      <w:pPr>
-        <w:pStyle w:val="Heading2"/>
+          <w:rStyle w:val="Fett"/>
+          <w:b w:val="0"/>
+        </w:rPr>
+      </w:pPr>
+    </w:p>
+    <w:p>
+      <w:pPr>
+        <w:pStyle w:val="berschrift2"/>
         <w:ind w:right="569"/>
       </w:pPr>
       <w:bookmarkStart w:id="23" w:name="_Toc227814946"/>
       <w:r>
         <w:rPr>
-          <w:rStyle w:val="Strong"/>
+          <w:rStyle w:val="Fett"/>
           <w:b/>
         </w:rPr>
         <w:t>The usual disclaimer</w:t>
@@ -7710,7 +7692,7 @@
     <w:lvl w:ilvl="1">
       <w:start w:val="1"/>
       <w:numFmt w:val="none"/>
-      <w:pStyle w:val="Heading2"/>
+      <w:pStyle w:val="berschrift2"/>
       <w:suff w:val="nothing"/>
       <w:lvlText w:val="%2"/>
       <w:lvlJc w:val="left"/>
@@ -7724,7 +7706,7 @@
     <w:lvl w:ilvl="2">
       <w:start w:val="1"/>
       <w:numFmt w:val="none"/>
-      <w:pStyle w:val="Heading3"/>
+      <w:pStyle w:val="berschrift3"/>
       <w:suff w:val="nothing"/>
       <w:lvlText w:val="%3"/>
       <w:lvlJc w:val="left"/>
@@ -7738,7 +7720,7 @@
     <w:lvl w:ilvl="3">
       <w:start w:val="1"/>
       <w:numFmt w:val="none"/>
-      <w:pStyle w:val="Heading4"/>
+      <w:pStyle w:val="berschrift4"/>
       <w:suff w:val="nothing"/>
       <w:lvlText w:val="%4"/>
       <w:lvlJc w:val="left"/>
@@ -8447,7 +8429,7 @@
     <w:lsdException w:name="Unresolved Mention" w:semiHidden="1" w:unhideWhenUsed="1"/>
     <w:lsdException w:name="Smart Link" w:semiHidden="1" w:unhideWhenUsed="1"/>
   </w:latentStyles>
-  <w:style w:type="paragraph" w:default="1" w:styleId="Normal">
+  <w:style w:type="paragraph" w:default="1" w:styleId="Standard">
     <w:name w:val="Normal"/>
     <w:qFormat/>
     <w:rsid w:val="004151C3"/>
@@ -8458,10 +8440,10 @@
       <w:sz w:val="22"/>
     </w:rPr>
   </w:style>
-  <w:style w:type="paragraph" w:styleId="Heading1">
+  <w:style w:type="paragraph" w:styleId="berschrift1">
     <w:name w:val="heading 1"/>
     <w:basedOn w:val="Heading"/>
-    <w:next w:val="BodyText"/>
+    <w:next w:val="Textkrper"/>
     <w:uiPriority w:val="9"/>
     <w:qFormat/>
     <w:rsid w:val="000E58D3"/>
@@ -8476,7 +8458,7 @@
       <w:szCs w:val="48"/>
     </w:rPr>
   </w:style>
-  <w:style w:type="paragraph" w:styleId="Heading2">
+  <w:style w:type="paragraph" w:styleId="berschrift2">
     <w:name w:val="heading 2"/>
     <w:basedOn w:val="Heading"/>
     <w:next w:val="body"/>
@@ -8499,10 +8481,10 @@
       <w:szCs w:val="32"/>
     </w:rPr>
   </w:style>
-  <w:style w:type="paragraph" w:styleId="Heading3">
+  <w:style w:type="paragraph" w:styleId="berschrift3">
     <w:name w:val="heading 3"/>
     <w:basedOn w:val="Heading"/>
-    <w:next w:val="BodyText"/>
+    <w:next w:val="Textkrper"/>
     <w:uiPriority w:val="9"/>
     <w:unhideWhenUsed/>
     <w:qFormat/>
@@ -8519,10 +8501,10 @@
       <w:sz w:val="24"/>
     </w:rPr>
   </w:style>
-  <w:style w:type="paragraph" w:styleId="Heading4">
+  <w:style w:type="paragraph" w:styleId="berschrift4">
     <w:name w:val="heading 4"/>
     <w:basedOn w:val="Heading"/>
-    <w:next w:val="BodyText"/>
+    <w:next w:val="Textkrper"/>
     <w:uiPriority w:val="9"/>
     <w:semiHidden/>
     <w:unhideWhenUsed/>
@@ -8544,12 +8526,13 @@
       <w:szCs w:val="26"/>
     </w:rPr>
   </w:style>
-  <w:style w:type="character" w:default="1" w:styleId="DefaultParagraphFont">
+  <w:style w:type="character" w:default="1" w:styleId="Absatz-Standardschriftart">
     <w:name w:val="Default Paragraph Font"/>
     <w:uiPriority w:val="1"/>
+    <w:semiHidden/>
     <w:unhideWhenUsed/>
   </w:style>
-  <w:style w:type="table" w:default="1" w:styleId="TableNormal">
+  <w:style w:type="table" w:default="1" w:styleId="NormaleTabelle">
     <w:name w:val="Normal Table"/>
     <w:uiPriority w:val="99"/>
     <w:semiHidden/>
@@ -8564,7 +8547,7 @@
       </w:tblCellMar>
     </w:tblPr>
   </w:style>
-  <w:style w:type="numbering" w:default="1" w:styleId="NoList">
+  <w:style w:type="numbering" w:default="1" w:styleId="KeineListe">
     <w:name w:val="No List"/>
     <w:uiPriority w:val="99"/>
     <w:semiHidden/>
@@ -8578,7 +8561,7 @@
       <w:u w:val="single"/>
     </w:rPr>
   </w:style>
-  <w:style w:type="character" w:styleId="Strong">
+  <w:style w:type="character" w:styleId="Fett">
     <w:name w:val="Strong"/>
     <w:qFormat/>
     <w:rPr>
@@ -8603,8 +8586,8 @@
   </w:style>
   <w:style w:type="paragraph" w:customStyle="1" w:styleId="Heading">
     <w:name w:val="Heading"/>
-    <w:basedOn w:val="Normal"/>
-    <w:next w:val="BodyText"/>
+    <w:basedOn w:val="Standard"/>
+    <w:next w:val="Textkrper"/>
     <w:qFormat/>
     <w:rsid w:val="00EC42E5"/>
     <w:pPr>
@@ -8617,9 +8600,9 @@
       <w:szCs w:val="28"/>
     </w:rPr>
   </w:style>
-  <w:style w:type="paragraph" w:styleId="BodyText">
+  <w:style w:type="paragraph" w:styleId="Textkrper">
     <w:name w:val="Body Text"/>
-    <w:basedOn w:val="Normal"/>
+    <w:basedOn w:val="Standard"/>
     <w:pPr>
       <w:spacing w:after="140" w:line="276" w:lineRule="auto"/>
     </w:pPr>
@@ -8628,13 +8611,13 @@
       <w:sz w:val="20"/>
     </w:rPr>
   </w:style>
-  <w:style w:type="paragraph" w:styleId="List">
+  <w:style w:type="paragraph" w:styleId="Liste">
     <w:name w:val="List"/>
-    <w:basedOn w:val="BodyText"/>
+    <w:basedOn w:val="Textkrper"/>
   </w:style>
-  <w:style w:type="paragraph" w:styleId="Caption">
+  <w:style w:type="paragraph" w:styleId="Beschriftung">
     <w:name w:val="caption"/>
-    <w:basedOn w:val="Normal"/>
+    <w:basedOn w:val="Standard"/>
     <w:qFormat/>
     <w:pPr>
       <w:suppressLineNumbers/>
@@ -8647,7 +8630,7 @@
   </w:style>
   <w:style w:type="paragraph" w:customStyle="1" w:styleId="Index">
     <w:name w:val="Index"/>
-    <w:basedOn w:val="Normal"/>
+    <w:basedOn w:val="Standard"/>
     <w:qFormat/>
     <w:rsid w:val="00521511"/>
     <w:pPr>
@@ -8660,7 +8643,7 @@
   </w:style>
   <w:style w:type="paragraph" w:customStyle="1" w:styleId="PreformattedText">
     <w:name w:val="Preformatted Text"/>
-    <w:basedOn w:val="Normal"/>
+    <w:basedOn w:val="Standard"/>
     <w:qFormat/>
     <w:rPr>
       <w:rFonts w:ascii="Liberation Mono" w:eastAsia="Liberation Mono" w:hAnsi="Liberation Mono" w:cs="Liberation Mono"/>
@@ -8668,7 +8651,7 @@
       <w:szCs w:val="20"/>
     </w:rPr>
   </w:style>
-  <w:style w:type="paragraph" w:styleId="IndexHeading">
+  <w:style w:type="paragraph" w:styleId="Indexberschrift">
     <w:name w:val="index heading"/>
     <w:basedOn w:val="Heading"/>
     <w:pPr>
@@ -8681,16 +8664,16 @@
       <w:szCs w:val="32"/>
     </w:rPr>
   </w:style>
-  <w:style w:type="paragraph" w:styleId="TOCHeading">
+  <w:style w:type="paragraph" w:styleId="Inhaltsverzeichnisberschrift">
     <w:name w:val="TOC Heading"/>
-    <w:basedOn w:val="IndexHeading"/>
+    <w:basedOn w:val="Indexberschrift"/>
     <w:qFormat/>
     <w:rsid w:val="00603299"/>
     <w:rPr>
       <w:sz w:val="28"/>
     </w:rPr>
   </w:style>
-  <w:style w:type="paragraph" w:styleId="TOC2">
+  <w:style w:type="paragraph" w:styleId="Verzeichnis2">
     <w:name w:val="toc 2"/>
     <w:basedOn w:val="Index"/>
     <w:uiPriority w:val="39"/>
@@ -8702,7 +8685,7 @@
       <w:ind w:left="284"/>
     </w:pPr>
   </w:style>
-  <w:style w:type="paragraph" w:styleId="TOC3">
+  <w:style w:type="paragraph" w:styleId="Verzeichnis3">
     <w:name w:val="toc 3"/>
     <w:basedOn w:val="Index"/>
     <w:pPr>
@@ -8714,7 +8697,7 @@
   </w:style>
   <w:style w:type="paragraph" w:customStyle="1" w:styleId="body">
     <w:name w:val="body"/>
-    <w:basedOn w:val="Normal"/>
+    <w:basedOn w:val="Standard"/>
     <w:qFormat/>
     <w:rsid w:val="00EF4169"/>
     <w:pPr>
@@ -8724,9 +8707,9 @@
       <w:rFonts w:ascii="Liberation Sans" w:hAnsi="Liberation Sans"/>
     </w:rPr>
   </w:style>
-  <w:style w:type="character" w:styleId="UnresolvedMention">
+  <w:style w:type="character" w:styleId="NichtaufgelsteErwhnung">
     <w:name w:val="Unresolved Mention"/>
-    <w:basedOn w:val="DefaultParagraphFont"/>
+    <w:basedOn w:val="Absatz-Standardschriftart"/>
     <w:uiPriority w:val="99"/>
     <w:semiHidden/>
     <w:unhideWhenUsed/>
@@ -8738,7 +8721,7 @@
   </w:style>
   <w:style w:type="paragraph" w:customStyle="1" w:styleId="p1">
     <w:name w:val="p1"/>
-    <w:basedOn w:val="Normal"/>
+    <w:basedOn w:val="Standard"/>
     <w:rsid w:val="00255A61"/>
     <w:pPr>
       <w:widowControl/>
@@ -8751,10 +8734,10 @@
       <w:lang w:val="de-CH" w:eastAsia="de-DE" w:bidi="ar-SA"/>
     </w:rPr>
   </w:style>
-  <w:style w:type="paragraph" w:styleId="TOC1">
+  <w:style w:type="paragraph" w:styleId="Verzeichnis1">
     <w:name w:val="toc 1"/>
-    <w:basedOn w:val="Normal"/>
-    <w:next w:val="Normal"/>
+    <w:basedOn w:val="Standard"/>
+    <w:next w:val="Standard"/>
     <w:autoRedefine/>
     <w:uiPriority w:val="39"/>
     <w:unhideWhenUsed/>
@@ -8770,9 +8753,9 @@
       <w:sz w:val="24"/>
     </w:rPr>
   </w:style>
-  <w:style w:type="paragraph" w:styleId="ListParagraph">
+  <w:style w:type="paragraph" w:styleId="Listenabsatz">
     <w:name w:val="List Paragraph"/>
-    <w:basedOn w:val="Normal"/>
+    <w:basedOn w:val="Standard"/>
     <w:uiPriority w:val="34"/>
     <w:qFormat/>
     <w:rsid w:val="00603299"/>
@@ -8786,9 +8769,9 @@
       <w:sz w:val="24"/>
     </w:rPr>
   </w:style>
-  <w:style w:type="character" w:styleId="FollowedHyperlink">
+  <w:style w:type="character" w:styleId="BesuchterLink">
     <w:name w:val="FollowedHyperlink"/>
-    <w:basedOn w:val="DefaultParagraphFont"/>
+    <w:basedOn w:val="Absatz-Standardschriftart"/>
     <w:uiPriority w:val="99"/>
     <w:semiHidden/>
     <w:unhideWhenUsed/>
@@ -8820,7 +8803,7 @@
   </w:style>
   <w:style w:type="character" w:customStyle="1" w:styleId="apple-converted-space">
     <w:name w:val="apple-converted-space"/>
-    <w:basedOn w:val="DefaultParagraphFont"/>
+    <w:basedOn w:val="Absatz-Standardschriftart"/>
     <w:rsid w:val="007A5055"/>
   </w:style>
 </w:styles>

</xml_diff>

<commit_message>
Complete dokumentation for first release of version 2.0
</commit_message>
<xml_diff>
--- a/docs/manual.docx
+++ b/docs/manual.docx
@@ -1731,7 +1731,7 @@
           <w:noProof/>
         </w:rPr>
         <w:drawing>
-          <wp:inline distT="0" distB="0" distL="0" distR="0" wp14:anchorId="3A05AA49" wp14:editId="6BDECB82">
+          <wp:inline distT="0" distB="0" distL="0" distR="0" wp14:anchorId="3A05AA49" wp14:editId="435EEA70">
             <wp:extent cx="5626100" cy="3153914"/>
             <wp:effectExtent l="0" t="0" r="0" b="0"/>
             <wp:docPr id="2" name="Image2"/>
@@ -3025,10 +3025,7 @@
         <w:t xml:space="preserve"> in the repository.</w:t>
       </w:r>
       <w:r>
-        <w:t xml:space="preserve"> </w:t>
-      </w:r>
-      <w:r>
-        <w:t>Additional ARDS plot files are available in the GitHub repository</w:t>
+        <w:t xml:space="preserve"> Additional ARDS plot files are available in the GitHub repository</w:t>
       </w:r>
       <w:r>
         <w:t xml:space="preserve"> </w:t>
@@ -3698,19 +3695,7 @@
         <w:pStyle w:val="body"/>
       </w:pPr>
       <w:r>
-        <w:t xml:space="preserve">When using </w:t>
-      </w:r>
-      <w:r>
-        <w:t xml:space="preserve">tek4010 with the </w:t>
-      </w:r>
-      <w:r>
-        <w:t>PiDP-11</w:t>
-      </w:r>
-      <w:r>
-        <w:t xml:space="preserve"> console</w:t>
-      </w:r>
-      <w:r>
-        <w:t xml:space="preserve">, it is recommended to start </w:t>
+        <w:t xml:space="preserve">When using tek4010 with the PiDP-11 console, it is recommended to start </w:t>
       </w:r>
       <w:proofErr w:type="spellStart"/>
       <w:r>
@@ -4050,10 +4035,7 @@
         <w:pStyle w:val="Code"/>
       </w:pPr>
       <w:r>
-        <w:t>t</w:t>
-      </w:r>
-      <w:r>
-        <w:t>ek4010</w:t>
+        <w:t>tek4010</w:t>
       </w:r>
     </w:p>
     <w:p>
@@ -4285,16 +4267,7 @@
         <w:pStyle w:val="Code"/>
       </w:pPr>
       <w:r>
-        <w:t xml:space="preserve">tek4010 [options] </w:t>
-      </w:r>
-      <w:r>
-        <w:t>[</w:t>
-      </w:r>
-      <w:r>
-        <w:t>command [command options]</w:t>
-      </w:r>
-      <w:r>
-        <w:t>]</w:t>
+        <w:t>tek4010 [options] [command [command options]]</w:t>
       </w:r>
     </w:p>
     <w:p>
@@ -4580,35 +4553,59 @@
           <w:b/>
           <w:bCs/>
         </w:rPr>
-        <w:t>-</w:t>
-      </w:r>
-      <w:r>
+        <w:t xml:space="preserve">-half  </w:t>
+      </w:r>
+    </w:p>
+    <w:p>
+      <w:pPr>
+        <w:pStyle w:val="body"/>
+      </w:pPr>
+      <w:r>
+        <w:t>Open a decorated window using half of the screen width. The full resolution of the 4014 is used, scaled to the window size.</w:t>
+      </w:r>
+    </w:p>
+    <w:p>
+      <w:pPr>
+        <w:pStyle w:val="body"/>
+      </w:pPr>
+    </w:p>
+    <w:p>
+      <w:pPr>
+        <w:pStyle w:val="body"/>
         <w:rPr>
           <w:b/>
           <w:bCs/>
         </w:rPr>
-        <w:t>half</w:t>
-      </w:r>
+      </w:pPr>
       <w:r>
         <w:rPr>
           <w:b/>
           <w:bCs/>
         </w:rPr>
-        <w:t xml:space="preserve">  </w:t>
-      </w:r>
-    </w:p>
-    <w:p>
-      <w:pPr>
-        <w:pStyle w:val="body"/>
-      </w:pPr>
-      <w:r>
-        <w:t xml:space="preserve">Open a decorated window using </w:t>
-      </w:r>
-      <w:r>
-        <w:t>half of the screen width</w:t>
-      </w:r>
-      <w:r>
-        <w:t>. The full resolution of the 4014 is used, scaled to the window size.</w:t>
+        <w:t xml:space="preserve">-ARDS  </w:t>
+      </w:r>
+    </w:p>
+    <w:p>
+      <w:pPr>
+        <w:pStyle w:val="body"/>
+      </w:pPr>
+      <w:r>
+        <w:t>Enable d</w:t>
+      </w:r>
+      <w:r>
+        <w:t xml:space="preserve">isplay </w:t>
+      </w:r>
+      <w:r>
+        <w:t xml:space="preserve">of </w:t>
+      </w:r>
+      <w:r>
+        <w:t xml:space="preserve">ARDS </w:t>
+      </w:r>
+      <w:r>
+        <w:t xml:space="preserve">graphics </w:t>
+      </w:r>
+      <w:r>
+        <w:t>data.</w:t>
       </w:r>
     </w:p>
     <w:p>
@@ -4629,36 +4626,16 @@
           <w:b/>
           <w:bCs/>
         </w:rPr>
-        <w:t xml:space="preserve">-ARDS  </w:t>
-      </w:r>
-    </w:p>
-    <w:p>
-      <w:pPr>
-        <w:pStyle w:val="body"/>
-      </w:pPr>
-      <w:r>
-        <w:t>Enable d</w:t>
-      </w:r>
-      <w:r>
-        <w:t xml:space="preserve">isplay </w:t>
-      </w:r>
-      <w:r>
-        <w:t xml:space="preserve">of </w:t>
-      </w:r>
-      <w:r>
-        <w:t xml:space="preserve">ARDS </w:t>
-      </w:r>
-      <w:r>
-        <w:t xml:space="preserve">graphics </w:t>
-      </w:r>
-      <w:r>
-        <w:t>data.</w:t>
-      </w:r>
-    </w:p>
-    <w:p>
-      <w:pPr>
-        <w:pStyle w:val="body"/>
-      </w:pPr>
+        <w:t xml:space="preserve">-APL  </w:t>
+      </w:r>
+    </w:p>
+    <w:p>
+      <w:pPr>
+        <w:pStyle w:val="body"/>
+      </w:pPr>
+      <w:r>
+        <w:t>Emulate a Tektronix 4013/4015 terminal with the APL character set.</w:t>
+      </w:r>
     </w:p>
     <w:p>
       <w:pPr>
@@ -4668,339 +4645,245 @@
           <w:bCs/>
         </w:rPr>
       </w:pPr>
-      <w:r>
+    </w:p>
+    <w:p>
+      <w:pPr>
+        <w:pStyle w:val="body"/>
         <w:rPr>
           <w:b/>
           <w:bCs/>
         </w:rPr>
-        <w:t xml:space="preserve">-APL  </w:t>
-      </w:r>
-    </w:p>
-    <w:p>
-      <w:pPr>
-        <w:pStyle w:val="body"/>
-      </w:pPr>
-      <w:r>
-        <w:t>Emulate a Tektronix 4013/4015 terminal with the APL character set.</w:t>
-      </w:r>
-    </w:p>
-    <w:p>
-      <w:pPr>
-        <w:pStyle w:val="body"/>
-      </w:pPr>
-    </w:p>
-    <w:p>
-      <w:pPr>
-        <w:pStyle w:val="body"/>
+      </w:pPr>
+      <w:r>
         <w:rPr>
           <w:b/>
           <w:bCs/>
         </w:rPr>
-      </w:pPr>
+        <w:t>-</w:t>
+      </w:r>
+      <w:proofErr w:type="spellStart"/>
       <w:r>
         <w:rPr>
           <w:b/>
           <w:bCs/>
         </w:rPr>
-        <w:t>-</w:t>
-      </w:r>
-      <w:proofErr w:type="spellStart"/>
+        <w:t>noAutoClear</w:t>
+      </w:r>
+      <w:proofErr w:type="spellEnd"/>
       <w:r>
         <w:rPr>
           <w:b/>
           <w:bCs/>
         </w:rPr>
-        <w:t>autoClear</w:t>
-      </w:r>
-      <w:proofErr w:type="spellEnd"/>
-      <w:r>
+        <w:t xml:space="preserve">  </w:t>
+      </w:r>
+    </w:p>
+    <w:p>
+      <w:pPr>
+        <w:pStyle w:val="body"/>
+      </w:pPr>
+      <w:r>
+        <w:t xml:space="preserve">Do not clear the screen automatically when a line feed occurs at the bottom of the screen. This </w:t>
+      </w:r>
+      <w:proofErr w:type="gramStart"/>
+      <w:r>
+        <w:t xml:space="preserve">matches </w:t>
+      </w:r>
+      <w:r>
+        <w:t xml:space="preserve"> the</w:t>
+      </w:r>
+      <w:proofErr w:type="gramEnd"/>
+      <w:r>
+        <w:t xml:space="preserve"> </w:t>
+      </w:r>
+      <w:r>
+        <w:t xml:space="preserve">behavior of the </w:t>
+      </w:r>
+      <w:r>
+        <w:t>original hardware.</w:t>
+      </w:r>
+    </w:p>
+    <w:p>
+      <w:pPr>
+        <w:pStyle w:val="body"/>
+      </w:pPr>
+    </w:p>
+    <w:p>
+      <w:pPr>
+        <w:pStyle w:val="body"/>
         <w:rPr>
           <w:b/>
           <w:bCs/>
         </w:rPr>
-        <w:t xml:space="preserve">  </w:t>
-      </w:r>
-    </w:p>
-    <w:p>
-      <w:pPr>
-        <w:pStyle w:val="body"/>
-      </w:pPr>
-      <w:r>
-        <w:t xml:space="preserve">Clear the screen automatically when a line feed occurs at the bottom of the screen. This simplifies </w:t>
-      </w:r>
-      <w:proofErr w:type="spellStart"/>
-      <w:r>
-        <w:t>usa</w:t>
-      </w:r>
-      <w:proofErr w:type="spellEnd"/>
-      <w:r>
-        <w:t xml:space="preserve"> as a primary terminal but does not reflect original hardware behavior.</w:t>
-      </w:r>
-    </w:p>
-    <w:p>
-      <w:pPr>
-        <w:pStyle w:val="body"/>
+      </w:pPr>
+      <w:r>
         <w:rPr>
           <w:b/>
           <w:bCs/>
         </w:rPr>
-      </w:pPr>
-    </w:p>
-    <w:p>
-      <w:pPr>
-        <w:pStyle w:val="body"/>
+        <w:t>-</w:t>
+      </w:r>
+      <w:proofErr w:type="spellStart"/>
+      <w:r>
         <w:rPr>
           <w:b/>
           <w:bCs/>
         </w:rPr>
-      </w:pPr>
+        <w:t>keepsize</w:t>
+      </w:r>
+      <w:proofErr w:type="spellEnd"/>
       <w:r>
         <w:rPr>
           <w:b/>
           <w:bCs/>
         </w:rPr>
-        <w:t>-</w:t>
-      </w:r>
-      <w:proofErr w:type="spellStart"/>
-      <w:r>
+        <w:t xml:space="preserve">  </w:t>
+      </w:r>
+    </w:p>
+    <w:p>
+      <w:pPr>
+        <w:pStyle w:val="body"/>
+      </w:pPr>
+      <w:r>
+        <w:t>Keep the current font size when the screen is cleared. Some historical plot files may not reset the font size correctly when this option is used.</w:t>
+      </w:r>
+    </w:p>
+    <w:p>
+      <w:pPr>
+        <w:pStyle w:val="body"/>
+      </w:pPr>
+    </w:p>
+    <w:p>
+      <w:pPr>
+        <w:pStyle w:val="body"/>
         <w:rPr>
           <w:b/>
           <w:bCs/>
         </w:rPr>
-        <w:t>noA</w:t>
-      </w:r>
+      </w:pPr>
       <w:r>
         <w:rPr>
           <w:b/>
           <w:bCs/>
         </w:rPr>
-        <w:t>utoClear</w:t>
-      </w:r>
-      <w:proofErr w:type="spellEnd"/>
+        <w:t>-</w:t>
+      </w:r>
+      <w:proofErr w:type="spellStart"/>
       <w:r>
         <w:rPr>
           <w:b/>
           <w:bCs/>
         </w:rPr>
-        <w:t xml:space="preserve">  </w:t>
-      </w:r>
-    </w:p>
-    <w:p>
-      <w:pPr>
-        <w:pStyle w:val="body"/>
-      </w:pPr>
-      <w:r>
-        <w:t>Do not c</w:t>
-      </w:r>
-      <w:r>
-        <w:t xml:space="preserve">lear the screen automatically when a line feed occurs at the bottom of the screen. </w:t>
-      </w:r>
-      <w:r>
-        <w:t xml:space="preserve">This </w:t>
-      </w:r>
-      <w:proofErr w:type="gramStart"/>
-      <w:r>
-        <w:t xml:space="preserve">matches </w:t>
-      </w:r>
-      <w:r>
-        <w:t xml:space="preserve"> the</w:t>
-      </w:r>
-      <w:proofErr w:type="gramEnd"/>
-      <w:r>
-        <w:t xml:space="preserve"> </w:t>
-      </w:r>
-      <w:r>
-        <w:t xml:space="preserve">behavior of the </w:t>
-      </w:r>
-      <w:r>
-        <w:t>original hardware.</w:t>
-      </w:r>
-    </w:p>
-    <w:p>
-      <w:pPr>
-        <w:pStyle w:val="body"/>
-      </w:pPr>
-    </w:p>
-    <w:p>
-      <w:pPr>
-        <w:pStyle w:val="body"/>
+        <w:t>hidecursor</w:t>
+      </w:r>
+      <w:proofErr w:type="spellEnd"/>
+      <w:r>
         <w:rPr>
           <w:b/>
           <w:bCs/>
         </w:rPr>
-      </w:pPr>
-      <w:r>
+        <w:t xml:space="preserve">  </w:t>
+      </w:r>
+    </w:p>
+    <w:p>
+      <w:pPr>
+        <w:pStyle w:val="body"/>
+      </w:pPr>
+      <w:r>
+        <w:t>Hide the cursor. Do not use this option in GIN mode.</w:t>
+      </w:r>
+    </w:p>
+    <w:p>
+      <w:pPr>
+        <w:pStyle w:val="body"/>
+      </w:pPr>
+    </w:p>
+    <w:p>
+      <w:pPr>
+        <w:pStyle w:val="body"/>
         <w:rPr>
           <w:b/>
           <w:bCs/>
         </w:rPr>
-        <w:t>-</w:t>
-      </w:r>
-      <w:proofErr w:type="spellStart"/>
+      </w:pPr>
       <w:r>
         <w:rPr>
           <w:b/>
           <w:bCs/>
         </w:rPr>
-        <w:t>keepsize</w:t>
-      </w:r>
-      <w:proofErr w:type="spellEnd"/>
-      <w:r>
+        <w:t xml:space="preserve">-wait n  </w:t>
+      </w:r>
+    </w:p>
+    <w:p>
+      <w:pPr>
+        <w:pStyle w:val="body"/>
+      </w:pPr>
+      <w:r>
+        <w:t xml:space="preserve">Close the window n seconds after the command has finished. </w:t>
+      </w:r>
+      <w:r>
+        <w:t>This is useful for demo</w:t>
+      </w:r>
+      <w:r>
+        <w:t>nstrations</w:t>
+      </w:r>
+    </w:p>
+    <w:p>
+      <w:pPr>
+        <w:pStyle w:val="body"/>
+      </w:pPr>
+    </w:p>
+    <w:p>
+      <w:pPr>
+        <w:pStyle w:val="body"/>
         <w:rPr>
           <w:b/>
           <w:bCs/>
         </w:rPr>
-        <w:t xml:space="preserve">  </w:t>
-      </w:r>
-    </w:p>
-    <w:p>
-      <w:pPr>
-        <w:pStyle w:val="body"/>
-      </w:pPr>
-      <w:r>
-        <w:t xml:space="preserve">Keep the current font size when the screen is cleared. Some historical plot files may not reset the font size </w:t>
-      </w:r>
-      <w:r>
-        <w:lastRenderedPageBreak/>
-        <w:t>correctly when this option is used.</w:t>
-      </w:r>
-    </w:p>
-    <w:p>
-      <w:pPr>
-        <w:pStyle w:val="body"/>
-      </w:pPr>
-    </w:p>
-    <w:p>
-      <w:pPr>
-        <w:pStyle w:val="body"/>
+      </w:pPr>
+      <w:r>
         <w:rPr>
           <w:b/>
           <w:bCs/>
         </w:rPr>
-      </w:pPr>
-      <w:r>
+        <w:t xml:space="preserve">-fast  </w:t>
+      </w:r>
+    </w:p>
+    <w:p>
+      <w:pPr>
+        <w:pStyle w:val="body"/>
+      </w:pPr>
+      <w:r>
+        <w:t>Use fast rendering without fading. Recommended on slower systems. This option is automatically enabled for baud rates above 19200</w:t>
+      </w:r>
+      <w:r>
+        <w:t xml:space="preserve"> </w:t>
+      </w:r>
+      <w:r>
+        <w:t>or when tek4010 detects slow graphics performance</w:t>
+      </w:r>
+      <w:r>
+        <w:t>.</w:t>
+      </w:r>
+    </w:p>
+    <w:p>
+      <w:pPr>
+        <w:pStyle w:val="body"/>
+      </w:pPr>
+    </w:p>
+    <w:p>
+      <w:pPr>
+        <w:pStyle w:val="body"/>
         <w:rPr>
           <w:b/>
           <w:bCs/>
         </w:rPr>
-        <w:t>-</w:t>
-      </w:r>
-      <w:proofErr w:type="spellStart"/>
+      </w:pPr>
       <w:r>
         <w:rPr>
           <w:b/>
           <w:bCs/>
         </w:rPr>
-        <w:t>hidecursor</w:t>
-      </w:r>
-      <w:proofErr w:type="spellEnd"/>
-      <w:r>
-        <w:rPr>
-          <w:b/>
-          <w:bCs/>
-        </w:rPr>
-        <w:t xml:space="preserve">  </w:t>
-      </w:r>
-    </w:p>
-    <w:p>
-      <w:pPr>
-        <w:pStyle w:val="body"/>
-      </w:pPr>
-      <w:r>
-        <w:t>Hide the cursor. Do not use this option in GIN mode.</w:t>
-      </w:r>
-    </w:p>
-    <w:p>
-      <w:pPr>
-        <w:pStyle w:val="body"/>
-      </w:pPr>
-    </w:p>
-    <w:p>
-      <w:pPr>
-        <w:pStyle w:val="body"/>
-        <w:rPr>
-          <w:b/>
-          <w:bCs/>
-        </w:rPr>
-      </w:pPr>
-      <w:r>
-        <w:rPr>
-          <w:b/>
-          <w:bCs/>
-        </w:rPr>
-        <w:t xml:space="preserve">-wait n  </w:t>
-      </w:r>
-    </w:p>
-    <w:p>
-      <w:pPr>
-        <w:pStyle w:val="body"/>
-      </w:pPr>
-      <w:r>
-        <w:t xml:space="preserve">Close the window n seconds after the command has finished. </w:t>
-      </w:r>
-      <w:r>
-        <w:t>This is useful for demo</w:t>
-      </w:r>
-      <w:r>
-        <w:t>nstrations</w:t>
-      </w:r>
-    </w:p>
-    <w:p>
-      <w:pPr>
-        <w:pStyle w:val="body"/>
-      </w:pPr>
-    </w:p>
-    <w:p>
-      <w:pPr>
-        <w:pStyle w:val="body"/>
-        <w:rPr>
-          <w:b/>
-          <w:bCs/>
-        </w:rPr>
-      </w:pPr>
-      <w:r>
-        <w:rPr>
-          <w:b/>
-          <w:bCs/>
-        </w:rPr>
-        <w:t xml:space="preserve">-fast  </w:t>
-      </w:r>
-    </w:p>
-    <w:p>
-      <w:pPr>
-        <w:pStyle w:val="body"/>
-      </w:pPr>
-      <w:r>
-        <w:t>Use fast rendering without fading. Recommended on slower systems. This option is automatically enabled for baud rates above 19200</w:t>
-      </w:r>
-      <w:r>
-        <w:t xml:space="preserve"> </w:t>
-      </w:r>
-      <w:r>
-        <w:t>or when tek4010 detects slow graphics performance</w:t>
-      </w:r>
-      <w:r>
-        <w:t>.</w:t>
-      </w:r>
-    </w:p>
-    <w:p>
-      <w:pPr>
-        <w:pStyle w:val="body"/>
-      </w:pPr>
-    </w:p>
-    <w:p>
-      <w:pPr>
-        <w:pStyle w:val="body"/>
-        <w:rPr>
-          <w:b/>
-          <w:bCs/>
-        </w:rPr>
-      </w:pPr>
-      <w:r>
-        <w:rPr>
-          <w:b/>
-          <w:bCs/>
-        </w:rPr>
         <w:t xml:space="preserve">-h, --help  </w:t>
       </w:r>
     </w:p>
@@ -5413,11 +5296,7 @@
       </w:r>
       <w:proofErr w:type="gramEnd"/>
       <w:r>
-        <w:t xml:space="preserve"> by tek4010. If you </w:t>
-      </w:r>
-      <w:r>
-        <w:lastRenderedPageBreak/>
-        <w:t xml:space="preserve">want to modify the keyboard mapping, edit this file in </w:t>
+        <w:t xml:space="preserve"> by tek4010. If you want to modify the keyboard mapping, edit this file in </w:t>
       </w:r>
       <w:r>
         <w:rPr>
@@ -8067,6 +7946,7 @@
   <w:style w:type="character" w:default="1" w:styleId="Absatz-Standardschriftart">
     <w:name w:val="Default Paragraph Font"/>
     <w:uiPriority w:val="1"/>
+    <w:semiHidden/>
     <w:unhideWhenUsed/>
   </w:style>
   <w:style w:type="table" w:default="1" w:styleId="NormaleTabelle">

</xml_diff>

<commit_message>
Removed -noexit in manual and apl script
</commit_message>
<xml_diff>
--- a/docs/manual.docx
+++ b/docs/manual.docx
@@ -1731,7 +1731,7 @@
           <w:noProof/>
         </w:rPr>
         <w:drawing>
-          <wp:inline distT="0" distB="0" distL="0" distR="0" wp14:anchorId="3A05AA49" wp14:editId="435EEA70">
+          <wp:inline distT="0" distB="0" distL="0" distR="0" wp14:anchorId="3A05AA49" wp14:editId="45AC241C">
             <wp:extent cx="5626100" cy="3153914"/>
             <wp:effectExtent l="0" t="0" r="0" b="0"/>
             <wp:docPr id="2" name="Image2"/>
@@ -5025,15 +5025,10 @@
       </w:r>
       <w:proofErr w:type="spellStart"/>
       <w:r>
-        <w:t>apl</w:t>
-      </w:r>
-      <w:proofErr w:type="spellEnd"/>
-      <w:r>
-        <w:t xml:space="preserve"> ~/Tek4010/</w:t>
-      </w:r>
-      <w:proofErr w:type="spellStart"/>
-      <w:r>
-        <w:t>apl</w:t>
+        <w:t>ap</w:t>
+      </w:r>
+      <w:r>
+        <w:t>l</w:t>
       </w:r>
       <w:proofErr w:type="spellEnd"/>
       <w:r>
@@ -5134,16 +5129,11 @@
         <w:pStyle w:val="Code"/>
       </w:pPr>
       <w:r>
-        <w:t>tek4010 -APL -</w:t>
-      </w:r>
-      <w:proofErr w:type="spellStart"/>
+        <w:t>tek4010 -</w:t>
+      </w:r>
       <w:proofErr w:type="gramStart"/>
       <w:r>
-        <w:t>noexit</w:t>
-      </w:r>
-      <w:proofErr w:type="spellEnd"/>
-      <w:r>
-        <w:t xml:space="preserve"> .</w:t>
+        <w:t>APL .</w:t>
       </w:r>
       <w:proofErr w:type="gramEnd"/>
       <w:r>

</xml_diff>

<commit_message>
-eraseBS and -eraseDEL added
</commit_message>
<xml_diff>
--- a/docs/manual.docx
+++ b/docs/manual.docx
@@ -1731,7 +1731,7 @@
           <w:noProof/>
         </w:rPr>
         <w:drawing>
-          <wp:inline distT="0" distB="0" distL="0" distR="0" wp14:anchorId="3A05AA49" wp14:editId="45AC241C">
+          <wp:inline distT="0" distB="0" distL="0" distR="0" wp14:anchorId="3A05AA49" wp14:editId="4B8B9D1F">
             <wp:extent cx="5626100" cy="3153914"/>
             <wp:effectExtent l="0" t="0" r="0" b="0"/>
             <wp:docPr id="2" name="Image2"/>
@@ -4092,6 +4092,131 @@
     </w:p>
     <w:p>
       <w:pPr>
+        <w:pStyle w:val="body"/>
+        <w:rPr>
+          <w:b/>
+          <w:bCs/>
+        </w:rPr>
+      </w:pPr>
+      <w:r>
+        <w:rPr>
+          <w:b/>
+          <w:bCs/>
+        </w:rPr>
+        <w:t>Backspace/Delete key behavior</w:t>
+      </w:r>
+    </w:p>
+    <w:p>
+      <w:pPr>
+        <w:pStyle w:val="body"/>
+      </w:pPr>
+    </w:p>
+    <w:p>
+      <w:pPr>
+        <w:pStyle w:val="body"/>
+      </w:pPr>
+      <w:r>
+        <w:t>Historical systems differ in the erase character expected from the terminal. Some systems expect BS (^H, 0x08), while others expect DEL (</w:t>
+      </w:r>
+      <w:proofErr w:type="gramStart"/>
+      <w:r>
+        <w:t>^?,</w:t>
+      </w:r>
+      <w:proofErr w:type="gramEnd"/>
+      <w:r>
+        <w:t xml:space="preserve"> 0x7F).</w:t>
+      </w:r>
+    </w:p>
+    <w:p>
+      <w:pPr>
+        <w:pStyle w:val="body"/>
+      </w:pPr>
+    </w:p>
+    <w:p>
+      <w:pPr>
+        <w:pStyle w:val="body"/>
+      </w:pPr>
+      <w:r>
+        <w:t>tek4010 normally uses BS (0x08), which is compatible with most modern Unix systems and shells. However, some historical systems may require DEL (0x7F) instead.</w:t>
+      </w:r>
+    </w:p>
+    <w:p>
+      <w:pPr>
+        <w:pStyle w:val="body"/>
+      </w:pPr>
+    </w:p>
+    <w:p>
+      <w:pPr>
+        <w:pStyle w:val="body"/>
+      </w:pPr>
+      <w:r>
+        <w:t>If the Backspace/Delete key does not work correctly, try:</w:t>
+      </w:r>
+    </w:p>
+    <w:p>
+      <w:pPr>
+        <w:pStyle w:val="body"/>
+      </w:pPr>
+    </w:p>
+    <w:p>
+      <w:pPr>
+        <w:pStyle w:val="Code"/>
+      </w:pPr>
+      <w:r>
+        <w:t xml:space="preserve">    tek4010 -</w:t>
+      </w:r>
+      <w:proofErr w:type="spellStart"/>
+      <w:r>
+        <w:t>eraseBS</w:t>
+      </w:r>
+      <w:proofErr w:type="spellEnd"/>
+    </w:p>
+    <w:p>
+      <w:pPr>
+        <w:pStyle w:val="body"/>
+      </w:pPr>
+    </w:p>
+    <w:p>
+      <w:pPr>
+        <w:pStyle w:val="body"/>
+      </w:pPr>
+      <w:r>
+        <w:t>or</w:t>
+      </w:r>
+    </w:p>
+    <w:p>
+      <w:pPr>
+        <w:pStyle w:val="body"/>
+      </w:pPr>
+    </w:p>
+    <w:p>
+      <w:pPr>
+        <w:pStyle w:val="Code"/>
+      </w:pPr>
+      <w:r>
+        <w:t xml:space="preserve">    tek4010 -</w:t>
+      </w:r>
+      <w:proofErr w:type="spellStart"/>
+      <w:r>
+        <w:t>eraseDEL</w:t>
+      </w:r>
+      <w:proofErr w:type="spellEnd"/>
+    </w:p>
+    <w:p>
+      <w:pPr>
+        <w:pStyle w:val="body"/>
+      </w:pPr>
+    </w:p>
+    <w:p>
+      <w:pPr>
+        <w:pStyle w:val="body"/>
+      </w:pPr>
+      <w:r>
+        <w:t>When using ssh, the selected erase character is normally propagated automatically to the remote system through the PTY connection.</w:t>
+      </w:r>
+    </w:p>
+    <w:p>
+      <w:pPr>
         <w:pStyle w:val="berschrift1"/>
       </w:pPr>
       <w:bookmarkStart w:id="9" w:name="_Toc229034929"/>
@@ -4796,11 +4921,6 @@
     <w:p>
       <w:pPr>
         <w:pStyle w:val="body"/>
-      </w:pPr>
-    </w:p>
-    <w:p>
-      <w:pPr>
-        <w:pStyle w:val="body"/>
         <w:rPr>
           <w:b/>
           <w:bCs/>
@@ -4811,59 +4931,32 @@
           <w:b/>
           <w:bCs/>
         </w:rPr>
-        <w:t xml:space="preserve">-wait n  </w:t>
-      </w:r>
-    </w:p>
-    <w:p>
-      <w:pPr>
-        <w:pStyle w:val="body"/>
-      </w:pPr>
-      <w:r>
-        <w:t xml:space="preserve">Close the window n seconds after the command has finished. </w:t>
-      </w:r>
-      <w:r>
-        <w:t>This is useful for demo</w:t>
-      </w:r>
-      <w:r>
-        <w:t>nstrations</w:t>
-      </w:r>
-    </w:p>
-    <w:p>
-      <w:pPr>
-        <w:pStyle w:val="body"/>
-      </w:pPr>
-    </w:p>
-    <w:p>
-      <w:pPr>
-        <w:pStyle w:val="body"/>
+        <w:lastRenderedPageBreak/>
+        <w:t>-</w:t>
+      </w:r>
+      <w:proofErr w:type="spellStart"/>
+      <w:r>
         <w:rPr>
           <w:b/>
           <w:bCs/>
         </w:rPr>
-      </w:pPr>
+        <w:t>eraseBS</w:t>
+      </w:r>
+      <w:proofErr w:type="spellEnd"/>
       <w:r>
         <w:rPr>
           <w:b/>
           <w:bCs/>
         </w:rPr>
-        <w:t xml:space="preserve">-fast  </w:t>
-      </w:r>
-    </w:p>
-    <w:p>
-      <w:pPr>
-        <w:pStyle w:val="body"/>
-      </w:pPr>
-      <w:r>
-        <w:t>Use fast rendering without fading. Recommended on slower systems. This option is automatically enabled for baud rates above 19200</w:t>
-      </w:r>
-      <w:r>
-        <w:t xml:space="preserve"> </w:t>
-      </w:r>
-      <w:r>
-        <w:t>or when tek4010 detects slow graphics performance</w:t>
-      </w:r>
-      <w:r>
-        <w:t>.</w:t>
+        <w:t xml:space="preserve">  </w:t>
+      </w:r>
+    </w:p>
+    <w:p>
+      <w:pPr>
+        <w:pStyle w:val="body"/>
+      </w:pPr>
+      <w:r>
+        <w:t>Use BS (^H, 0x08) as erase character for the Backspace/Delete key. This is compatible with most modern Unix systems and shells.</w:t>
       </w:r>
     </w:p>
     <w:p>
@@ -4884,6 +4977,132 @@
           <w:b/>
           <w:bCs/>
         </w:rPr>
+        <w:t>-</w:t>
+      </w:r>
+      <w:proofErr w:type="spellStart"/>
+      <w:r>
+        <w:rPr>
+          <w:b/>
+          <w:bCs/>
+        </w:rPr>
+        <w:t>eraseDEL</w:t>
+      </w:r>
+      <w:proofErr w:type="spellEnd"/>
+      <w:r>
+        <w:rPr>
+          <w:b/>
+          <w:bCs/>
+        </w:rPr>
+        <w:t xml:space="preserve">  </w:t>
+      </w:r>
+    </w:p>
+    <w:p>
+      <w:pPr>
+        <w:pStyle w:val="body"/>
+      </w:pPr>
+      <w:r>
+        <w:t>Use DEL (</w:t>
+      </w:r>
+      <w:proofErr w:type="gramStart"/>
+      <w:r>
+        <w:t>^?,</w:t>
+      </w:r>
+      <w:proofErr w:type="gramEnd"/>
+      <w:r>
+        <w:t xml:space="preserve"> 0x7F) as erase character for the Backspace/Delete key. Some historical systems expect DEL instead of BS.</w:t>
+      </w:r>
+    </w:p>
+    <w:p>
+      <w:pPr>
+        <w:pStyle w:val="body"/>
+      </w:pPr>
+    </w:p>
+    <w:p>
+      <w:pPr>
+        <w:pStyle w:val="body"/>
+        <w:rPr>
+          <w:b/>
+          <w:bCs/>
+        </w:rPr>
+      </w:pPr>
+      <w:r>
+        <w:rPr>
+          <w:b/>
+          <w:bCs/>
+        </w:rPr>
+        <w:t xml:space="preserve">-wait n  </w:t>
+      </w:r>
+    </w:p>
+    <w:p>
+      <w:pPr>
+        <w:pStyle w:val="body"/>
+      </w:pPr>
+      <w:r>
+        <w:t xml:space="preserve">Close the window n seconds after the command has finished. </w:t>
+      </w:r>
+      <w:r>
+        <w:t>This is useful for demo</w:t>
+      </w:r>
+      <w:r>
+        <w:t>nstrations</w:t>
+      </w:r>
+    </w:p>
+    <w:p>
+      <w:pPr>
+        <w:pStyle w:val="body"/>
+      </w:pPr>
+    </w:p>
+    <w:p>
+      <w:pPr>
+        <w:pStyle w:val="body"/>
+        <w:rPr>
+          <w:b/>
+          <w:bCs/>
+        </w:rPr>
+      </w:pPr>
+      <w:r>
+        <w:rPr>
+          <w:b/>
+          <w:bCs/>
+        </w:rPr>
+        <w:t xml:space="preserve">-fast  </w:t>
+      </w:r>
+    </w:p>
+    <w:p>
+      <w:pPr>
+        <w:pStyle w:val="body"/>
+      </w:pPr>
+      <w:r>
+        <w:t>Use fast rendering without fading. Recommended on slower systems. This option is automatically enabled for baud rates above 19200</w:t>
+      </w:r>
+      <w:r>
+        <w:t xml:space="preserve"> </w:t>
+      </w:r>
+      <w:r>
+        <w:t>or when tek4010 detects slow graphics performance</w:t>
+      </w:r>
+      <w:r>
+        <w:t>.</w:t>
+      </w:r>
+    </w:p>
+    <w:p>
+      <w:pPr>
+        <w:pStyle w:val="body"/>
+      </w:pPr>
+    </w:p>
+    <w:p>
+      <w:pPr>
+        <w:pStyle w:val="body"/>
+        <w:rPr>
+          <w:b/>
+          <w:bCs/>
+        </w:rPr>
+      </w:pPr>
+      <w:r>
+        <w:rPr>
+          <w:b/>
+          <w:bCs/>
+        </w:rPr>
         <w:t xml:space="preserve">-h, --help  </w:t>
       </w:r>
     </w:p>
@@ -5198,6 +5417,7 @@
       </w:pPr>
       <w:proofErr w:type="spellStart"/>
       <w:r>
+        <w:lastRenderedPageBreak/>
         <w:t>mkdir</w:t>
       </w:r>
       <w:proofErr w:type="spellEnd"/>

</xml_diff>